<commit_message>
docs(report): finalize 36-page academic report with verified citations, evidence-linked figures, and clean typography (Part B)
</commit_message>
<xml_diff>
--- a/docs/REPORT_FINAL/ArogyaMitra_BTech_Project_Report.docx
+++ b/docs/REPORT_FINAL/ArogyaMitra_BTech_Project_Report.docx
@@ -944,7 +944,7 @@
           <w:rFonts w:ascii="Times New Roman" w:hAnsi="Times New Roman"/>
           <w:color w:val="212121"/>
         </w:rPr>
-        <w:t>.2 ms. Automated test suites verify 321 prototype test cases, 20 golden cases, 11 Playwright journeys, and zero fixable Critical/High (Trivy --ignore-unfixed) container vulnerabilities.</w:t>
+        <w:t>.2 ms. Automated test suites verify 322 prototype test cases, 20 golden cases, 11 Playwright journeys, and zero fixable Critical/High (Trivy --ignore-unfixed) container vulnerabilities.</w:t>
       </w:r>
     </w:p>
     <w:p>
@@ -3047,7 +3047,7 @@
           <w:rFonts w:ascii="Times New Roman" w:hAnsi="Times New Roman"/>
           <w:sz w:val="18"/>
         </w:rPr>
-        <w:t>Table 4.5: Automated Test Suite Summary from Actual Test Runners (321 Tests)</w:t>
+        <w:t>Table 4.5: Automated Test Suite Summary from Actual Test Runners (322 Tests)</w:t>
       </w:r>
       <w:r>
         <w:rPr>
@@ -3853,21 +3853,28 @@
           <w:rFonts w:ascii="Times New Roman" w:hAnsi="Times New Roman"/>
           <w:color w:val="212121"/>
         </w:rPr>
-        <w:t>While digital health initiatives under the Ayushman Bharat Digital Mission (ABDM) have expanded electronic health record adoption, decision support tools for community health workers remain limited. Commercial symptom che</w:t>
+        <w:t>While digital health initiatives under the Ayushman Bharat Digital Mission (ABDM) and statutory frameworks such as the Digital Personal Data Protection (DPDP) Act, 2023 [11] have advanced privacy standards, decision suppo</w:t>
       </w:r>
       <w:r>
         <w:rPr>
           <w:rFonts w:ascii="Times New Roman" w:hAnsi="Times New Roman"/>
           <w:color w:val="212121"/>
         </w:rPr>
-        <w:t>ckers and diagnostic mobile applications often fail in this operating environment. They are typically engineered as consumer tools that require continuous broadband connectivity, provide no interpretable clinical rationales, and lack fail-closed safety des</w:t>
+        <w:t>rt tools for community health workers remain limited. Commercial symptom checkers and diagnostic mobile applications often fail in this operating environment. They are typically engineered as consumer tools that require continuous broadband connectivity, p</w:t>
       </w:r>
       <w:r>
         <w:rPr>
           <w:rFonts w:ascii="Times New Roman" w:hAnsi="Times New Roman"/>
           <w:color w:val="212121"/>
         </w:rPr>
-        <w:t>igns. When an underlying algorithmic service experiences network timeout or server failure, such systems frequently crash or return empty screens, leaving frontline workers without guidance.</w:t>
+        <w:t>rovide no interpretable clinical rationales, and lack fail-closed safety designs. When an underlying algorithmic service experiences network timeout or server failure, such systems frequently crash or return empty screens, leaving frontline workers without</w:t>
+      </w:r>
+      <w:r>
+        <w:rPr>
+          <w:rFonts w:ascii="Times New Roman" w:hAnsi="Times New Roman"/>
+          <w:color w:val="212121"/>
+        </w:rPr>
+        <w:t xml:space="preserve"> guidance.</w:t>
       </w:r>
     </w:p>
     <w:p>
@@ -3880,21 +3887,21 @@
           <w:rFonts w:ascii="Times New Roman" w:hAnsi="Times New Roman"/>
           <w:color w:val="212121"/>
         </w:rPr>
-        <w:t>In this project, I address these challenges by engineering Arogya</w:t>
+        <w:t>In this project, I address these challenges by engineering ArogyaMitra, a secure, explainable, and fail-closed AI-assisted clinical decision support system prototype tailored for community healthcare workers. The system does not attempt to repla</w:t>
       </w:r>
       <w:r>
         <w:rPr>
           <w:rFonts w:ascii="Times New Roman" w:hAnsi="Times New Roman"/>
           <w:color w:val="212121"/>
         </w:rPr>
-        <w:t>Mitra, a secure, explainable, and fail-closed AI-assisted clinical decision support system prototype tailored for community healthcare workers. The system does not attempt to replace physician diagnosis. Instead, it serves as an assistive screening aid tha</w:t>
+        <w:t>ce physician diagnosis. Instead, it serves as an assistive screening aid that provides differential disease estimation, enforces deterministic safety overrides for emergencies, operates with bounded latency, and protects patient privacy through containeriz</w:t>
       </w:r>
       <w:r>
         <w:rPr>
           <w:rFonts w:ascii="Times New Roman" w:hAnsi="Times New Roman"/>
           <w:color w:val="212121"/>
         </w:rPr>
-        <w:t>t provides differential disease estimation, enforces deterministic safety overrides for emergencies, operates with bounded latency, and protects patient privacy through containerized security.</w:t>
+        <w:t>ed security.</w:t>
       </w:r>
     </w:p>
     <w:tbl>
@@ -3933,16 +3940,7 @@
                 <w:color w:val="154360"/>
                 <w:sz w:val="19"/>
               </w:rPr>
-              <w:t>[Primer for Evaluation: Naive Bayes, Probabilistic Calibration,</w:t>
-            </w:r>
-            <w:r>
-              <w:rPr>
-                <w:rFonts w:ascii="Times New Roman" w:hAnsi="Times New Roman"/>
-                <w:b/>
-                <w:color w:val="154360"/>
-                <w:sz w:val="19"/>
-              </w:rPr>
-              <w:t xml:space="preserve"> and Clinical Triage] </w:t>
+              <w:t xml:space="preserve">[Primer for Evaluation: Naive Bayes, Probabilistic Calibration, and Clinical Triage] </w:t>
             </w:r>
             <w:r>
               <w:rPr>
@@ -3951,7 +3949,7 @@
                 <w:color w:val="212121"/>
                 <w:sz w:val="19"/>
               </w:rPr>
-              <w:t xml:space="preserve">1. Bernoulli Naive Bayes Classifier: Treats each presenting symptom as a binary indicator variable (present or absent) across 131 clinical features and 41 disease classes. By assuming conditional independence among symptoms given the </w:t>
+              <w:t>1. Bernoulli Naive Bayes Classifier: Treats each presenting symptom as a binary indicator variable (present or absent) across 131 clinical features and 41 dis</w:t>
             </w:r>
             <w:r>
               <w:rPr>
@@ -3960,7 +3958,7 @@
                 <w:color w:val="212121"/>
                 <w:sz w:val="19"/>
               </w:rPr>
-              <w:t>disease, the model computes log-posterior class scores by summing log-likelihood ratios. This avoids matrix inversions and yields inference times of approximately 1.8 ms on commodity CPUs.</w:t>
+              <w:t>ease classes. By assuming conditional independence among symptoms given the disease, the model computes log-posterior class scores by summing log-likelihood ratios. This avoids matrix inversions and yields inference times of approximately 1.8 ms on commodi</w:t>
             </w:r>
             <w:r>
               <w:rPr>
@@ -3969,7 +3967,7 @@
                 <w:color w:val="212121"/>
                 <w:sz w:val="19"/>
               </w:rPr>
-              <w:br/>
+              <w:t>ty CPUs.</w:t>
             </w:r>
             <w:r>
               <w:rPr>
@@ -3979,7 +3977,6 @@
                 <w:sz w:val="19"/>
               </w:rPr>
               <w:br/>
-              <w:t>2. Probabilistic Calibration: In statistical learning, a classifie</w:t>
             </w:r>
             <w:r>
               <w:rPr>
@@ -3988,7 +3985,8 @@
                 <w:color w:val="212121"/>
                 <w:sz w:val="19"/>
               </w:rPr>
-              <w:t>r is well-calibrated if a predicted score of 0.8 corresponds to an empirical 80% event frequency. Naive Bayes violates this condition because multiplying correlated symptom likelihoods artificially inflates the posterior odds, pushing scores toward 0 and 1</w:t>
+              <w:br/>
+              <w:t>2. Probabilistic Calibration: In statistical learning, a classifier is well-calibrated if a predicted score of 0.8 corresponds to an empirical 80% event frequency. Naive Bayes violates this condition because multiplying correlated symptom likelih</w:t>
             </w:r>
             <w:r>
               <w:rPr>
@@ -3997,7 +3995,7 @@
                 <w:color w:val="212121"/>
                 <w:sz w:val="19"/>
               </w:rPr>
-              <w:t>. Post-hoc calibration methods (such as Platt scaling) can overfit on scarce clinical datasets; in my experiments on 304 unique rows, Platt scaling worsened log loss from 0.0061 to 0.1643. Consequently, ArogyaMitra explicitly displays scores as uncalibrate</w:t>
+              <w:t>oods artificially inflates the posterior odds, pushing scores toward 0 and 1. Post-hoc calibration methods (such as Platt scaling) can overfit on scarce clinical datasets; in my experiments on 304 unique rows, Platt scaling worsened log loss from 0.0061 to</w:t>
             </w:r>
             <w:r>
               <w:rPr>
@@ -4006,7 +4004,7 @@
                 <w:color w:val="212121"/>
                 <w:sz w:val="19"/>
               </w:rPr>
-              <w:t>d estimates.</w:t>
+              <w:t xml:space="preserve"> 0.1643. Consequently, ArogyaMitra explicitly displays scores as uncalibrated estimates.</w:t>
             </w:r>
             <w:r>
               <w:rPr>
@@ -4025,7 +4023,7 @@
                 <w:sz w:val="19"/>
               </w:rPr>
               <w:br/>
-              <w:t xml:space="preserve">3. Deterministic Red-Flag Triage Layer: Because statistical classifiers can err when presented with rare or atypical symptom combinations, ArogyaMitra decouples emergency detection from machine learning. A deterministic rule engine scans for </w:t>
+              <w:t>3. Deterministic Red-Flag Triage Layer: Because statistical classifiers can err when presented with rare or atypical symptom combinations, ArogyaMitra decouples emerg</w:t>
             </w:r>
             <w:r>
               <w:rPr>
@@ -4034,7 +4032,7 @@
                 <w:color w:val="212121"/>
                 <w:sz w:val="19"/>
               </w:rPr>
-              <w:t>life-threatening symptoms (e.g., chest pain, coma, breathlessness) before the model runs. If triggered, it immediately locks the triage output to EMERGENCY, preventing model misclassification from causing clinical under-</w:t>
+              <w:t xml:space="preserve">ency detection from machine learning. A deterministic rule engine scans for life-threatening symptoms (e.g., chest pain, coma, breathlessness) before the model runs. If triggered, it </w:t>
             </w:r>
             <w:r>
               <w:rPr>
@@ -4044,7 +4042,16 @@
                 <w:sz w:val="19"/>
               </w:rPr>
               <w:lastRenderedPageBreak/>
-              <w:t>triage.</w:t>
+              <w:t>immediately locks the triage output to EMERGENCY, preventing model miscla</w:t>
+            </w:r>
+            <w:r>
+              <w:rPr>
+                <w:rFonts w:ascii="Times New Roman" w:hAnsi="Times New Roman"/>
+                <w:i/>
+                <w:color w:val="212121"/>
+                <w:sz w:val="19"/>
+              </w:rPr>
+              <w:t>ssification from causing clinical under-triage.</w:t>
             </w:r>
           </w:p>
         </w:tc>
@@ -4066,16 +4073,7 @@
           <w:color w:val="154360"/>
           <w:sz w:val="24"/>
         </w:rPr>
-        <w:t>1.2 Comprehensive Literatu</w:t>
-      </w:r>
-      <w:r>
-        <w:rPr>
-          <w:rFonts w:ascii="Times New Roman" w:hAnsi="Times New Roman"/>
-          <w:b/>
-          <w:color w:val="154360"/>
-          <w:sz w:val="24"/>
-        </w:rPr>
-        <w:t>re Review</w:t>
+        <w:t>1.2 Comprehensive Literature Review</w:t>
       </w:r>
     </w:p>
     <w:p>
@@ -4101,14 +4099,21 @@
           <w:rFonts w:ascii="Times New Roman" w:hAnsi="Times New Roman"/>
           <w:color w:val="212121"/>
         </w:rPr>
-        <w:t xml:space="preserve">The academic literature evaluating algorithmic decision support and symptom checking tools reveals important discrepancies between theoretical predictive accuracy and clinical </w:t>
+        <w:t xml:space="preserve">The academic literature evaluating algorithmic decision support and symptom checking tools reveals </w:t>
       </w:r>
       <w:r>
         <w:rPr>
           <w:rFonts w:ascii="Times New Roman" w:hAnsi="Times New Roman"/>
           <w:color w:val="212121"/>
         </w:rPr>
-        <w:t>safety. A systematic review by Wallace et al. (2022) [1] analyzed 10 studies evaluating 48 digital symptom checkers using the Quality Assessment of Diagnostic Accuracy Studies (QUADAS-2) methodology. Their key findings include:</w:t>
+        <w:t>important discrepancies between theoretical predictive accuracy and clinical safety. A systematic review by Wallace et al. (2022) [1] analyzed 10 studies evaluating 48 digital symptom checkers using the Quality Assessment of Diagnostic Accuracy Studies (QU</w:t>
+      </w:r>
+      <w:r>
+        <w:rPr>
+          <w:rFonts w:ascii="Times New Roman" w:hAnsi="Times New Roman"/>
+          <w:color w:val="212121"/>
+        </w:rPr>
+        <w:t>ADAS-2) methodology. Their key findings include:</w:t>
       </w:r>
     </w:p>
     <w:p>
@@ -4121,14 +4126,14 @@
           <w:rFonts w:ascii="Times New Roman" w:hAnsi="Times New Roman"/>
           <w:color w:val="212121"/>
         </w:rPr>
-        <w:t>1. Diagnostic Accuracy: Acro</w:t>
+        <w:t>1. Diagnostic Accuracy: Across evaluated platforms, primary diagnostic accuracy was low, ranging between 19.0% and 37.9%. Even when evaluating top-3 or top-5 differential accuracy, symptom checkers showed li</w:t>
       </w:r>
       <w:r>
         <w:rPr>
           <w:rFonts w:ascii="Times New Roman" w:hAnsi="Times New Roman"/>
           <w:color w:val="212121"/>
         </w:rPr>
-        <w:t>ss evaluated platforms, primary diagnostic accuracy was low, ranging between 19.0% and 37.9%. Even when evaluating top-3 or top-5 differential accuracy, symptom checkers showed limited precision compared to practicing general practitioners.</w:t>
+        <w:t>mited precision compared to practicing general practitioners.</w:t>
       </w:r>
     </w:p>
     <w:p>
@@ -4141,14 +4146,14 @@
           <w:rFonts w:ascii="Times New Roman" w:hAnsi="Times New Roman"/>
           <w:color w:val="212121"/>
         </w:rPr>
-        <w:t>2. Triage Accur</w:t>
+        <w:t>2. Triage Accuracy: Triage decision accuracy (determining urgency) ranged from 48.8% to 90.1%, but exhibited wide variation across different commercial checkers evaluating identical clinical vig</w:t>
       </w:r>
       <w:r>
         <w:rPr>
           <w:rFonts w:ascii="Times New Roman" w:hAnsi="Times New Roman"/>
           <w:color w:val="212121"/>
         </w:rPr>
-        <w:t>acy: Triage decision accuracy (determining urgency) ranged from 48.8% to 90.1%, but exhibited wide variation across different commercial checkers evaluating identical clinical vignettes.</w:t>
+        <w:t>nettes.</w:t>
       </w:r>
     </w:p>
     <w:p>
@@ -4161,14 +4166,14 @@
           <w:rFonts w:ascii="Times New Roman" w:hAnsi="Times New Roman"/>
           <w:color w:val="212121"/>
         </w:rPr>
-        <w:t>3. Safety Hazards and Swiss-Cheese Failure Model: Wallace et al. note</w:t>
+        <w:t>3. Safety Hazards and Swiss-Cheese Failure Model: Wallace et al. noted that symptom checkers present patient safety hazards when errors align across stages—such as an incorrect primary diagnosis cascading into an inappropriately delayed triage reco</w:t>
       </w:r>
       <w:r>
         <w:rPr>
           <w:rFonts w:ascii="Times New Roman" w:hAnsi="Times New Roman"/>
           <w:color w:val="212121"/>
         </w:rPr>
-        <w:t>d that symptom checkers present patient safety hazards when errors align across stages—such as an incorrect primary diagnosis cascading into an inappropriately delayed triage recommendation.</w:t>
+        <w:t>mmendation.</w:t>
       </w:r>
     </w:p>
     <w:p>
@@ -4181,14 +4186,7 @@
           <w:rFonts w:ascii="Times New Roman" w:hAnsi="Times New Roman"/>
           <w:color w:val="212121"/>
         </w:rPr>
-        <w:t xml:space="preserve">4. Need for Independent Evaluation: The authors concluded that </w:t>
-      </w:r>
-      <w:r>
-        <w:rPr>
-          <w:rFonts w:ascii="Times New Roman" w:hAnsi="Times New Roman"/>
-          <w:color w:val="212121"/>
-        </w:rPr>
-        <w:t>digital symptom checkers require independent clinical validation on real-world data and formal medical device regulation before deployment in public healthcare.</w:t>
+        <w:t>4. Need for Independent Evaluation: The authors concluded that digital symptom checkers require independent clinical validation on real-world data and formal medical device regulation before deployment in public healthcare.</w:t>
       </w:r>
     </w:p>
     <w:p>
@@ -4201,14 +4199,14 @@
           <w:rFonts w:ascii="Times New Roman" w:hAnsi="Times New Roman"/>
           <w:color w:val="212121"/>
         </w:rPr>
-        <w:t>Complementing clinical triage evaluations, the theoretical behavior of probabilistic classifier</w:t>
+        <w:t xml:space="preserve">Complementing </w:t>
       </w:r>
       <w:r>
         <w:rPr>
           <w:rFonts w:ascii="Times New Roman" w:hAnsi="Times New Roman"/>
           <w:color w:val="212121"/>
         </w:rPr>
-        <w:t xml:space="preserve"> calibration was investigated by Niculescu-Mizil &amp; Caruana (2005) [2] across 10 supervised learning families. They showed that:</w:t>
+        <w:t>clinical triage evaluations, the theoretical behavior of probabilistic classifier calibration was investigated by Niculescu-Mizil &amp; Caruana (2005) [2] across 10 supervised learning families. They showed that:</w:t>
       </w:r>
     </w:p>
     <w:p>
@@ -4221,14 +4219,14 @@
           <w:rFonts w:ascii="Times New Roman" w:hAnsi="Times New Roman"/>
           <w:color w:val="212121"/>
         </w:rPr>
-        <w:t>1. Distortion in Naive Bayes Estimators: Naive Bayes pushes predicted probabilities toward 0 and 1 because its conditional indep</w:t>
+        <w:t xml:space="preserve">1. Distortion in Naive Bayes Estimators: Naive </w:t>
       </w:r>
       <w:r>
         <w:rPr>
           <w:rFonts w:ascii="Times New Roman" w:hAnsi="Times New Roman"/>
           <w:color w:val="212121"/>
         </w:rPr>
-        <w:t>endence assumption multiplies marginal likelihoods, causing redundant evidence to inflate posterior log-odds.</w:t>
+        <w:t>Bayes pushes predicted probabilities toward 0 and 1 because its conditional independence assumption multiplies marginal likelihoods, causing redundant evidence to inflate posterior log-odds.</w:t>
       </w:r>
     </w:p>
     <w:p>
@@ -4241,14 +4239,14 @@
           <w:rFonts w:ascii="Times New Roman" w:hAnsi="Times New Roman"/>
           <w:color w:val="212121"/>
         </w:rPr>
-        <w:t>2. Data Scarcity and Isotonic Regression: The authors demonstrated that non-parametric calibration (Isotonic regression) requires substantial vali</w:t>
+        <w:t>2. Data Scarcity and Isotonic Regression: The authors demonstrate</w:t>
       </w:r>
       <w:r>
         <w:rPr>
           <w:rFonts w:ascii="Times New Roman" w:hAnsi="Times New Roman"/>
           <w:color w:val="212121"/>
         </w:rPr>
-        <w:t>dation data and performs worse than parametric Platt scaling when data is scarce.</w:t>
+        <w:t>d that non-parametric calibration (Isotonic regression) requires substantial validation data and performs worse than parametric Platt scaling when data is scarce.</w:t>
       </w:r>
     </w:p>
     <w:p>
@@ -4261,14 +4259,14 @@
           <w:rFonts w:ascii="Times New Roman" w:hAnsi="Times New Roman"/>
           <w:color w:val="212121"/>
         </w:rPr>
-        <w:t>Table 1.1 summarizes six seminal contributions across clinical symptom checking, Bayesian classification, interpretability, and natural language generation that directly info</w:t>
+        <w:t>Table 1.1 summarizes six seminal contributions across clinical symptom checking, Bayesian cla</w:t>
       </w:r>
       <w:r>
         <w:rPr>
           <w:rFonts w:ascii="Times New Roman" w:hAnsi="Times New Roman"/>
           <w:color w:val="212121"/>
         </w:rPr>
-        <w:t>rmed the design of ArogyaMitra.</w:t>
+        <w:t>ssification, interpretability, and natural language generation that directly informed the design of ArogyaMitra.</w:t>
       </w:r>
     </w:p>
     <w:p>
@@ -4432,7 +4430,15 @@
                 <w:b/>
                 <w:sz w:val="17"/>
               </w:rPr>
-              <w:t>Wallace et al. (2022) [1]</w:t>
+              <w:t>Wallace et al. (2</w:t>
+            </w:r>
+            <w:r>
+              <w:rPr>
+                <w:rFonts w:ascii="Times New Roman" w:hAnsi="Times New Roman"/>
+                <w:b/>
+                <w:sz w:val="17"/>
+              </w:rPr>
+              <w:t>022) [1]</w:t>
             </w:r>
           </w:p>
         </w:tc>
@@ -4473,14 +4479,7 @@
                 <w:rFonts w:ascii="Times New Roman" w:hAnsi="Times New Roman"/>
                 <w:sz w:val="16"/>
               </w:rPr>
-              <w:t xml:space="preserve">Systematic review of 10 studies evaluating digital </w:t>
-            </w:r>
-            <w:r>
-              <w:rPr>
-                <w:rFonts w:ascii="Times New Roman" w:hAnsi="Times New Roman"/>
-                <w:sz w:val="16"/>
-              </w:rPr>
-              <w:t>symptom checkers using QUADAS-2.</w:t>
+              <w:t>Systematic review of 10 studies evaluating digital symptom checkers using QUADAS-2.</w:t>
             </w:r>
           </w:p>
         </w:tc>
@@ -4527,7 +4526,16 @@
                 <w:b/>
                 <w:sz w:val="17"/>
               </w:rPr>
-              <w:t>Niculescu-Mizil &amp; Caruana (2005) [2]</w:t>
+              <w:t xml:space="preserve">Niculescu-Mizil &amp; </w:t>
+            </w:r>
+            <w:r>
+              <w:rPr>
+                <w:rFonts w:ascii="Times New Roman" w:hAnsi="Times New Roman"/>
+                <w:b/>
+                <w:sz w:val="17"/>
+              </w:rPr>
+              <w:lastRenderedPageBreak/>
+              <w:t>Caruana (2005) [2]</w:t>
             </w:r>
           </w:p>
         </w:tc>
@@ -4549,6 +4557,7 @@
                 <w:i/>
                 <w:sz w:val="17"/>
               </w:rPr>
+              <w:lastRenderedPageBreak/>
               <w:t>Proc. ICML</w:t>
             </w:r>
           </w:p>
@@ -4570,14 +4579,15 @@
                 <w:rFonts w:ascii="Times New Roman" w:hAnsi="Times New Roman"/>
                 <w:sz w:val="16"/>
               </w:rPr>
-              <w:t>Empirical study of probability c</w:t>
-            </w:r>
-            <w:r>
-              <w:rPr>
-                <w:rFonts w:ascii="Times New Roman" w:hAnsi="Times New Roman"/>
-                <w:sz w:val="16"/>
-              </w:rPr>
-              <w:t>alibration across 10 supervised learning algorithms.</w:t>
+              <w:t xml:space="preserve">Empirical study of probability calibration </w:t>
+            </w:r>
+            <w:r>
+              <w:rPr>
+                <w:rFonts w:ascii="Times New Roman" w:hAnsi="Times New Roman"/>
+                <w:sz w:val="16"/>
+              </w:rPr>
+              <w:lastRenderedPageBreak/>
+              <w:t>across 10 supervised learning algorithms.</w:t>
             </w:r>
           </w:p>
         </w:tc>
@@ -4598,15 +4608,23 @@
                 <w:rFonts w:ascii="Times New Roman" w:hAnsi="Times New Roman"/>
                 <w:sz w:val="16"/>
               </w:rPr>
-              <w:t xml:space="preserve">Explains why BernoulliNB outputs extreme posteriors; justifies labeling scores as uncalibrated estimates. Our Platt scaling trial </w:t>
-            </w:r>
-            <w:r>
-              <w:rPr>
-                <w:rFonts w:ascii="Times New Roman" w:hAnsi="Times New Roman"/>
-                <w:sz w:val="16"/>
-              </w:rPr>
               <w:lastRenderedPageBreak/>
-              <w:t>was an independent experiment.</w:t>
+              <w:t xml:space="preserve">Explains why BernoulliNB outputs extreme posteriors; justifies labeling scores as </w:t>
+            </w:r>
+            <w:r>
+              <w:rPr>
+                <w:rFonts w:ascii="Times New Roman" w:hAnsi="Times New Roman"/>
+                <w:sz w:val="16"/>
+              </w:rPr>
+              <w:lastRenderedPageBreak/>
+              <w:t>uncalibrated estimates. Our Platt scalin</w:t>
+            </w:r>
+            <w:r>
+              <w:rPr>
+                <w:rFonts w:ascii="Times New Roman" w:hAnsi="Times New Roman"/>
+                <w:sz w:val="16"/>
+              </w:rPr>
+              <w:t>g trial was an independent experiment.</w:t>
             </w:r>
           </w:p>
         </w:tc>
@@ -4654,15 +4672,7 @@
                 <w:i/>
                 <w:sz w:val="17"/>
               </w:rPr>
-              <w:t xml:space="preserve">Machine </w:t>
-            </w:r>
-            <w:r>
-              <w:rPr>
-                <w:rFonts w:ascii="Times New Roman" w:hAnsi="Times New Roman"/>
-                <w:i/>
-                <w:sz w:val="17"/>
-              </w:rPr>
-              <w:t>Learning</w:t>
+              <w:t>Machine Learning</w:t>
             </w:r>
           </w:p>
         </w:tc>
@@ -4702,7 +4712,14 @@
                 <w:rFonts w:ascii="Times New Roman" w:hAnsi="Times New Roman"/>
                 <w:sz w:val="16"/>
               </w:rPr>
-              <w:t>Justifies deploying Bernoulli Naive Bayes for discrete symptom triage despite correlated clinical presentations.</w:t>
+              <w:t xml:space="preserve">Justifies deploying Bernoulli Naive Bayes for discrete symptom triage despite </w:t>
+            </w:r>
+            <w:r>
+              <w:rPr>
+                <w:rFonts w:ascii="Times New Roman" w:hAnsi="Times New Roman"/>
+                <w:sz w:val="16"/>
+              </w:rPr>
+              <w:t>correlated clinical presentations.</w:t>
             </w:r>
           </w:p>
         </w:tc>
@@ -4772,14 +4789,7 @@
                 <w:rFonts w:ascii="Times New Roman" w:hAnsi="Times New Roman"/>
                 <w:sz w:val="16"/>
               </w:rPr>
-              <w:t xml:space="preserve">Introduced LightGBM </w:t>
-            </w:r>
-            <w:r>
-              <w:rPr>
-                <w:rFonts w:ascii="Times New Roman" w:hAnsi="Times New Roman"/>
-                <w:sz w:val="16"/>
-              </w:rPr>
-              <w:t>with Gradient-based One-Side Sampling and Exclusive Feature Bundling.</w:t>
+              <w:t>Introduced LightGBM with Gradient-based One-Side Sampling and Exclusive Feature Bundling.</w:t>
             </w:r>
           </w:p>
         </w:tc>
@@ -4800,7 +4810,14 @@
                 <w:rFonts w:ascii="Times New Roman" w:hAnsi="Times New Roman"/>
                 <w:sz w:val="16"/>
               </w:rPr>
-              <w:t>Served as the comparative tree ensemble in our nested cross-validation benchmark on the 304 unique rows.</w:t>
+              <w:t xml:space="preserve">Served as the comparative tree ensemble in our nested cross-validation benchmark on the 304 unique </w:t>
+            </w:r>
+            <w:r>
+              <w:rPr>
+                <w:rFonts w:ascii="Times New Roman" w:hAnsi="Times New Roman"/>
+                <w:sz w:val="16"/>
+              </w:rPr>
+              <w:t>rows.</w:t>
             </w:r>
           </w:p>
         </w:tc>
@@ -4867,14 +4884,7 @@
                 <w:rFonts w:ascii="Times New Roman" w:hAnsi="Times New Roman"/>
                 <w:sz w:val="16"/>
               </w:rPr>
-              <w:t>Unified framework for interpreting mode</w:t>
-            </w:r>
-            <w:r>
-              <w:rPr>
-                <w:rFonts w:ascii="Times New Roman" w:hAnsi="Times New Roman"/>
-                <w:sz w:val="16"/>
-              </w:rPr>
-              <w:t>l predictions using game-theoretic Shapley values.</w:t>
+              <w:t>Unified framework for interpreting model predictions using game-theoretic Shapley values.</w:t>
             </w:r>
           </w:p>
         </w:tc>
@@ -4894,7 +4904,14 @@
                 <w:rFonts w:ascii="Times New Roman" w:hAnsi="Times New Roman"/>
                 <w:sz w:val="16"/>
               </w:rPr>
-              <w:t>Underpins our mathematical derivation of exact additive log-odds, ensuring symptom attributions sum to class log-evidence without sampling.</w:t>
+              <w:t>Underpins our mathematical derivation of exact additive log-odds, ensuring symptom attributions sum to class log-evide</w:t>
+            </w:r>
+            <w:r>
+              <w:rPr>
+                <w:rFonts w:ascii="Times New Roman" w:hAnsi="Times New Roman"/>
+                <w:sz w:val="16"/>
+              </w:rPr>
+              <w:t>nce without sampling.</w:t>
             </w:r>
           </w:p>
         </w:tc>
@@ -4964,14 +4981,7 @@
                 <w:rFonts w:ascii="Times New Roman" w:hAnsi="Times New Roman"/>
                 <w:sz w:val="16"/>
               </w:rPr>
-              <w:t xml:space="preserve">Comprehensive survey </w:t>
-            </w:r>
-            <w:r>
-              <w:rPr>
-                <w:rFonts w:ascii="Times New Roman" w:hAnsi="Times New Roman"/>
-                <w:sz w:val="16"/>
-              </w:rPr>
-              <w:t>of hallucination in Large Language Models.</w:t>
+              <w:t>Comprehensive survey of hallucination in Large Language Models.</w:t>
             </w:r>
           </w:p>
         </w:tc>
@@ -4992,7 +5002,14 @@
                 <w:rFonts w:ascii="Times New Roman" w:hAnsi="Times New Roman"/>
                 <w:sz w:val="16"/>
               </w:rPr>
-              <w:t>Motivated our architectural restriction: the LLM never classifies diseases and only formats explanations, backed by deterministic fallback templates.</w:t>
+              <w:t xml:space="preserve">Motivated our architectural restriction: the LLM never classifies diseases and only formats explanations, backed by </w:t>
+            </w:r>
+            <w:r>
+              <w:rPr>
+                <w:rFonts w:ascii="Times New Roman" w:hAnsi="Times New Roman"/>
+                <w:sz w:val="16"/>
+              </w:rPr>
+              <w:t>deterministic fallback templates.</w:t>
             </w:r>
           </w:p>
         </w:tc>
@@ -5021,14 +5038,14 @@
           <w:rFonts w:ascii="Times New Roman" w:hAnsi="Times New Roman"/>
           <w:color w:val="212121"/>
         </w:rPr>
-        <w:t xml:space="preserve">To clarify the technical </w:t>
+        <w:t xml:space="preserve">To clarify the technical positioning and safety boundaries of ArogyaMitra, Table 1.2 contrasts specific clinical concerns documented in literature against conventional symptom checkers </w:t>
       </w:r>
       <w:r>
         <w:rPr>
           <w:rFonts w:ascii="Times New Roman" w:hAnsi="Times New Roman"/>
           <w:color w:val="212121"/>
         </w:rPr>
-        <w:t>positioning and safety boundaries of ArogyaMitra, Table 1.2 contrasts specific clinical concerns documented in literature against conventional symptom checkers and the verifiable implementations within this repository.</w:t>
+        <w:t>and the verifiable implementations within this repository.</w:t>
       </w:r>
     </w:p>
     <w:p>
@@ -5042,16 +5059,7 @@
           <w:color w:val="154360"/>
           <w:sz w:val="19"/>
         </w:rPr>
-        <w:t>Table 1.2: Systematic Comparison: Cli</w:t>
-      </w:r>
-      <w:r>
-        <w:rPr>
-          <w:rFonts w:ascii="Times New Roman" w:hAnsi="Times New Roman"/>
-          <w:b/>
-          <w:color w:val="154360"/>
-          <w:sz w:val="19"/>
-        </w:rPr>
-        <w:t>nical Concerns vs. ArogyaMitra Implementations</w:t>
+        <w:t>Table 1.2: Systematic Comparison: Clinical Concerns vs. ArogyaMitra Implementations</w:t>
       </w:r>
     </w:p>
     <w:tbl>
@@ -5201,7 +5209,15 @@
                 <w:b/>
                 <w:sz w:val="16"/>
               </w:rPr>
-              <w:t>Low and variable diagnostic accuracy across symptom checkers (primary diagnosis 19–37.9%)</w:t>
+              <w:t>Low and variabl</w:t>
+            </w:r>
+            <w:r>
+              <w:rPr>
+                <w:rFonts w:ascii="Times New Roman" w:hAnsi="Times New Roman"/>
+                <w:b/>
+                <w:sz w:val="16"/>
+              </w:rPr>
+              <w:t>e diagnostic accuracy across symptom checkers (primary diagnosis 19–37.9%)</w:t>
             </w:r>
           </w:p>
         </w:tc>
@@ -5222,15 +5238,7 @@
                 <w:i/>
                 <w:sz w:val="16"/>
               </w:rPr>
-              <w:t>Wallace et al. (2022)</w:t>
-            </w:r>
-            <w:r>
-              <w:rPr>
-                <w:rFonts w:ascii="Times New Roman" w:hAnsi="Times New Roman"/>
-                <w:i/>
-                <w:sz w:val="16"/>
-              </w:rPr>
-              <w:t xml:space="preserve"> [1]</w:t>
+              <w:t>Wallace et al. (2022) [1]</w:t>
             </w:r>
           </w:p>
         </w:tc>
@@ -5271,7 +5279,15 @@
                 <w:color w:val="B71C1C"/>
                 <w:sz w:val="15"/>
               </w:rPr>
-              <w:t>Evaluated on synthetic data (304 unique rows); zero real-patient cohort validation.</w:t>
+              <w:t>Evaluated on synth</w:t>
+            </w:r>
+            <w:r>
+              <w:rPr>
+                <w:rFonts w:ascii="Times New Roman" w:hAnsi="Times New Roman"/>
+                <w:color w:val="B71C1C"/>
+                <w:sz w:val="15"/>
+              </w:rPr>
+              <w:t>etic data (304 unique rows); zero real-patient cohort validation.</w:t>
             </w:r>
           </w:p>
         </w:tc>
@@ -5298,15 +5314,7 @@
                 <w:b/>
                 <w:sz w:val="16"/>
               </w:rPr>
-              <w:t xml:space="preserve">Triage and patient safety </w:t>
-            </w:r>
-            <w:r>
-              <w:rPr>
-                <w:rFonts w:ascii="Times New Roman" w:hAnsi="Times New Roman"/>
-                <w:b/>
-                <w:sz w:val="16"/>
-              </w:rPr>
-              <w:t>hazards from incorrect diagnosis alignment (Swiss-cheese failure)</w:t>
+              <w:t>Triage and patient safety hazards from incorrect diagnosis alignment (Swiss-cheese failure)</w:t>
             </w:r>
           </w:p>
         </w:tc>
@@ -5349,7 +5357,14 @@
                 <w:rFonts w:ascii="Times New Roman" w:hAnsi="Times New Roman"/>
                 <w:sz w:val="16"/>
               </w:rPr>
-              <w:t>Implemented two-tier triage safety: Decision A red-flag emergency screening, low-confidence escalation (&lt;70%), and fail-closed HTTP 503 outage behavior.</w:t>
+              <w:t xml:space="preserve">Implemented two-tier triage safety: Decision A red-flag emergency </w:t>
+            </w:r>
+            <w:r>
+              <w:rPr>
+                <w:rFonts w:ascii="Times New Roman" w:hAnsi="Times New Roman"/>
+                <w:sz w:val="16"/>
+              </w:rPr>
+              <w:t>screening, low-confidence escalation (&lt;70%), and fail-closed HTTP 503 outage behavior.</w:t>
             </w:r>
           </w:p>
         </w:tc>
@@ -5371,15 +5386,7 @@
                 <w:color w:val="B71C1C"/>
                 <w:sz w:val="15"/>
               </w:rPr>
-              <w:t>Red-flag ru</w:t>
-            </w:r>
-            <w:r>
-              <w:rPr>
-                <w:rFonts w:ascii="Times New Roman" w:hAnsi="Times New Roman"/>
-                <w:color w:val="B71C1C"/>
-                <w:sz w:val="15"/>
-              </w:rPr>
-              <w:t>les remain in DRAFT status pending formal institutional clinical review.</w:t>
+              <w:t>Red-flag rules remain in DRAFT status pending formal institutional clinical review.</w:t>
             </w:r>
           </w:p>
         </w:tc>
@@ -5446,14 +5453,7 @@
                 <w:rFonts w:ascii="Times New Roman" w:hAnsi="Times New Roman"/>
                 <w:sz w:val="16"/>
               </w:rPr>
-              <w:t xml:space="preserve">Explicitly scoped as an uncertified educational decision-support </w:t>
-            </w:r>
-            <w:r>
-              <w:rPr>
-                <w:rFonts w:ascii="Times New Roman" w:hAnsi="Times New Roman"/>
-                <w:sz w:val="16"/>
-              </w:rPr>
-              <w:t>prototype; added DPDP-aware audit logging and data protection controls.</w:t>
+              <w:t>Explicitly scoped as an uncertified educational decision-support prototype; added DPDP-aware audit logging and data protection controls.</w:t>
             </w:r>
           </w:p>
         </w:tc>
@@ -5501,7 +5501,15 @@
                 <w:b/>
                 <w:sz w:val="16"/>
               </w:rPr>
-              <w:t>Naive Bayes pushes predicted probabilities toward 0 and 1 due to independence assumptions</w:t>
+              <w:t xml:space="preserve">Naive </w:t>
+            </w:r>
+            <w:r>
+              <w:rPr>
+                <w:rFonts w:ascii="Times New Roman" w:hAnsi="Times New Roman"/>
+                <w:b/>
+                <w:sz w:val="16"/>
+              </w:rPr>
+              <w:t>Bayes pushes predicted probabilities toward 0 and 1 due to independence assumptions</w:t>
             </w:r>
           </w:p>
         </w:tc>
@@ -5523,15 +5531,7 @@
                 <w:i/>
                 <w:sz w:val="16"/>
               </w:rPr>
-              <w:t>Nicules</w:t>
-            </w:r>
-            <w:r>
-              <w:rPr>
-                <w:rFonts w:ascii="Times New Roman" w:hAnsi="Times New Roman"/>
-                <w:i/>
-                <w:sz w:val="16"/>
-              </w:rPr>
-              <w:t>cu-Mizil &amp; Caruana (2005) [2]</w:t>
+              <w:t>Niculescu-Mizil &amp; Caruana (2005) [2]</w:t>
             </w:r>
           </w:p>
         </w:tc>
@@ -5574,7 +5574,15 @@
                 <w:color w:val="B71C1C"/>
                 <w:sz w:val="15"/>
               </w:rPr>
-              <w:t>Confidence scores still saturate near 100% when multiple correlated symptoms match.</w:t>
+              <w:t>Confidence scor</w:t>
+            </w:r>
+            <w:r>
+              <w:rPr>
+                <w:rFonts w:ascii="Times New Roman" w:hAnsi="Times New Roman"/>
+                <w:color w:val="B71C1C"/>
+                <w:sz w:val="15"/>
+              </w:rPr>
+              <w:t>es still saturate near 100% when multiple correlated symptoms match.</w:t>
             </w:r>
           </w:p>
         </w:tc>
@@ -5600,15 +5608,7 @@
                 <w:b/>
                 <w:sz w:val="16"/>
               </w:rPr>
-              <w:t xml:space="preserve">Calibration methods </w:t>
-            </w:r>
-            <w:r>
-              <w:rPr>
-                <w:rFonts w:ascii="Times New Roman" w:hAnsi="Times New Roman"/>
-                <w:b/>
-                <w:sz w:val="16"/>
-              </w:rPr>
-              <w:t>require separate calibration data and may degrade on small datasets</w:t>
+              <w:t>Calibration methods require separate calibration data and may degrade on small datasets</w:t>
             </w:r>
           </w:p>
         </w:tc>
@@ -5649,7 +5649,14 @@
                 <w:rFonts w:ascii="Times New Roman" w:hAnsi="Times New Roman"/>
                 <w:sz w:val="16"/>
               </w:rPr>
-              <w:t>Empirically tested Platt scaling on 304 unique rows; verified log loss worsened from 0.0061 to 0.1643; deployed uncalibrated raw posterior estimates.</w:t>
+              <w:t>Empirically tested Platt scaling on 304 unique rows; verified</w:t>
+            </w:r>
+            <w:r>
+              <w:rPr>
+                <w:rFonts w:ascii="Times New Roman" w:hAnsi="Times New Roman"/>
+                <w:sz w:val="16"/>
+              </w:rPr>
+              <w:t xml:space="preserve"> log loss worsened from 0.0061 to 0.1643; deployed uncalibrated raw posterior estimates.</w:t>
             </w:r>
           </w:p>
         </w:tc>
@@ -5698,7 +5705,15 @@
                 <w:sz w:val="16"/>
               </w:rPr>
               <w:lastRenderedPageBreak/>
-              <w:t>Feature attribution instability and stochastic sampling variance in local surrogates (LIME)</w:t>
+              <w:t>Feature attribution instability and stochastic sampling variance in</w:t>
+            </w:r>
+            <w:r>
+              <w:rPr>
+                <w:rFonts w:ascii="Times New Roman" w:hAnsi="Times New Roman"/>
+                <w:b/>
+                <w:sz w:val="16"/>
+              </w:rPr>
+              <w:t xml:space="preserve"> local surrogates (LIME)</w:t>
             </w:r>
           </w:p>
         </w:tc>
@@ -5741,14 +5756,7 @@
                 <w:rFonts w:ascii="Times New Roman" w:hAnsi="Times New Roman"/>
                 <w:sz w:val="16"/>
               </w:rPr>
-              <w:t xml:space="preserve">Derived exact additive log-odds </w:t>
-            </w:r>
-            <w:r>
-              <w:rPr>
-                <w:rFonts w:ascii="Times New Roman" w:hAnsi="Times New Roman"/>
-                <w:sz w:val="16"/>
-              </w:rPr>
-              <w:t>evidence weights directly from Bernoulli likelihoods, satisfying additivity without sampling.</w:t>
+              <w:t>Derived exact additive log-odds evidence weights directly from Bernoulli likelihoods, satisfying additivity without sampling.</w:t>
             </w:r>
           </w:p>
         </w:tc>
@@ -5770,7 +5778,15 @@
                 <w:color w:val="B71C1C"/>
                 <w:sz w:val="15"/>
               </w:rPr>
-              <w:t>Feature attributions reflect statistical model log-odds, not causal biological pathophysiology.</w:t>
+              <w:t xml:space="preserve">Feature attributions reflect statistical model log-odds, not causal biological </w:t>
+            </w:r>
+            <w:r>
+              <w:rPr>
+                <w:rFonts w:ascii="Times New Roman" w:hAnsi="Times New Roman"/>
+                <w:color w:val="B71C1C"/>
+                <w:sz w:val="15"/>
+              </w:rPr>
+              <w:t>pathophysiology.</w:t>
             </w:r>
           </w:p>
         </w:tc>
@@ -5796,15 +5812,7 @@
                 <w:b/>
                 <w:sz w:val="16"/>
               </w:rPr>
-              <w:t>Hallucination of diagnoses, dosages, and medical facts in Large L</w:t>
-            </w:r>
-            <w:r>
-              <w:rPr>
-                <w:rFonts w:ascii="Times New Roman" w:hAnsi="Times New Roman"/>
-                <w:b/>
-                <w:sz w:val="16"/>
-              </w:rPr>
-              <w:t>anguage Models</w:t>
+              <w:t>Hallucination of diagnoses, dosages, and medical facts in Large Language Models</w:t>
             </w:r>
           </w:p>
         </w:tc>
@@ -5845,7 +5853,14 @@
                 <w:rFonts w:ascii="Times New Roman" w:hAnsi="Times New Roman"/>
                 <w:sz w:val="16"/>
               </w:rPr>
-              <w:t>Architectural boundary isolation: LLM never predicts the disease class; it only formats pre-computed evidence; fallback templates with zero drug dosages.</w:t>
+              <w:t>Architectural boundary isolation: LLM never predicts the disease class; it only formats pre-computed evidence; fallback templates with ze</w:t>
+            </w:r>
+            <w:r>
+              <w:rPr>
+                <w:rFonts w:ascii="Times New Roman" w:hAnsi="Times New Roman"/>
+                <w:sz w:val="16"/>
+              </w:rPr>
+              <w:t>ro drug dosages.</w:t>
             </w:r>
           </w:p>
         </w:tc>
@@ -5866,15 +5881,7 @@
                 <w:color w:val="B71C1C"/>
                 <w:sz w:val="15"/>
               </w:rPr>
-              <w:t>Template library covers only the 41 trained conditions; requires o</w:t>
-            </w:r>
-            <w:r>
-              <w:rPr>
-                <w:rFonts w:ascii="Times New Roman" w:hAnsi="Times New Roman"/>
-                <w:color w:val="B71C1C"/>
-                <w:sz w:val="15"/>
-              </w:rPr>
-              <w:t>ngoing physician curation.</w:t>
+              <w:t>Template library covers only the 41 trained conditions; requires ongoing physician curation.</w:t>
             </w:r>
           </w:p>
         </w:tc>
@@ -5904,14 +5911,14 @@
           <w:rFonts w:ascii="Times New Roman" w:hAnsi="Times New Roman"/>
           <w:color w:val="212121"/>
         </w:rPr>
-        <w:t xml:space="preserve">Problem Statement: Community health workers in primary healthcare settings require an auditable, privacy-preserving, and fail-closed decision support tool to triage acute presentations </w:t>
+        <w:t xml:space="preserve">Problem Statement: Community health workers in primary healthcare settings require an auditable, </w:t>
       </w:r>
       <w:r>
         <w:rPr>
           <w:rFonts w:ascii="Times New Roman" w:hAnsi="Times New Roman"/>
           <w:color w:val="212121"/>
         </w:rPr>
-        <w:t>without relying on black-box predictions, ungrounded generative text, or unvetted cloud infrastructure.</w:t>
+        <w:t>privacy-preserving, and fail-closed decision support tool to triage acute presentations without relying on black-box predictions, ungrounded generative text, or unvetted cloud infrastructure.</w:t>
       </w:r>
     </w:p>
     <w:p>
@@ -5925,7 +5932,15 @@
           <w:b/>
           <w:color w:val="212121"/>
         </w:rPr>
-        <w:t>To address this problem, I engineered ArogyaMitra according to five design objectives:</w:t>
+        <w:t>To address this problem, I engineered ArogyaMitra according to f</w:t>
+      </w:r>
+      <w:r>
+        <w:rPr>
+          <w:rFonts w:ascii="Times New Roman" w:hAnsi="Times New Roman"/>
+          <w:b/>
+          <w:color w:val="212121"/>
+        </w:rPr>
+        <w:t>ive design objectives:</w:t>
       </w:r>
     </w:p>
     <w:p>
@@ -5938,14 +5953,7 @@
           <w:rFonts w:ascii="Times New Roman" w:hAnsi="Times New Roman"/>
           <w:color w:val="212121"/>
         </w:rPr>
-        <w:t>1. Objective 1 — Probabilistic Explainability: Deploy an inferenc</w:t>
-      </w:r>
-      <w:r>
-        <w:rPr>
-          <w:rFonts w:ascii="Times New Roman" w:hAnsi="Times New Roman"/>
-          <w:color w:val="212121"/>
-        </w:rPr>
-        <w:t>e engine where every differential disease score is mathematically traceable to specific symptom attributions, avoiding black-box models.</w:t>
+        <w:t>1. Objective 1 — Probabilistic Explainability: Deploy an inference engine where every differential disease score is mathematically traceable to specific symptom attributions, avoiding black-box models.</w:t>
       </w:r>
     </w:p>
     <w:p>
@@ -5958,14 +5966,14 @@
           <w:rFonts w:ascii="Times New Roman" w:hAnsi="Times New Roman"/>
           <w:color w:val="212121"/>
         </w:rPr>
-        <w:t>2. Objective 2 — Deterministic Red-Flag Override: Ensure that clinical red-flag symptoms (e.g., chest pain, acute dyspn</w:t>
+        <w:t xml:space="preserve">2. Objective 2 — Deterministic </w:t>
       </w:r>
       <w:r>
         <w:rPr>
           <w:rFonts w:ascii="Times New Roman" w:hAnsi="Times New Roman"/>
           <w:color w:val="212121"/>
         </w:rPr>
-        <w:t>ea, coma) immediately trigger emergency triage, superseding statistical model predictions.</w:t>
+        <w:t>Red-Flag Override: Ensure that clinical red-flag symptoms (e.g., chest pain, acute dyspnea, coma) immediately trigger emergency triage, superseding statistical model predictions.</w:t>
       </w:r>
     </w:p>
     <w:p>
@@ -5978,14 +5986,14 @@
           <w:rFonts w:ascii="Times New Roman" w:hAnsi="Times New Roman"/>
           <w:color w:val="212121"/>
         </w:rPr>
-        <w:t>3. Objective 3 — Guarded LLM Narrative Generation: Confine the Large Language Model strictly to formatting summaries, enforcing a 10s per-attempt timeout and a 20s o</w:t>
+        <w:t>3. Objective 3 — Guarded LLM Narrative Generation: Confine the Large Language</w:t>
       </w:r>
       <w:r>
         <w:rPr>
           <w:rFonts w:ascii="Times New Roman" w:hAnsi="Times New Roman"/>
           <w:color w:val="212121"/>
         </w:rPr>
-        <w:t>verall cap backed by deterministic medical templates.</w:t>
+        <w:t xml:space="preserve"> Model strictly to formatting summaries, enforcing a 10s per-attempt timeout and a 20s overall cap backed by deterministic medical templates.</w:t>
       </w:r>
     </w:p>
     <w:p>
@@ -5998,14 +6006,14 @@
           <w:rFonts w:ascii="Times New Roman" w:hAnsi="Times New Roman"/>
           <w:color w:val="212121"/>
         </w:rPr>
-        <w:t>4. Objective 4 — Fail-Closed System Behavior: In the event of microservice failure or database unreachability, the system must not output mock predictions; it must reject unsafe operations and return ex</w:t>
+        <w:t>4. Objective 4 — Fail-Closed System Behavior: In the event of microservice failure or database unreachability, the</w:t>
       </w:r>
       <w:r>
         <w:rPr>
           <w:rFonts w:ascii="Times New Roman" w:hAnsi="Times New Roman"/>
           <w:color w:val="212121"/>
         </w:rPr>
-        <w:t>plicit HTTP 503 error states.</w:t>
+        <w:t xml:space="preserve"> system must not output mock predictions; it must reject unsafe operations and return explicit HTTP 503 error states.</w:t>
       </w:r>
     </w:p>
     <w:p>
@@ -6018,7 +6026,14 @@
           <w:rFonts w:ascii="Times New Roman" w:hAnsi="Times New Roman"/>
           <w:color w:val="212121"/>
         </w:rPr>
-        <w:t>5. Objective 5 — Layered Data Security: Implement cryptographic protections across trust boundaries, including field-level AES-256-GCM encryption, Argon2id credential hashing, and container network isolation.</w:t>
+        <w:t>5. Objective 5 — Layered Data Security: Implement cryptographic protections across trust boundaries, including field-level AES-256-GCM enc</w:t>
+      </w:r>
+      <w:r>
+        <w:rPr>
+          <w:rFonts w:ascii="Times New Roman" w:hAnsi="Times New Roman"/>
+          <w:color w:val="212121"/>
+        </w:rPr>
+        <w:t>ryption, Argon2id credential hashing, and container network isolation.</w:t>
       </w:r>
     </w:p>
     <w:p>
@@ -6032,8 +6047,142 @@
           <w:color w:val="154360"/>
           <w:sz w:val="24"/>
         </w:rPr>
-        <w:t>1.4 Design Evolut</w:t>
-      </w:r>
+        <w:t>1.4 Design Evolution</w:t>
+      </w:r>
+    </w:p>
+    <w:p>
+      <w:pPr>
+        <w:spacing w:after="80"/>
+        <w:jc w:val="both"/>
+      </w:pPr>
+      <w:r>
+        <w:rPr>
+          <w:rFonts w:ascii="Times New Roman" w:hAnsi="Times New Roman"/>
+          <w:color w:val="212121"/>
+        </w:rPr>
+        <w:t>The architecture of ArogyaMitra evolved through several engineering iterations as testing revealed limitations in earlier designs. In early versions, the system was</w:t>
+      </w:r>
+      <w:r>
+        <w:rPr>
+          <w:rFonts w:ascii="Times New Roman" w:hAnsi="Times New Roman"/>
+          <w:color w:val="212121"/>
+        </w:rPr>
+        <w:t xml:space="preserve"> structured as a conventional web prototype: a monolithic script exposing a tree-based classifier, an unconstrained generative LLM prompt, and default web application security. Through systematic auditing and benchmarking, I identified several vulnerabilit</w:t>
+      </w:r>
+      <w:r>
+        <w:rPr>
+          <w:rFonts w:ascii="Times New Roman" w:hAnsi="Times New Roman"/>
+          <w:color w:val="212121"/>
+        </w:rPr>
+        <w:t>ies and made the following design decisions:</w:t>
+      </w:r>
+    </w:p>
+    <w:p>
+      <w:pPr>
+        <w:spacing w:after="80"/>
+        <w:jc w:val="both"/>
+      </w:pPr>
+      <w:r>
+        <w:rPr>
+          <w:rFonts w:ascii="Times New Roman" w:hAnsi="Times New Roman"/>
+          <w:color w:val="212121"/>
+        </w:rPr>
+        <w:t>1. Rejection of Spurious Model Calibration Claims: When initial tests attempted post-hoc Platt scaling on the dataset, empirical evaluation revealed that fitting a Platt sigmoid on the 304 unique rows degraded l</w:t>
+      </w:r>
+      <w:r>
+        <w:rPr>
+          <w:rFonts w:ascii="Times New Roman" w:hAnsi="Times New Roman"/>
+          <w:color w:val="212121"/>
+        </w:rPr>
+        <w:t>og loss from 0.0061 to 0.1643. I determined that fitting parametric sigmoids on scarce class samples introduces boundary distortion. I removed claims of calibrated probabilities and updated the user interface to explicitly state that scores represent uncal</w:t>
+      </w:r>
+      <w:r>
+        <w:rPr>
+          <w:rFonts w:ascii="Times New Roman" w:hAnsi="Times New Roman"/>
+          <w:color w:val="212121"/>
+        </w:rPr>
+        <w:t>ibrated posterior estimates from Bernoulli Naive Bayes.</w:t>
+      </w:r>
+    </w:p>
+    <w:p>
+      <w:pPr>
+        <w:spacing w:after="80"/>
+        <w:jc w:val="both"/>
+      </w:pPr>
+      <w:r>
+        <w:rPr>
+          <w:rFonts w:ascii="Times New Roman" w:hAnsi="Times New Roman"/>
+          <w:color w:val="212121"/>
+        </w:rPr>
+        <w:t>2. Transition from Mock Fallbacks to Fail-Closed Design: Early prototypes included client-side mock fallbacks that returned simulated predictions when backend services were offline. Recognizing that r</w:t>
+      </w:r>
+      <w:r>
+        <w:rPr>
+          <w:rFonts w:ascii="Times New Roman" w:hAnsi="Times New Roman"/>
+          <w:color w:val="212121"/>
+        </w:rPr>
+        <w:t xml:space="preserve">eturning canned predictions during an outage creates patient safety hazards, I redesigned the system to be fail-closed: removing all client mocks and ensuring that service outages return an explicit HTTP 503 MODEL_UNAVAILABLE error with clear instructions </w:t>
+      </w:r>
+      <w:r>
+        <w:rPr>
+          <w:rFonts w:ascii="Times New Roman" w:hAnsi="Times New Roman"/>
+          <w:color w:val="212121"/>
+        </w:rPr>
+        <w:t>to seek emergency care.</w:t>
+      </w:r>
+    </w:p>
+    <w:p>
+      <w:pPr>
+        <w:spacing w:after="80"/>
+        <w:jc w:val="both"/>
+      </w:pPr>
+      <w:r>
+        <w:rPr>
+          <w:rFonts w:ascii="Times New Roman" w:hAnsi="Times New Roman"/>
+          <w:color w:val="212121"/>
+        </w:rPr>
+        <w:lastRenderedPageBreak/>
+        <w:t>3. Derivation of Exact Log-Odds Over Sampling Surrogates: Initial experiments with local perturbation surrogates (such as LIME) showed sampling variance and high latency. To achieve fast, deterministic explanations, I derived closed</w:t>
+      </w:r>
+      <w:r>
+        <w:rPr>
+          <w:rFonts w:ascii="Times New Roman" w:hAnsi="Times New Roman"/>
+          <w:color w:val="212121"/>
+        </w:rPr>
+        <w:t>-form Bayesian log-odds attributions directly from the Bernoulli parameter matrix, achieving exact additive feature attributions without sampling overhead.</w:t>
+      </w:r>
+    </w:p>
+    <w:p>
+      <w:pPr>
+        <w:spacing w:after="160"/>
+        <w:jc w:val="both"/>
+      </w:pPr>
+      <w:r>
+        <w:rPr>
+          <w:rFonts w:ascii="Times New Roman" w:hAnsi="Times New Roman"/>
+          <w:color w:val="212121"/>
+        </w:rPr>
+        <w:t>4. Container Decoupling and Secret Hardening: Static analysis detected fallback encryption keys embe</w:t>
+      </w:r>
+      <w:r>
+        <w:rPr>
+          <w:rFonts w:ascii="Times New Roman" w:hAnsi="Times New Roman"/>
+          <w:color w:val="212121"/>
+        </w:rPr>
+        <w:t>dded in source files. I refactored the system into isolated Docker microservices connected over a private bridge network, added environment variable enforcement, and wrote an automated production-guard test verifying that missing encryption keys halt execu</w:t>
+      </w:r>
+      <w:r>
+        <w:rPr>
+          <w:rFonts w:ascii="Times New Roman" w:hAnsi="Times New Roman"/>
+          <w:color w:val="212121"/>
+        </w:rPr>
+        <w:t>tion immediately.</w:t>
+      </w:r>
+    </w:p>
+    <w:p>
+      <w:pPr>
+        <w:spacing w:before="200" w:after="80"/>
+      </w:pPr>
       <w:r>
         <w:rPr>
           <w:rFonts w:ascii="Times New Roman" w:hAnsi="Times New Roman"/>
@@ -6041,7 +6190,7 @@
           <w:color w:val="154360"/>
           <w:sz w:val="24"/>
         </w:rPr>
-        <w:t>ion</w:t>
+        <w:t>1.5 Report Outline &amp; Organization</w:t>
       </w:r>
     </w:p>
     <w:p>
@@ -6054,116 +6203,50 @@
           <w:rFonts w:ascii="Times New Roman" w:hAnsi="Times New Roman"/>
           <w:color w:val="212121"/>
         </w:rPr>
-        <w:t>The architecture of ArogyaMitra evolved through several engineering iterations as testing revealed limitations in earlier designs. In early versions, the system was structured as a conventional web prototype: a monolithic script exposing a tree-based c</w:t>
+        <w:t xml:space="preserve">The remainder of this report is organized as follows: Chapter 2 specifies the functional, non-functional, and STRIDE threat modeling requirements. Chapter 3 provides the system architecture, mathematical </w:t>
       </w:r>
       <w:r>
         <w:rPr>
           <w:rFonts w:ascii="Times New Roman" w:hAnsi="Times New Roman"/>
           <w:color w:val="212121"/>
         </w:rPr>
-        <w:t>lassifier, an unconstrained generative LLM prompt, and default web application security. Through systematic auditing and benchmarking, I identified several vulnerabilities and made the following design decisions:</w:t>
-      </w:r>
-    </w:p>
-    <w:p>
-      <w:pPr>
-        <w:spacing w:after="80"/>
-        <w:jc w:val="both"/>
-      </w:pPr>
+        <w:t>formulation of Bernoulli Naive Bayes, red-flag screening rules, guarded LLM timeout cascades, cryptographic implementations, and concurrency controls. Chapter 4 presents empirical evaluations, including nested cross-validation across symptom dropout levels</w:t>
+      </w:r>
       <w:r>
         <w:rPr>
           <w:rFonts w:ascii="Times New Roman" w:hAnsi="Times New Roman"/>
           <w:color w:val="212121"/>
         </w:rPr>
-        <w:t xml:space="preserve">1. Rejection of Spurious Model Calibration </w:t>
-      </w:r>
-      <w:r>
-        <w:rPr>
-          <w:rFonts w:ascii="Times New Roman" w:hAnsi="Times New Roman"/>
-          <w:color w:val="212121"/>
-        </w:rPr>
-        <w:t>Claims: When initial tests attempted post-hoc Platt scaling on the dataset, empirical evaluation revealed that fitting a Platt sigmoid on the 304 unique rows degraded log loss from 0.0061 to 0.1643. I determined that fitting parametric sigmoids on scarce c</w:t>
-      </w:r>
-      <w:r>
-        <w:rPr>
-          <w:rFonts w:ascii="Times New Roman" w:hAnsi="Times New Roman"/>
-          <w:color w:val="212121"/>
-        </w:rPr>
-        <w:t>lass samples introduces boundary distortion. I removed claims of calibrated probabilities and updated the user interface to explicitly state that scores represent uncalibrated posterior estimates from Bernoulli Naive Bayes.</w:t>
-      </w:r>
-    </w:p>
-    <w:p>
-      <w:pPr>
-        <w:spacing w:after="80"/>
-        <w:jc w:val="both"/>
-      </w:pPr>
-      <w:r>
-        <w:rPr>
-          <w:rFonts w:ascii="Times New Roman" w:hAnsi="Times New Roman"/>
-          <w:color w:val="212121"/>
-        </w:rPr>
-        <w:t>2. Transition from Mock Fallback</w:t>
-      </w:r>
-      <w:r>
-        <w:rPr>
-          <w:rFonts w:ascii="Times New Roman" w:hAnsi="Times New Roman"/>
-          <w:color w:val="212121"/>
-        </w:rPr>
-        <w:t>s to Fail-Closed Design: Early prototypes included client-side mock fallbacks that returned simulated predictions when backend services were offline. Recognizing that returning canned predictions during an outage creates patient safety hazards, I redesigne</w:t>
-      </w:r>
-      <w:r>
-        <w:rPr>
-          <w:rFonts w:ascii="Times New Roman" w:hAnsi="Times New Roman"/>
-          <w:color w:val="212121"/>
-        </w:rPr>
-        <w:t>d the system to be fail-closed: removing all client mocks and ensuring that service outages return an explicit HTTP 503 MODEL_UNAVAILABLE error with clear instructions to seek emergency care.</w:t>
-      </w:r>
-    </w:p>
-    <w:p>
-      <w:pPr>
-        <w:spacing w:after="80"/>
-        <w:jc w:val="both"/>
-      </w:pPr>
-      <w:r>
-        <w:rPr>
-          <w:rFonts w:ascii="Times New Roman" w:hAnsi="Times New Roman"/>
-          <w:color w:val="212121"/>
+        <w:t>, load testing, automated test suite verification, and literature-linked discussion. Chapter 5 concludes the report and discusses future work. Engineering challenges and CLI reproduction playbooks are provided in Appendices A and B.</w:t>
+      </w:r>
+    </w:p>
+    <w:p>
+      <w:r>
+        <w:br w:type="page"/>
+      </w:r>
+    </w:p>
+    <w:p>
+      <w:pPr>
+        <w:spacing w:before="280" w:after="160"/>
+      </w:pPr>
+      <w:r>
+        <w:rPr>
+          <w:rFonts w:ascii="Times New Roman" w:hAnsi="Times New Roman"/>
+          <w:b/>
+          <w:color w:val="154360"/>
+          <w:sz w:val="28"/>
         </w:rPr>
         <w:lastRenderedPageBreak/>
-        <w:t>3. Derivation of Exact Log-Odds Over Sampling Surrogates: Initia</w:t>
-      </w:r>
-      <w:r>
-        <w:rPr>
-          <w:rFonts w:ascii="Times New Roman" w:hAnsi="Times New Roman"/>
-          <w:color w:val="212121"/>
-        </w:rPr>
-        <w:t>l experiments with local perturbation surrogates (such as LIME) showed sampling variance and high latency. To achieve fast, deterministic explanations, I derived closed-form Bayesian log-odds attributions directly from the Bernoulli parameter matrix, achie</w:t>
-      </w:r>
-      <w:r>
-        <w:rPr>
-          <w:rFonts w:ascii="Times New Roman" w:hAnsi="Times New Roman"/>
-          <w:color w:val="212121"/>
-        </w:rPr>
-        <w:t>ving exact additive feature attributions without sampling overhead.</w:t>
-      </w:r>
-    </w:p>
-    <w:p>
-      <w:pPr>
-        <w:spacing w:after="160"/>
-        <w:jc w:val="both"/>
-      </w:pPr>
-      <w:r>
-        <w:rPr>
-          <w:rFonts w:ascii="Times New Roman" w:hAnsi="Times New Roman"/>
-          <w:color w:val="212121"/>
-        </w:rPr>
-        <w:t>4. Container Decoupling and Secret Hardening: Static analysis detected fallback encryption keys embedded in source files. I refactored the system into isolated Docker microservices connect</w:t>
-      </w:r>
-      <w:r>
-        <w:rPr>
-          <w:rFonts w:ascii="Times New Roman" w:hAnsi="Times New Roman"/>
-          <w:color w:val="212121"/>
-        </w:rPr>
-        <w:t>ed over a private bridge network, added environment variable enforcement, and wrote an automated production-guard test verifying that missing encryption keys halt execution immediately.</w:t>
+        <w:t xml:space="preserve">Chapter 2: System </w:t>
+      </w:r>
+      <w:r>
+        <w:rPr>
+          <w:rFonts w:ascii="Times New Roman" w:hAnsi="Times New Roman"/>
+          <w:b/>
+          <w:color w:val="154360"/>
+          <w:sz w:val="28"/>
+        </w:rPr>
+        <w:t>Requirements &amp; Threat Modeling</w:t>
       </w:r>
     </w:p>
     <w:p>
@@ -6177,7 +6260,7 @@
           <w:color w:val="154360"/>
           <w:sz w:val="24"/>
         </w:rPr>
-        <w:t>1.5 Report Outline &amp; Organization</w:t>
+        <w:t>2.1 Functional Requirements</w:t>
       </w:r>
     </w:p>
     <w:p>
@@ -6190,82 +6273,14 @@
           <w:rFonts w:ascii="Times New Roman" w:hAnsi="Times New Roman"/>
           <w:color w:val="212121"/>
         </w:rPr>
-        <w:t>The remainder of this report is orga</w:t>
+        <w:t>ArogyaMitra governs clinical triage interactions across frontline community health workers, physicians, and administrative auditors. Table 2.1 specifies the ten functional requirements (FR-1 throug</w:t>
       </w:r>
       <w:r>
         <w:rPr>
           <w:rFonts w:ascii="Times New Roman" w:hAnsi="Times New Roman"/>
           <w:color w:val="212121"/>
         </w:rPr>
-        <w:t>nized as follows: Chapter 2 specifies the functional, non-functional, and STRIDE threat modeling requirements. Chapter 3 provides the system architecture, mathematical formulation of Bernoulli Naive Bayes, red-flag screening rules, guarded LLM timeout casc</w:t>
-      </w:r>
-      <w:r>
-        <w:rPr>
-          <w:rFonts w:ascii="Times New Roman" w:hAnsi="Times New Roman"/>
-          <w:color w:val="212121"/>
-        </w:rPr>
-        <w:t>ades, cryptographic implementations, and concurrency controls. Chapter 4 presents empirical evaluations, including nested cross-validation across symptom dropout levels, load testing, automated test suite verification, and literature-linked discussion. Cha</w:t>
-      </w:r>
-      <w:r>
-        <w:rPr>
-          <w:rFonts w:ascii="Times New Roman" w:hAnsi="Times New Roman"/>
-          <w:color w:val="212121"/>
-        </w:rPr>
-        <w:t>pter 5 concludes the report and discusses future work. Engineering challenges and CLI reproduction playbooks are provided in Appendices A and B.</w:t>
-      </w:r>
-    </w:p>
-    <w:p>
-      <w:r>
-        <w:br w:type="page"/>
-      </w:r>
-    </w:p>
-    <w:p>
-      <w:pPr>
-        <w:spacing w:before="280" w:after="160"/>
-      </w:pPr>
-      <w:r>
-        <w:rPr>
-          <w:rFonts w:ascii="Times New Roman" w:hAnsi="Times New Roman"/>
-          <w:b/>
-          <w:color w:val="154360"/>
-          <w:sz w:val="28"/>
-        </w:rPr>
-        <w:lastRenderedPageBreak/>
-        <w:t>Chapter 2: System Requirements &amp; Threat Modeling</w:t>
-      </w:r>
-    </w:p>
-    <w:p>
-      <w:pPr>
-        <w:spacing w:before="200" w:after="80"/>
-      </w:pPr>
-      <w:r>
-        <w:rPr>
-          <w:rFonts w:ascii="Times New Roman" w:hAnsi="Times New Roman"/>
-          <w:b/>
-          <w:color w:val="154360"/>
-          <w:sz w:val="24"/>
-        </w:rPr>
-        <w:t>2.1 Functional Requirements</w:t>
-      </w:r>
-    </w:p>
-    <w:p>
-      <w:pPr>
-        <w:spacing w:after="80"/>
-        <w:jc w:val="both"/>
-      </w:pPr>
-      <w:r>
-        <w:rPr>
-          <w:rFonts w:ascii="Times New Roman" w:hAnsi="Times New Roman"/>
-          <w:color w:val="212121"/>
-        </w:rPr>
-        <w:t xml:space="preserve">ArogyaMitra governs clinical </w:t>
-      </w:r>
-      <w:r>
-        <w:rPr>
-          <w:rFonts w:ascii="Times New Roman" w:hAnsi="Times New Roman"/>
-          <w:color w:val="212121"/>
-        </w:rPr>
-        <w:t>triage interactions across frontline community health workers, physicians, and administrative auditors. Table 2.1 specifies the ten functional requirements (FR-1 through FR-10) implemented across the microservice stack.</w:t>
+        <w:t>h FR-10) implemented across the microservice stack.</w:t>
       </w:r>
     </w:p>
     <w:p>
@@ -6279,16 +6294,7 @@
           <w:color w:val="154360"/>
           <w:sz w:val="19"/>
         </w:rPr>
-        <w:t>Table 2.1: System Functional Require</w:t>
-      </w:r>
-      <w:r>
-        <w:rPr>
-          <w:rFonts w:ascii="Times New Roman" w:hAnsi="Times New Roman"/>
-          <w:b/>
-          <w:color w:val="154360"/>
-          <w:sz w:val="19"/>
-        </w:rPr>
-        <w:t>ments Specification (FR-1 to FR-10)</w:t>
+        <w:t>Table 2.1: System Functional Requirements Specification (FR-1 to FR-10)</w:t>
       </w:r>
     </w:p>
     <w:tbl>
@@ -6452,7 +6458,14 @@
                 <w:rFonts w:ascii="Times New Roman" w:hAnsi="Times New Roman"/>
                 <w:sz w:val="16"/>
               </w:rPr>
-              <w:t>Capture basic demographics and chief complaints, validating inputs against Pydantic schemas.</w:t>
+              <w:t xml:space="preserve">Capture basic demographics and chief complaints, validating </w:t>
+            </w:r>
+            <w:r>
+              <w:rPr>
+                <w:rFonts w:ascii="Times New Roman" w:hAnsi="Times New Roman"/>
+                <w:sz w:val="16"/>
+              </w:rPr>
+              <w:t>inputs against Pydantic schemas.</w:t>
             </w:r>
           </w:p>
         </w:tc>
@@ -6522,14 +6535,7 @@
                 <w:rFonts w:ascii="Times New Roman" w:hAnsi="Times New Roman"/>
                 <w:sz w:val="16"/>
               </w:rPr>
-              <w:t xml:space="preserve">Convert symptom selections from a </w:t>
-            </w:r>
-            <w:r>
-              <w:rPr>
-                <w:rFonts w:ascii="Times New Roman" w:hAnsi="Times New Roman"/>
-                <w:sz w:val="16"/>
-              </w:rPr>
-              <w:t>131-symptom vocabulary into binary indicator vectors.</w:t>
+              <w:t>Convert symptom selections from a 131-symptom vocabulary into binary indicator vectors.</w:t>
             </w:r>
           </w:p>
         </w:tc>
@@ -6596,7 +6602,14 @@
                 <w:rFonts w:ascii="Times New Roman" w:hAnsi="Times New Roman"/>
                 <w:sz w:val="16"/>
               </w:rPr>
-              <w:t>Scan symptom inputs against 7 emergency symptoms; immediately assign Emergency triage on match.</w:t>
+              <w:t>Scan symptom inputs against 7 emergency symptoms; immediately assign Emergency triage</w:t>
+            </w:r>
+            <w:r>
+              <w:rPr>
+                <w:rFonts w:ascii="Times New Roman" w:hAnsi="Times New Roman"/>
+                <w:sz w:val="16"/>
+              </w:rPr>
+              <w:t xml:space="preserve"> on match.</w:t>
             </w:r>
           </w:p>
         </w:tc>
@@ -6666,14 +6679,7 @@
                 <w:rFonts w:ascii="Times New Roman" w:hAnsi="Times New Roman"/>
                 <w:sz w:val="16"/>
               </w:rPr>
-              <w:t xml:space="preserve">Compute uncalibrated posterior log-odds across 41 </w:t>
-            </w:r>
-            <w:r>
-              <w:rPr>
-                <w:rFonts w:ascii="Times New Roman" w:hAnsi="Times New Roman"/>
-                <w:sz w:val="16"/>
-              </w:rPr>
-              <w:t>disease classes and return top-3 ranked differentials.</w:t>
+              <w:t>Compute uncalibrated posterior log-odds across 41 disease classes and return top-3 ranked differentials.</w:t>
             </w:r>
           </w:p>
         </w:tc>
@@ -6740,7 +6746,14 @@
                 <w:rFonts w:ascii="Times New Roman" w:hAnsi="Times New Roman"/>
                 <w:sz w:val="16"/>
               </w:rPr>
-              <w:t>Calculate exact positive and negative log-likelihood contributions for each presenting symptom.</w:t>
+              <w:t xml:space="preserve">Calculate exact positive and negative log-likelihood contributions for each presenting </w:t>
+            </w:r>
+            <w:r>
+              <w:rPr>
+                <w:rFonts w:ascii="Times New Roman" w:hAnsi="Times New Roman"/>
+                <w:sz w:val="16"/>
+              </w:rPr>
+              <w:t>symptom.</w:t>
             </w:r>
           </w:p>
         </w:tc>
@@ -6810,14 +6823,7 @@
                 <w:rFonts w:ascii="Times New Roman" w:hAnsi="Times New Roman"/>
                 <w:sz w:val="16"/>
               </w:rPr>
-              <w:t>Generate clinical summaries via Gemini API subject to</w:t>
-            </w:r>
-            <w:r>
-              <w:rPr>
-                <w:rFonts w:ascii="Times New Roman" w:hAnsi="Times New Roman"/>
-                <w:sz w:val="16"/>
-              </w:rPr>
-              <w:t xml:space="preserve"> strict confidence-word filtering.</w:t>
+              <w:t>Generate clinical summaries via Gemini API subject to strict confidence-word filtering.</w:t>
             </w:r>
           </w:p>
         </w:tc>
@@ -6933,7 +6939,15 @@
                 <w:b/>
                 <w:sz w:val="16"/>
               </w:rPr>
-              <w:t>Worker Decision Gate</w:t>
+              <w:t xml:space="preserve">Worker </w:t>
+            </w:r>
+            <w:r>
+              <w:rPr>
+                <w:rFonts w:ascii="Times New Roman" w:hAnsi="Times New Roman"/>
+                <w:b/>
+                <w:sz w:val="16"/>
+              </w:rPr>
+              <w:t>Decision Gate</w:t>
             </w:r>
           </w:p>
         </w:tc>
@@ -6954,14 +6968,7 @@
                 <w:rFonts w:ascii="Times New Roman" w:hAnsi="Times New Roman"/>
                 <w:sz w:val="16"/>
               </w:rPr>
-              <w:t xml:space="preserve">Provide an explicit Accept / Escalate decision interface for health worker </w:t>
-            </w:r>
-            <w:r>
-              <w:rPr>
-                <w:rFonts w:ascii="Times New Roman" w:hAnsi="Times New Roman"/>
-                <w:sz w:val="16"/>
-              </w:rPr>
-              <w:t>review.</w:t>
+              <w:t>Provide an explicit Accept / Escalate decision interface for health worker review.</w:t>
             </w:r>
           </w:p>
         </w:tc>
@@ -7098,14 +7105,7 @@
                 <w:rFonts w:ascii="Times New Roman" w:hAnsi="Times New Roman"/>
                 <w:sz w:val="16"/>
               </w:rPr>
-              <w:t xml:space="preserve">Support patient consent recording, consent withdrawal, and administrator-approved </w:t>
-            </w:r>
-            <w:r>
-              <w:rPr>
-                <w:rFonts w:ascii="Times New Roman" w:hAnsi="Times New Roman"/>
-                <w:sz w:val="16"/>
-              </w:rPr>
-              <w:t>anonymization.</w:t>
+              <w:t>Support patient consent recording, consent withdrawal, and administrator-approved anonymization pursuant to India's DPDP Act, 2023 [11].</w:t>
             </w:r>
           </w:p>
         </w:tc>
@@ -7135,7 +7135,14 @@
           <w:rFonts w:ascii="Times New Roman" w:hAnsi="Times New Roman"/>
           <w:color w:val="212121"/>
         </w:rPr>
-        <w:t>Table 2.2 defines eight non-functional requirements presented as engineering targets alongside their measured evaluation outcomes.</w:t>
+        <w:t>Table 2.2 defines eight non-functional requirements pres</w:t>
+      </w:r>
+      <w:r>
+        <w:rPr>
+          <w:rFonts w:ascii="Times New Roman" w:hAnsi="Times New Roman"/>
+          <w:color w:val="212121"/>
+        </w:rPr>
+        <w:t>ented as engineering targets alongside their measured evaluation outcomes.</w:t>
       </w:r>
     </w:p>
     <w:p>
@@ -7149,16 +7156,7 @@
           <w:color w:val="154360"/>
           <w:sz w:val="19"/>
         </w:rPr>
-        <w:t xml:space="preserve">Table 2.2: System Non-Functional Requirements: </w:t>
-      </w:r>
-      <w:r>
-        <w:rPr>
-          <w:rFonts w:ascii="Times New Roman" w:hAnsi="Times New Roman"/>
-          <w:b/>
-          <w:color w:val="154360"/>
-          <w:sz w:val="19"/>
-        </w:rPr>
-        <w:t>Targets vs. Measured Results</w:t>
+        <w:t>Table 2.2: System Non-Functional Requirements: Targets vs. Measured Results</w:t>
       </w:r>
     </w:p>
     <w:tbl>
@@ -7349,7 +7347,14 @@
                 <w:rFonts w:ascii="Times New Roman" w:hAnsi="Times New Roman"/>
                 <w:sz w:val="16"/>
               </w:rPr>
-              <w:t>&lt;= 1,500 ms at p95 under load</w:t>
+              <w:t>&lt;= 1,500</w:t>
+            </w:r>
+            <w:r>
+              <w:rPr>
+                <w:rFonts w:ascii="Times New Roman" w:hAnsi="Times New Roman"/>
+                <w:sz w:val="16"/>
+              </w:rPr>
+              <w:t xml:space="preserve"> ms at p95 under load</w:t>
             </w:r>
           </w:p>
         </w:tc>
@@ -7469,7 +7474,14 @@
                 <w:sz w:val="16"/>
               </w:rPr>
               <w:lastRenderedPageBreak/>
-              <w:t>benchmark via vectorized NumPy log-odds.</w:t>
+              <w:t xml:space="preserve">benchmark via vectorized NumPy </w:t>
+            </w:r>
+            <w:r>
+              <w:rPr>
+                <w:rFonts w:ascii="Times New Roman" w:hAnsi="Times New Roman"/>
+                <w:sz w:val="16"/>
+              </w:rPr>
+              <w:t>log-odds.</w:t>
             </w:r>
           </w:p>
         </w:tc>
@@ -7557,14 +7569,7 @@
                 <w:rFonts w:ascii="Times New Roman" w:hAnsi="Times New Roman"/>
                 <w:sz w:val="16"/>
               </w:rPr>
-              <w:t xml:space="preserve">PASS. Verified by test suite (test_phase0.py); rejects </w:t>
-            </w:r>
-            <w:r>
-              <w:rPr>
-                <w:rFonts w:ascii="Times New Roman" w:hAnsi="Times New Roman"/>
-                <w:sz w:val="16"/>
-              </w:rPr>
-              <w:t>requests when ML container is offline.</w:t>
+              <w:t>PASS. Verified by test suite (test_phase0.py); rejects requests when ML container is offline.</w:t>
             </w:r>
           </w:p>
         </w:tc>
@@ -7655,7 +7660,14 @@
                 <w:rFonts w:ascii="Times New Roman" w:hAnsi="Times New Roman"/>
                 <w:sz w:val="16"/>
               </w:rPr>
-              <w:t>PASS. Verified by automated tests; unique 96-bit IV per record; process exits if key is missing.</w:t>
+              <w:t xml:space="preserve">PASS. Verified by automated tests; unique </w:t>
+            </w:r>
+            <w:r>
+              <w:rPr>
+                <w:rFonts w:ascii="Times New Roman" w:hAnsi="Times New Roman"/>
+                <w:sz w:val="16"/>
+              </w:rPr>
+              <w:t>96-bit IV per record; process exits if key is missing.</w:t>
             </w:r>
           </w:p>
         </w:tc>
@@ -7742,14 +7754,7 @@
                 <w:rFonts w:ascii="Times New Roman" w:hAnsi="Times New Roman"/>
                 <w:sz w:val="16"/>
               </w:rPr>
-              <w:t xml:space="preserve">PASS. Enforced </w:t>
-            </w:r>
-            <w:r>
-              <w:rPr>
-                <w:rFonts w:ascii="Times New Roman" w:hAnsi="Times New Roman"/>
-                <w:sz w:val="16"/>
-              </w:rPr>
-              <w:t>in auth service (3 iterations, 64 MB RAM, 4 parallelism threads).</w:t>
+              <w:t>PASS. Enforced in auth service (3 iterations, 64 MB RAM, 4 parallelism threads).</w:t>
             </w:r>
           </w:p>
         </w:tc>
@@ -7840,7 +7845,14 @@
                 <w:rFonts w:ascii="Times New Roman" w:hAnsi="Times New Roman"/>
                 <w:sz w:val="16"/>
               </w:rPr>
-              <w:t>PASS. Enforced via Mongoose version key (__v) and conditional atomic updates.</w:t>
+              <w:t xml:space="preserve">PASS. </w:t>
+            </w:r>
+            <w:r>
+              <w:rPr>
+                <w:rFonts w:ascii="Times New Roman" w:hAnsi="Times New Roman"/>
+                <w:sz w:val="16"/>
+              </w:rPr>
+              <w:t>Enforced via Mongoose version key (__v) and conditional atomic updates.</w:t>
             </w:r>
           </w:p>
         </w:tc>
@@ -7997,7 +8009,14 @@
                 <w:rFonts w:ascii="Times New Roman" w:hAnsi="Times New Roman"/>
                 <w:sz w:val="16"/>
               </w:rPr>
-              <w:t>Isolated Docker private bridge</w:t>
+              <w:t xml:space="preserve">Isolated Docker </w:t>
+            </w:r>
+            <w:r>
+              <w:rPr>
+                <w:rFonts w:ascii="Times New Roman" w:hAnsi="Times New Roman"/>
+                <w:sz w:val="16"/>
+              </w:rPr>
+              <w:t>private bridge</w:t>
             </w:r>
           </w:p>
         </w:tc>
@@ -8035,16 +8054,7 @@
           <w:color w:val="154360"/>
           <w:sz w:val="24"/>
         </w:rPr>
-        <w:t xml:space="preserve">2.3 Threat Model &amp; Security </w:t>
-      </w:r>
-      <w:r>
-        <w:rPr>
-          <w:rFonts w:ascii="Times New Roman" w:hAnsi="Times New Roman"/>
-          <w:b/>
-          <w:color w:val="154360"/>
-          <w:sz w:val="24"/>
-        </w:rPr>
-        <w:t>Analysis (STRIDE Matrix)</w:t>
+        <w:t>2.3 Threat Model &amp; Security Analysis (STRIDE Matrix)</w:t>
       </w:r>
     </w:p>
     <w:p>
@@ -8057,7 +8067,14 @@
           <w:rFonts w:ascii="Times New Roman" w:hAnsi="Times New Roman"/>
           <w:color w:val="212121"/>
         </w:rPr>
-        <w:t>To identify potential attack surfaces, I conducted a STRIDE threat modeling analysis across system trust boundaries. Table 2.3 summarizes the identified threat scenarios and implemented countermeasures.</w:t>
+        <w:t xml:space="preserve">To identify potential attack surfaces, I conducted a STRIDE threat modeling analysis across system </w:t>
+      </w:r>
+      <w:r>
+        <w:rPr>
+          <w:rFonts w:ascii="Times New Roman" w:hAnsi="Times New Roman"/>
+          <w:color w:val="212121"/>
+        </w:rPr>
+        <w:t>trust boundaries. Table 2.3 summarizes the identified threat scenarios and implemented countermeasures.</w:t>
       </w:r>
     </w:p>
     <w:p>
@@ -8071,16 +8088,7 @@
           <w:color w:val="154360"/>
           <w:sz w:val="19"/>
         </w:rPr>
-        <w:t xml:space="preserve">Table 2.3: STRIDE Threat </w:t>
-      </w:r>
-      <w:r>
-        <w:rPr>
-          <w:rFonts w:ascii="Times New Roman" w:hAnsi="Times New Roman"/>
-          <w:b/>
-          <w:color w:val="154360"/>
-          <w:sz w:val="19"/>
-        </w:rPr>
-        <w:t>Model and Architectural Security Controls</w:t>
+        <w:t>Table 2.3: STRIDE Threat Model and Architectural Security Controls</w:t>
       </w:r>
     </w:p>
     <w:tbl>
@@ -8223,7 +8231,14 @@
                 <w:rFonts w:ascii="Times New Roman" w:hAnsi="Times New Roman"/>
                 <w:sz w:val="16"/>
               </w:rPr>
-              <w:t>Adversary forges credentials or intercepts session tokens to submit false triage data.</w:t>
+              <w:t>Adv</w:t>
+            </w:r>
+            <w:r>
+              <w:rPr>
+                <w:rFonts w:ascii="Times New Roman" w:hAnsi="Times New Roman"/>
+                <w:sz w:val="16"/>
+              </w:rPr>
+              <w:t>ersary forges credentials or intercepts session tokens to submit false triage data.</w:t>
             </w:r>
           </w:p>
         </w:tc>
@@ -8243,14 +8258,7 @@
                 <w:rFonts w:ascii="Times New Roman" w:hAnsi="Times New Roman"/>
                 <w:sz w:val="16"/>
               </w:rPr>
-              <w:t xml:space="preserve">Short-lived signed JWTs (15-min expiry) with </w:t>
-            </w:r>
-            <w:r>
-              <w:rPr>
-                <w:rFonts w:ascii="Times New Roman" w:hAnsi="Times New Roman"/>
-                <w:sz w:val="16"/>
-              </w:rPr>
-              <w:t>HMAC-SHA256 and Argon2id hashing.</w:t>
+              <w:t>Short-lived signed JWTs (15-min expiry) with HMAC-SHA256 and Argon2id hashing.</w:t>
             </w:r>
           </w:p>
         </w:tc>
@@ -8365,14 +8373,7 @@
                 <w:rFonts w:ascii="Times New Roman" w:hAnsi="Times New Roman"/>
                 <w:sz w:val="16"/>
               </w:rPr>
-              <w:t xml:space="preserve">Health worker denies </w:t>
-            </w:r>
-            <w:r>
-              <w:rPr>
-                <w:rFonts w:ascii="Times New Roman" w:hAnsi="Times New Roman"/>
-                <w:sz w:val="16"/>
-              </w:rPr>
-              <w:t>recording a triage decision or clinician denies failing to review.</w:t>
+              <w:t>Health worker denies recording a triage decision or clinician denies failing to review.</w:t>
             </w:r>
           </w:p>
         </w:tc>
@@ -8392,7 +8393,14 @@
                 <w:rFonts w:ascii="Times New Roman" w:hAnsi="Times New Roman"/>
                 <w:sz w:val="16"/>
               </w:rPr>
-              <w:t>Structured MongoDB audit logs recording timestamps, user IDs, roles, and client IPs.</w:t>
+              <w:t xml:space="preserve">Structured MongoDB audit logs recording timestamps, user IDs, </w:t>
+            </w:r>
+            <w:r>
+              <w:rPr>
+                <w:rFonts w:ascii="Times New Roman" w:hAnsi="Times New Roman"/>
+                <w:sz w:val="16"/>
+              </w:rPr>
+              <w:t>roles, and client IPs.</w:t>
             </w:r>
           </w:p>
         </w:tc>
@@ -8507,7 +8515,14 @@
                 <w:rFonts w:ascii="Times New Roman" w:hAnsi="Times New Roman"/>
                 <w:sz w:val="16"/>
               </w:rPr>
-              <w:t>Adversary floods triage endpoints with requests, exhausting CPU or Gemini quota.</w:t>
+              <w:t xml:space="preserve">Adversary floods triage endpoints </w:t>
+            </w:r>
+            <w:r>
+              <w:rPr>
+                <w:rFonts w:ascii="Times New Roman" w:hAnsi="Times New Roman"/>
+                <w:sz w:val="16"/>
+              </w:rPr>
+              <w:t>with requests, exhausting CPU or Gemini quota.</w:t>
             </w:r>
           </w:p>
         </w:tc>
@@ -8527,14 +8542,7 @@
                 <w:rFonts w:ascii="Times New Roman" w:hAnsi="Times New Roman"/>
                 <w:sz w:val="16"/>
               </w:rPr>
-              <w:t>Rate limiting (100 req/15 min on API routes); 20s LLM hard cap with temp</w:t>
-            </w:r>
-            <w:r>
-              <w:rPr>
-                <w:rFonts w:ascii="Times New Roman" w:hAnsi="Times New Roman"/>
-                <w:sz w:val="16"/>
-              </w:rPr>
-              <w:t>late fallback.</w:t>
+              <w:t>Rate limiting (100 req/15 min on API routes); 20s LLM hard cap with template fallback.</w:t>
             </w:r>
           </w:p>
         </w:tc>
@@ -8603,7 +8611,14 @@
                 <w:rFonts w:ascii="Times New Roman" w:hAnsi="Times New Roman"/>
                 <w:sz w:val="16"/>
               </w:rPr>
-              <w:t>Role-Based Access Control middleware enforcing role checks ('worker', 'doctor', 'admin').</w:t>
+              <w:t xml:space="preserve">Role-Based Access </w:t>
+            </w:r>
+            <w:r>
+              <w:rPr>
+                <w:rFonts w:ascii="Times New Roman" w:hAnsi="Times New Roman"/>
+                <w:sz w:val="16"/>
+              </w:rPr>
+              <w:t>Control middleware enforcing role checks ('worker', 'doctor', 'admin').</w:t>
             </w:r>
           </w:p>
         </w:tc>
@@ -8633,14 +8648,14 @@
           <w:rFonts w:ascii="Times New Roman" w:hAnsi="Times New Roman"/>
           <w:color w:val="212121"/>
         </w:rPr>
-        <w:t xml:space="preserve">In </w:t>
+        <w:t>In accordance with medical software safety guidelines, including the WHO guidance on Ethics and Governance of Artificial Intelligence for Hea</w:t>
       </w:r>
       <w:r>
         <w:rPr>
           <w:rFonts w:ascii="Times New Roman" w:hAnsi="Times New Roman"/>
           <w:color w:val="212121"/>
         </w:rPr>
-        <w:t>accordance with medical software safety guidelines, ArogyaMitra enforces three clinical safety principles:</w:t>
+        <w:t>lth [12] and ICMR Ethical Guidelines for Application of AI in Healthcare [13], ArogyaMitra enforces three clinical safety principles:</w:t>
       </w:r>
     </w:p>
     <w:p>
@@ -8654,14 +8669,14 @@
           <w:color w:val="212121"/>
         </w:rPr>
         <w:lastRenderedPageBreak/>
-        <w:t xml:space="preserve">1. Human-in-the-Loop Operation: ArogyaMitra is architected solely as decision support, not an autonomous diagnostic agent. It cannot initiate </w:t>
+        <w:t>1. Human-in-the-Loop Operation: ArogyaMitra is architected solely as decision support, not an autonomous diagnostic agent.</w:t>
       </w:r>
       <w:r>
         <w:rPr>
           <w:rFonts w:ascii="Times New Roman" w:hAnsi="Times New Roman"/>
           <w:color w:val="212121"/>
         </w:rPr>
-        <w:t>clinical treatments or finalize discharge without human health worker confirmation.</w:t>
+        <w:t xml:space="preserve"> It cannot initiate clinical treatments or finalize discharge without human health worker confirmation.</w:t>
       </w:r>
     </w:p>
     <w:p>
@@ -8674,14 +8689,14 @@
           <w:rFonts w:ascii="Times New Roman" w:hAnsi="Times New Roman"/>
           <w:color w:val="212121"/>
         </w:rPr>
-        <w:t xml:space="preserve">2. Deterministic Red-Flag Precedence: Rule-based emergency detection operates with precedence over statistical predictions, ensuring that life-threatening symptoms trigger </w:t>
+        <w:t>2. Deterministic Red-Flag Precedence: Rule-based emergency detection operates with precedence over statistical predictions, ensuring that life-threateni</w:t>
       </w:r>
       <w:r>
         <w:rPr>
           <w:rFonts w:ascii="Times New Roman" w:hAnsi="Times New Roman"/>
           <w:color w:val="212121"/>
         </w:rPr>
-        <w:t>immediate emergency transfer regardless of model confidence.</w:t>
+        <w:t>ng symptoms trigger immediate emergency transfer regardless of model confidence.</w:t>
       </w:r>
     </w:p>
     <w:p>
@@ -8694,14 +8709,14 @@
           <w:rFonts w:ascii="Times New Roman" w:hAnsi="Times New Roman"/>
           <w:color w:val="212121"/>
         </w:rPr>
-        <w:t>3. Synthetic Data Disclosure: The machine learning model was trained on synthetic clinical datasets (304 unique rows). The system explicitly incorporates these operational limits into its documen</w:t>
+        <w:t>3. Synthetic Data Disclosure: The machine learning model was trained on synthetic clinical datasets (304 unique rows). The system explicitly incorporates these operational lim</w:t>
       </w:r>
       <w:r>
         <w:rPr>
           <w:rFonts w:ascii="Times New Roman" w:hAnsi="Times New Roman"/>
           <w:color w:val="212121"/>
         </w:rPr>
-        <w:t>tation and consent workflows.</w:t>
+        <w:t>its into its documentation and consent workflows.</w:t>
       </w:r>
     </w:p>
     <w:p>
@@ -8748,21 +8763,21 @@
           <w:rFonts w:ascii="Times New Roman" w:hAnsi="Times New Roman"/>
           <w:color w:val="212121"/>
         </w:rPr>
-        <w:t>ArogyaMitra is structured as a containerized microservice application designed for fault isolation and bounded latency. Rather than runn</w:t>
+        <w:t>ArogyaMitra is structured as a containerized microservice application designed for fault isolation and bounded laten</w:t>
       </w:r>
       <w:r>
         <w:rPr>
           <w:rFonts w:ascii="Times New Roman" w:hAnsi="Times New Roman"/>
           <w:color w:val="212121"/>
         </w:rPr>
-        <w:t>ing as a monolithic application where a failure in an auxiliary service (such as natural language summary generation) halts primary triage, the system decouples clinical workflows across specialized microservices, an edge reverse proxy, and a persistent da</w:t>
+        <w:t>cy. Rather than running as a monolithic application where a failure in an auxiliary service (such as natural language summary generation) halts primary triage, the system decouples clinical workflows across specialized microservices, an edge reverse proxy,</w:t>
       </w:r>
       <w:r>
         <w:rPr>
           <w:rFonts w:ascii="Times New Roman" w:hAnsi="Times New Roman"/>
           <w:color w:val="212121"/>
         </w:rPr>
-        <w:t>tabase.</w:t>
+        <w:t xml:space="preserve"> and a persistent database.</w:t>
       </w:r>
     </w:p>
     <w:p>
@@ -8788,14 +8803,14 @@
           <w:rFonts w:ascii="Times New Roman" w:hAnsi="Times New Roman"/>
           <w:color w:val="212121"/>
         </w:rPr>
-        <w:t xml:space="preserve">1. Edge Gateway &amp; TLS Terminator (Nginx): The sole public ingress point. Exposes HTTPS over port 443 with TLS 1.2 and TLS 1.3 </w:t>
+        <w:t xml:space="preserve">1. Edge Gateway &amp; TLS Terminator (Nginx): The sole public ingress point. Exposes HTTPS over port 443 with </w:t>
       </w:r>
       <w:r>
         <w:rPr>
           <w:rFonts w:ascii="Times New Roman" w:hAnsi="Times New Roman"/>
           <w:color w:val="212121"/>
         </w:rPr>
-        <w:t>support, terminates client connections, enforces HTTP Strict Transport Security (HSTS), and proxies traffic internally.</w:t>
+        <w:t>TLS 1.2 and TLS 1.3 support, terminates client connections, enforces HTTP Strict Transport Security (HSTS), and proxies traffic internally.</w:t>
       </w:r>
     </w:p>
     <w:p>
@@ -8808,14 +8823,14 @@
           <w:rFonts w:ascii="Times New Roman" w:hAnsi="Times New Roman"/>
           <w:color w:val="212121"/>
         </w:rPr>
-        <w:t>2. Frontend UI Service (Streamlit / Python 3.11): Provides a web interface for community health workers and medical officers (port 8501,</w:t>
+        <w:t xml:space="preserve">2. Frontend UI Service (Streamlit / Python 3.11): Provides a web interface for community health workers and medical </w:t>
       </w:r>
       <w:r>
         <w:rPr>
           <w:rFonts w:ascii="Times New Roman" w:hAnsi="Times New Roman"/>
           <w:color w:val="212121"/>
         </w:rPr>
-        <w:t xml:space="preserve"> internal).</w:t>
+        <w:t>officers (port 8501, internal).</w:t>
       </w:r>
     </w:p>
     <w:p>
@@ -8828,7 +8843,14 @@
           <w:rFonts w:ascii="Times New Roman" w:hAnsi="Times New Roman"/>
           <w:color w:val="212121"/>
         </w:rPr>
-        <w:t>3. Core Backend API Gateway (Node.js 20 / Express): Orchestrates consultation state, enforces JWT authentication and Argon2id password hashing, executes AES-256-GCM field encryption, and manages MongoDB transactions (port 5000, internal).</w:t>
+        <w:t>3. Core Backend API Gateway (Node.js 20 / Express): Orchestrates consultation state, enforces JWT authentication and Argon2id password hashing, executes AES-256-GCM field encryption, and manages MongoDB transactions (port 50</w:t>
+      </w:r>
+      <w:r>
+        <w:rPr>
+          <w:rFonts w:ascii="Times New Roman" w:hAnsi="Times New Roman"/>
+          <w:color w:val="212121"/>
+        </w:rPr>
+        <w:t>00, internal).</w:t>
       </w:r>
     </w:p>
     <w:p>
@@ -8841,14 +8863,7 @@
           <w:rFonts w:ascii="Times New Roman" w:hAnsi="Times New Roman"/>
           <w:color w:val="212121"/>
         </w:rPr>
-        <w:t>4. St</w:t>
-      </w:r>
-      <w:r>
-        <w:rPr>
-          <w:rFonts w:ascii="Times New Roman" w:hAnsi="Times New Roman"/>
-          <w:color w:val="212121"/>
-        </w:rPr>
-        <w:t>ateless Machine Learning Engine (FastAPI / Python 3.11): Implements the scikit-learn Bernoulli Naive Bayes classifier, vectorizes 131 symptom inputs, and computes closed-form log-odds feature attributions (port 8000, internal).</w:t>
+        <w:t>4. Stateless Machine Learning Engine (FastAPI / Python 3.11): Implements the scikit-learn Bernoulli Naive Bayes classifier, vectorizes 131 symptom inputs, and computes closed-form log-odds feature attributions (port 8000, internal).</w:t>
       </w:r>
     </w:p>
     <w:p>
@@ -8861,14 +8876,14 @@
           <w:rFonts w:ascii="Times New Roman" w:hAnsi="Times New Roman"/>
           <w:color w:val="212121"/>
         </w:rPr>
-        <w:t>5. Guarded LLM Narrative Ser</w:t>
+        <w:t>5. Guard</w:t>
       </w:r>
       <w:r>
         <w:rPr>
           <w:rFonts w:ascii="Times New Roman" w:hAnsi="Times New Roman"/>
           <w:color w:val="212121"/>
         </w:rPr>
-        <w:t>vice (FastAPI / LangGraph): Executes structured narrative formatting, Gemini API cascades, regex guardrails, and deterministic clinical template rendering (port 8001, internal).</w:t>
+        <w:t>ed LLM Narrative Service (FastAPI / LangGraph): Executes structured narrative formatting, Gemini API cascades, regex guardrails, and deterministic clinical template rendering (port 8001, internal).</w:t>
       </w:r>
     </w:p>
     <w:p>
@@ -8881,14 +8896,14 @@
           <w:rFonts w:ascii="Times New Roman" w:hAnsi="Times New Roman"/>
           <w:color w:val="212121"/>
         </w:rPr>
-        <w:t>6. Database Persistence Layer (MongoDB 7.0): Stores encrypted consultation rec</w:t>
+        <w:t>6. Database Persistence Layer (MongoDB 7.0): Stores encryp</w:t>
       </w:r>
       <w:r>
         <w:rPr>
           <w:rFonts w:ascii="Times New Roman" w:hAnsi="Times New Roman"/>
           <w:color w:val="212121"/>
         </w:rPr>
-        <w:t>ords, user accounts, and structured audit logs backed by a dedicated Docker persistent volume (mongo-data, port 27017, internal only). Crucially, MongoDB exposes no published ports to the host machine.</w:t>
+        <w:t>ted consultation records, user accounts, and structured audit logs backed by a dedicated Docker persistent volume (mongo-data, port 27017, internal only). Crucially, MongoDB exposes no published ports to the host machine.</w:t>
       </w:r>
     </w:p>
     <w:p>
@@ -8950,7 +8965,7 @@
           <w:color w:val="546E7A"/>
           <w:sz w:val="19"/>
         </w:rPr>
-        <w:t xml:space="preserve">Figure 3.1: Container Topology, Network Boundaries, </w:t>
+        <w:t xml:space="preserve">Figure 3.1: Container Topology, </w:t>
       </w:r>
       <w:r>
         <w:rPr>
@@ -8959,7 +8974,7 @@
           <w:color w:val="546E7A"/>
           <w:sz w:val="19"/>
         </w:rPr>
-        <w:t>and Data Tiers</w:t>
+        <w:t>Network Boundaries, and Data Tiers</w:t>
       </w:r>
     </w:p>
     <w:p>
@@ -9191,7 +9206,7 @@
                 <w:rFonts w:ascii="Times New Roman" w:hAnsi="Times New Roman"/>
                 <w:sz w:val="16"/>
               </w:rPr>
-              <w:t>1.25 / Port 443</w:t>
+              <w:t>1.27-alpine / Port 443</w:t>
             </w:r>
           </w:p>
         </w:tc>
@@ -9211,7 +9226,14 @@
                 <w:rFonts w:ascii="Times New Roman" w:hAnsi="Times New Roman"/>
                 <w:sz w:val="16"/>
               </w:rPr>
-              <w:t>TLS 1.2/1.3 Ingress, HSTS, Rate Limiting</w:t>
+              <w:t xml:space="preserve">TLS 1.2/1.3 Ingress, </w:t>
+            </w:r>
+            <w:r>
+              <w:rPr>
+                <w:rFonts w:ascii="Times New Roman" w:hAnsi="Times New Roman"/>
+                <w:sz w:val="16"/>
+              </w:rPr>
+              <w:t>HSTS, Rate Limiting</w:t>
             </w:r>
           </w:p>
         </w:tc>
@@ -9231,14 +9253,7 @@
                 <w:rFonts w:ascii="Times New Roman" w:hAnsi="Times New Roman"/>
                 <w:sz w:val="15"/>
               </w:rPr>
-              <w:t xml:space="preserve">Public </w:t>
-            </w:r>
-            <w:r>
-              <w:rPr>
-                <w:rFonts w:ascii="Times New Roman" w:hAnsi="Times New Roman"/>
-                <w:sz w:val="15"/>
-              </w:rPr>
-              <w:t>Perimeter</w:t>
+              <w:t>Public Perimeter</w:t>
             </w:r>
           </w:p>
         </w:tc>
@@ -9307,7 +9322,7 @@
                 <w:rFonts w:ascii="Times New Roman" w:hAnsi="Times New Roman"/>
                 <w:sz w:val="16"/>
               </w:rPr>
-              <w:t>1.32 / Port 8501</w:t>
+              <w:t>Python 3.11-slim / Port 8501</w:t>
             </w:r>
           </w:p>
         </w:tc>
@@ -9415,7 +9430,7 @@
                 <w:rFonts w:ascii="Times New Roman" w:hAnsi="Times New Roman"/>
                 <w:sz w:val="16"/>
               </w:rPr>
-              <w:t>20.11 / Port 5000</w:t>
+              <w:t>Express 5.2 / Node 22-alpine / Port 5000</w:t>
             </w:r>
           </w:p>
         </w:tc>
@@ -9435,7 +9450,14 @@
                 <w:rFonts w:ascii="Times New Roman" w:hAnsi="Times New Roman"/>
                 <w:sz w:val="16"/>
               </w:rPr>
-              <w:t>State Machine, AES-256-GCM, Argon2id, OCC</w:t>
+              <w:t xml:space="preserve">State Machine, </w:t>
+            </w:r>
+            <w:r>
+              <w:rPr>
+                <w:rFonts w:ascii="Times New Roman" w:hAnsi="Times New Roman"/>
+                <w:sz w:val="16"/>
+              </w:rPr>
+              <w:t>AES-256-GCM, Argon2id, OCC</w:t>
             </w:r>
           </w:p>
         </w:tc>
@@ -9524,7 +9546,7 @@
                 <w:rFonts w:ascii="Times New Roman" w:hAnsi="Times New Roman"/>
                 <w:sz w:val="16"/>
               </w:rPr>
-              <w:t>0.109 / Port 8000</w:t>
+              <w:t>Python 3.11-slim / Port 8000</w:t>
             </w:r>
           </w:p>
         </w:tc>
@@ -9632,7 +9654,7 @@
                 <w:rFonts w:ascii="Times New Roman" w:hAnsi="Times New Roman"/>
                 <w:sz w:val="16"/>
               </w:rPr>
-              <w:t>0.2 / Port 8001</w:t>
+              <w:t>Python 3.11-slim / Port 8001</w:t>
             </w:r>
           </w:p>
         </w:tc>
@@ -9652,7 +9674,14 @@
                 <w:rFonts w:ascii="Times New Roman" w:hAnsi="Times New Roman"/>
                 <w:sz w:val="16"/>
               </w:rPr>
-              <w:t>Gemini Cascade, 10s/20s Caps, Fallback Templates</w:t>
+              <w:t xml:space="preserve">Gemini </w:t>
+            </w:r>
+            <w:r>
+              <w:rPr>
+                <w:rFonts w:ascii="Times New Roman" w:hAnsi="Times New Roman"/>
+                <w:sz w:val="16"/>
+              </w:rPr>
+              <w:t>Cascade, 10s/20s Caps, Fallback Templates</w:t>
             </w:r>
           </w:p>
         </w:tc>
@@ -9720,14 +9749,7 @@
                 <w:rFonts w:ascii="Times New Roman" w:hAnsi="Times New Roman"/>
                 <w:sz w:val="16"/>
               </w:rPr>
-              <w:t xml:space="preserve">MongoDB </w:t>
-            </w:r>
-            <w:r>
-              <w:rPr>
-                <w:rFonts w:ascii="Times New Roman" w:hAnsi="Times New Roman"/>
-                <w:sz w:val="16"/>
-              </w:rPr>
-              <w:t>Community</w:t>
+              <w:t>MongoDB Community</w:t>
             </w:r>
           </w:p>
         </w:tc>
@@ -9820,7 +9842,15 @@
           <w:b/>
           <w:color w:val="212121"/>
         </w:rPr>
-        <w:t>3.2.1 Bernoulli Naive Bayes Mathematical Formulation</w:t>
+        <w:t xml:space="preserve">3.2.1 Bernoulli Naive </w:t>
+      </w:r>
+      <w:r>
+        <w:rPr>
+          <w:rFonts w:ascii="Times New Roman" w:hAnsi="Times New Roman"/>
+          <w:b/>
+          <w:color w:val="212121"/>
+        </w:rPr>
+        <w:t>Bayes Mathematical Formulation</w:t>
       </w:r>
     </w:p>
     <w:p>
@@ -9833,21 +9863,14 @@
           <w:rFonts w:ascii="Times New Roman" w:hAnsi="Times New Roman"/>
           <w:color w:val="212121"/>
         </w:rPr>
-        <w:t xml:space="preserve">The classification engine of ArogyaMitra utilizes a </w:t>
+        <w:t>The classification engine of ArogyaMitra utilizes a multivariate Bernoulli Naive Bayes model. Let C = {c_1, c_2, ..., c_K} denote the set of K = 41 target disease classes, and let x = (x_1, x_2, ..., x_D)^T in {0, 1}^D repres</w:t>
       </w:r>
       <w:r>
         <w:rPr>
           <w:rFonts w:ascii="Times New Roman" w:hAnsi="Times New Roman"/>
           <w:color w:val="212121"/>
         </w:rPr>
-        <w:t>multivariate Bernoulli Naive Bayes model. Let C = {c_1, c_2, ..., c_K} denote the set of K = 41 target disease classes, and let x = (x_1, x_2, ..., x_D)^T in {0, 1}^D represent a binary symptom vector of dimension D = 131, where x_j = 1 indicates the repor</w:t>
-      </w:r>
-      <w:r>
-        <w:rPr>
-          <w:rFonts w:ascii="Times New Roman" w:hAnsi="Times New Roman"/>
-          <w:color w:val="212121"/>
-        </w:rPr>
-        <w:t>ted presence of symptom j, and x_j = 0 indicates its reported absence.</w:t>
+        <w:t>ent a binary symptom vector of dimension D = 131, where x_j = 1 indicates the reported presence of symptom j, and x_j = 0 indicates its reported absence.</w:t>
       </w:r>
     </w:p>
     <w:p>
@@ -9860,7 +9883,14 @@
           <w:rFonts w:ascii="Times New Roman" w:hAnsi="Times New Roman"/>
           <w:color w:val="212121"/>
         </w:rPr>
-        <w:t>Under the conditional independence assumption, the joint likelihood of observing symptom vector x given disease class c is expressed as:</w:t>
+        <w:t>Under the conditional independence assumption, the joint likelihood of observing symptom vector x give</w:t>
+      </w:r>
+      <w:r>
+        <w:rPr>
+          <w:rFonts w:ascii="Times New Roman" w:hAnsi="Times New Roman"/>
+          <w:color w:val="212121"/>
+        </w:rPr>
+        <w:t>n disease class c is expressed as:</w:t>
       </w:r>
     </w:p>
     <w:tbl>
@@ -9908,7 +9938,7 @@
                 <w:color w:val="212121"/>
                 <w:sz w:val="19"/>
               </w:rPr>
-              <w:t>P(x | Y = c) = Product_</w:t>
+              <w:t>P(x | Y = c) = Product_{j=1}^{D} P(X_j = x_j | Y = c) = Product_{j=1}^{D} theta_{c, j}^{x_j} * (1 - theta_{c, j})^{1 - x_j}</w:t>
             </w:r>
             <w:r>
               <w:rPr>
@@ -9917,7 +9947,7 @@
                 <w:color w:val="212121"/>
                 <w:sz w:val="19"/>
               </w:rPr>
-              <w:t>{j=1}^{D} P(X_j = x_j | Y = c) = Product_{j=1}^{D} theta_{c, j}^{x_j} * (1 - theta_{c, j})^{1 - x_j}</w:t>
+              <w:br/>
             </w:r>
             <w:r>
               <w:rPr>
@@ -9927,6 +9957,7 @@
                 <w:sz w:val="19"/>
               </w:rPr>
               <w:br/>
+              <w:t>where theta_{c, j} = P(X_j = 1 | Y = c) represents the parameter probab</w:t>
             </w:r>
             <w:r>
               <w:rPr>
@@ -9935,8 +9966,7 @@
                 <w:color w:val="212121"/>
                 <w:sz w:val="19"/>
               </w:rPr>
-              <w:br/>
-              <w:t>where theta_{c, j} = P(X_j = 1 | Y = c) represents the parameter probability that symptom j is present given disease c.</w:t>
+              <w:t>ility that symptom j is present given disease c.</w:t>
             </w:r>
           </w:p>
         </w:tc>
@@ -9957,14 +9987,14 @@
           <w:rFonts w:ascii="Times New Roman" w:hAnsi="Times New Roman"/>
           <w:color w:val="212121"/>
         </w:rPr>
-        <w:t xml:space="preserve">To prevent zero-frequency </w:t>
+        <w:t xml:space="preserve">To prevent zero-frequency probability estimation when a symptom was not observed during training for a particular disease, Laplace smoothing (additive smoothing with parameter alpha = 1.0) is applied </w:t>
       </w:r>
       <w:r>
         <w:rPr>
           <w:rFonts w:ascii="Times New Roman" w:hAnsi="Times New Roman"/>
           <w:color w:val="212121"/>
         </w:rPr>
-        <w:t>probability estimation when a symptom was not observed during training for a particular disease, Laplace smoothing (additive smoothing with parameter alpha = 1.0) is applied during parameter estimation:</w:t>
+        <w:t>during parameter estimation:</w:t>
       </w:r>
     </w:p>
     <w:tbl>
@@ -10012,7 +10042,7 @@
                 <w:color w:val="212121"/>
                 <w:sz w:val="19"/>
               </w:rPr>
-              <w:t>theta_hat_{c, j} = (N_{c, j} + al</w:t>
+              <w:t>theta_hat_{c, j} = (N_{c, j} + alpha) / (N_c + 2*alpha)</w:t>
             </w:r>
             <w:r>
               <w:rPr>
@@ -10021,7 +10051,7 @@
                 <w:color w:val="212121"/>
                 <w:sz w:val="19"/>
               </w:rPr>
-              <w:t>pha) / (N_c + 2*alpha)</w:t>
+              <w:br/>
             </w:r>
             <w:r>
               <w:rPr>
@@ -10031,15 +10061,6 @@
                 <w:sz w:val="19"/>
               </w:rPr>
               <w:br/>
-            </w:r>
-            <w:r>
-              <w:rPr>
-                <w:rFonts w:ascii="Times New Roman" w:hAnsi="Times New Roman"/>
-                <w:i/>
-                <w:color w:val="212121"/>
-                <w:sz w:val="19"/>
-              </w:rPr>
-              <w:br/>
               <w:t>where N_{c, j} is the count of training samples in class c presenting symptom j, and N_c is the total sample count in class c.</w:t>
             </w:r>
           </w:p>
@@ -10061,14 +10082,14 @@
           <w:rFonts w:ascii="Times New Roman" w:hAnsi="Times New Roman"/>
           <w:color w:val="212121"/>
         </w:rPr>
-        <w:t>Applying Bayes' Theorem, the posterior class score is computed in log-space to ensure numerical stabili</w:t>
+        <w:t>Applying Bayes' Theor</w:t>
       </w:r>
       <w:r>
         <w:rPr>
           <w:rFonts w:ascii="Times New Roman" w:hAnsi="Times New Roman"/>
           <w:color w:val="212121"/>
         </w:rPr>
-        <w:t>ty and prevent floating-point underflow:</w:t>
+        <w:t>em, the posterior class score is computed in log-space to ensure numerical stability and prevent floating-point underflow:</w:t>
       </w:r>
     </w:p>
     <w:tbl>
@@ -10126,7 +10147,16 @@
                 <w:sz w:val="19"/>
               </w:rPr>
               <w:lastRenderedPageBreak/>
-              <w:t>- theta_hat_{c, j}) ] - ln P(x)</w:t>
+              <w:t>- theta_hat</w:t>
+            </w:r>
+            <w:r>
+              <w:rPr>
+                <w:rFonts w:ascii="Times New Roman" w:hAnsi="Times New Roman"/>
+                <w:i/>
+                <w:color w:val="212121"/>
+                <w:sz w:val="19"/>
+              </w:rPr>
+              <w:t>_{c, j}) ] - ln P(x)</w:t>
             </w:r>
           </w:p>
         </w:tc>
@@ -10147,14 +10177,14 @@
           <w:rFonts w:ascii="Times New Roman" w:hAnsi="Times New Roman"/>
           <w:color w:val="212121"/>
         </w:rPr>
-        <w:t>The predicted condition y_hat is selected via maximum a pos</w:t>
+        <w:t>The predicted condition y_hat is selected via maximum a posteriori (MAP) estimation across all 41 classes: y_hat = argmax_{c in C} ln P(Y = c | x). To present relative differential scores to clinicians, the log-posteriors are normali</w:t>
       </w:r>
       <w:r>
         <w:rPr>
           <w:rFonts w:ascii="Times New Roman" w:hAnsi="Times New Roman"/>
           <w:color w:val="212121"/>
         </w:rPr>
-        <w:t>teriori (MAP) estimation across all 41 classes: y_hat = argmax_{c in C} ln P(Y = c | x). To present relative differential scores to clinicians, the log-posteriors are normalized via the Softmax function.</w:t>
+        <w:t>zed via the Softmax function.</w:t>
       </w:r>
     </w:p>
     <w:p>
@@ -10180,28 +10210,28 @@
           <w:rFonts w:ascii="Times New Roman" w:hAnsi="Times New Roman"/>
           <w:color w:val="212121"/>
         </w:rPr>
-        <w:t>The</w:t>
+        <w:t>The feature vocabulary consists of 131 discrete clinical symptoms curated to reflect primary healthcare presentations in rural India. When a health worker selects symptoms in th</w:t>
       </w:r>
       <w:r>
         <w:rPr>
           <w:rFonts w:ascii="Times New Roman" w:hAnsi="Times New Roman"/>
           <w:color w:val="212121"/>
         </w:rPr>
-        <w:t xml:space="preserve"> feature vocabulary consists of 131 discrete clinical symptoms curated to reflect primary healthcare presentations in rural India. When a health worker selects symptoms in the user interface, the frontend sends a JSON payload containing symptom string iden</w:t>
+        <w:t>e user interface, the frontend sends a JSON payload containing symptom string identifiers. The ML microservice validates the incoming payload against a Pydantic schema, verifies that all submitted identifiers exist within the master vocabulary, and constru</w:t>
       </w:r>
       <w:r>
         <w:rPr>
           <w:rFonts w:ascii="Times New Roman" w:hAnsi="Times New Roman"/>
           <w:color w:val="212121"/>
         </w:rPr>
-        <w:t>tifiers. The ML microservice validates the incoming payload against a Pydantic schema, verifies that all submitted identifiers exist within the master vocabulary, and constructs a 131-dimensional binary NumPy array. Unselected features are deterministicall</w:t>
+        <w:t xml:space="preserve">cts a 131-dimensional binary NumPy array. Unselected features are deterministically zero-padded. Crucially, the model evaluates both the presence (x_j = 1) and absence (x_j = 0) of symptoms, allowing the model to penalize disease hypotheses whose hallmark </w:t>
       </w:r>
       <w:r>
         <w:rPr>
           <w:rFonts w:ascii="Times New Roman" w:hAnsi="Times New Roman"/>
           <w:color w:val="212121"/>
         </w:rPr>
-        <w:t>y zero-padded. Crucially, the model evaluates both the presence (x_j = 1) and absence (x_j = 0) of symptoms, allowing the model to penalize disease hypotheses whose hallmark signs are explicitly denied by the patient.</w:t>
+        <w:t>signs are explicitly denied by the patient.</w:t>
       </w:r>
     </w:p>
     <w:p>
@@ -10214,15 +10244,7 @@
           <w:b/>
           <w:color w:val="212121"/>
         </w:rPr>
-        <w:t>3.2.3 Explainability via Top-Feature A</w:t>
-      </w:r>
-      <w:r>
-        <w:rPr>
-          <w:rFonts w:ascii="Times New Roman" w:hAnsi="Times New Roman"/>
-          <w:b/>
-          <w:color w:val="212121"/>
-        </w:rPr>
-        <w:t>ttribution</w:t>
+        <w:t>3.2.3 Explainability via Top-Feature Attribution</w:t>
       </w:r>
     </w:p>
     <w:p>
@@ -10235,21 +10257,21 @@
           <w:rFonts w:ascii="Times New Roman" w:hAnsi="Times New Roman"/>
           <w:color w:val="212121"/>
         </w:rPr>
-        <w:t>A limitation of complex tree ensembles is their interpretability overhead. While post-hoc perturbation methods like LIME [5] are common, they introduce stochastic sampling variance and latency overhead. In contrast, ArogyaMitra derives closed-fo</w:t>
+        <w:t>A limitation of complex tree ensembles is their interpretability overhead. While post-hoc perturbation methods like LIME [10] or SHAP [5] are common, they introduc</w:t>
       </w:r>
       <w:r>
         <w:rPr>
           <w:rFonts w:ascii="Times New Roman" w:hAnsi="Times New Roman"/>
           <w:color w:val="212121"/>
         </w:rPr>
-        <w:t>rm additive log-odds feature attributions directly from the trained Bernoulli parameters. Let theta_bar_j = (1/K) * Sum_{k=1}^K theta_hat_{k, j} represent the background prevalence of symptom j across all disease classes. The individual evidence contributi</w:t>
+        <w:t>e stochastic sampling variance and latency overhead. In contrast, ArogyaMitra derives closed-form additive log-odds feature attributions directly from the trained Bernoulli parameters. Let theta_bar_j = (1/K) * Sum_{k=1}^K theta_hat_{k, j} represent the ba</w:t>
       </w:r>
       <w:r>
         <w:rPr>
           <w:rFonts w:ascii="Times New Roman" w:hAnsi="Times New Roman"/>
           <w:color w:val="212121"/>
         </w:rPr>
-        <w:t>on w_{c, j}(x_j) of feature j toward disease class c is formulated as:</w:t>
+        <w:t>ckground prevalence of symptom j across all disease classes. The individual evidence contribution w_{c, j}(x_j) of feature j toward disease class c is formulated as:</w:t>
       </w:r>
     </w:p>
     <w:tbl>
@@ -10297,7 +10319,16 @@
                 <w:color w:val="212121"/>
                 <w:sz w:val="19"/>
               </w:rPr>
-              <w:t>w_{c, j}(x_j) = x_j * ln( theta_hat_{c, j} / theta_bar_j ) + (1 - x_j) * ln( (1 - theta_hat_{c, j}) / (1 - theta_bar_j) )</w:t>
+              <w:t>w_{c, j}(x_j) = x_j * ln( theta_hat_{c, j} / theta_bar_j ) + (</w:t>
+            </w:r>
+            <w:r>
+              <w:rPr>
+                <w:rFonts w:ascii="Times New Roman" w:hAnsi="Times New Roman"/>
+                <w:i/>
+                <w:color w:val="212121"/>
+                <w:sz w:val="19"/>
+              </w:rPr>
+              <w:t>1 - x_j) * ln( (1 - theta_hat_{c, j}) / (1 - theta_bar_j) )</w:t>
             </w:r>
           </w:p>
         </w:tc>
@@ -10332,14 +10363,14 @@
           <w:rFonts w:ascii="Times New Roman" w:hAnsi="Times New Roman"/>
           <w:color w:val="212121"/>
         </w:rPr>
-        <w:t>1.</w:t>
+        <w:t xml:space="preserve">1. Positive Evidence: If symptom j is present (x_j = 1) and its class probability exceeds background prevalence (theta_hat_{c, j} &gt; theta_bar_j), w_{c, j} &gt; 0, </w:t>
       </w:r>
       <w:r>
         <w:rPr>
           <w:rFonts w:ascii="Times New Roman" w:hAnsi="Times New Roman"/>
           <w:color w:val="212121"/>
         </w:rPr>
-        <w:t xml:space="preserve"> Positive Evidence: If symptom j is present (x_j = 1) and its class probability exceeds background prevalence (theta_hat_{c, j} &gt; theta_bar_j), w_{c, j} &gt; 0, indicating that this symptom actively supports the diagnosis.</w:t>
+        <w:t>indicating that this symptom actively supports the diagnosis.</w:t>
       </w:r>
     </w:p>
     <w:p>
@@ -10352,14 +10383,14 @@
           <w:rFonts w:ascii="Times New Roman" w:hAnsi="Times New Roman"/>
           <w:color w:val="212121"/>
         </w:rPr>
-        <w:t xml:space="preserve">2. Negative Evidence: If symptom j </w:t>
+        <w:t xml:space="preserve">2. Negative Evidence: If symptom j is present but rare in class c (theta_hat_{c, j} &lt; theta_bar_j), or absent (x_j = 0) despite being a hallmark of class c (theta_hat_{c, j} &gt;&gt; theta_bar_j), </w:t>
       </w:r>
       <w:r>
         <w:rPr>
           <w:rFonts w:ascii="Times New Roman" w:hAnsi="Times New Roman"/>
           <w:color w:val="212121"/>
         </w:rPr>
-        <w:t>is present but rare in class c (theta_hat_{c, j} &lt; theta_bar_j), or absent (x_j = 0) despite being a hallmark of class c (theta_hat_{c, j} &gt;&gt; theta_bar_j), w_{c, j} &lt; 0, penalizing the hypothesis.</w:t>
+        <w:t>w_{c, j} &lt; 0, penalizing the hypothesis.</w:t>
       </w:r>
     </w:p>
     <w:p>
@@ -10372,14 +10403,14 @@
           <w:rFonts w:ascii="Times New Roman" w:hAnsi="Times New Roman"/>
           <w:color w:val="212121"/>
         </w:rPr>
-        <w:t>3. Machine-Precision Additivity: Summing w_{c, j} across al</w:t>
+        <w:t>3. Machine-Precision Additivity: Summing w_{c, j} across all D = 131 features equals the total log-evidence difference to machine precision (&lt; 1e-10 error), satisfying the efficiency axiom of additive feature attrib</w:t>
       </w:r>
       <w:r>
         <w:rPr>
           <w:rFonts w:ascii="Times New Roman" w:hAnsi="Times New Roman"/>
           <w:color w:val="212121"/>
         </w:rPr>
-        <w:t>l D = 131 features equals the total log-evidence difference to machine precision (&lt; 1e-10 error), satisfying the efficiency axiom of additive feature attributions without Monte Carlo sampling.</w:t>
+        <w:t>utions without Monte Carlo sampling.</w:t>
       </w:r>
     </w:p>
     <w:p>
@@ -10405,21 +10436,21 @@
           <w:rFonts w:ascii="Times New Roman" w:hAnsi="Times New Roman"/>
           <w:color w:val="212121"/>
         </w:rPr>
-        <w:t>In supervis</w:t>
+        <w:t>In supervised learning, a classifier is considered calibrated if its predicted probability reflects true empirical observation: P(Y = 1 | P_hat = p) = p. However, as e</w:t>
       </w:r>
       <w:r>
         <w:rPr>
           <w:rFonts w:ascii="Times New Roman" w:hAnsi="Times New Roman"/>
           <w:color w:val="212121"/>
         </w:rPr>
-        <w:t>ed learning, a classifier is considered calibrated if its predicted probability reflects true empirical observation: P(Y = 1 | P_hat = p) = p. However, as established by Niculescu-Mizil &amp; Caruana (2005) [2], Naive Bayes models violate this condition due to</w:t>
+        <w:t xml:space="preserve">stablished by Niculescu-Mizil &amp; Caruana (2005) [2], Naive Bayes models violate this condition due to the conditional independence assumption. Because correlated symptoms multiply likelihoods, the resulting log-odds scale grows with the number of redundant </w:t>
       </w:r>
       <w:r>
         <w:rPr>
           <w:rFonts w:ascii="Times New Roman" w:hAnsi="Times New Roman"/>
           <w:color w:val="212121"/>
         </w:rPr>
-        <w:t xml:space="preserve"> the conditional independence assumption. Because correlated symptoms multiply likelihoods, the resulting log-odds scale grows with the number of redundant features, pushing output probabilities toward 0.0 or 1.0.</w:t>
+        <w:t>features, pushing output probabilities toward 0.0 or 1.0.</w:t>
       </w:r>
     </w:p>
     <w:p>
@@ -10432,14 +10463,14 @@
           <w:rFonts w:ascii="Times New Roman" w:hAnsi="Times New Roman"/>
           <w:color w:val="212121"/>
         </w:rPr>
-        <w:t>During the development of ArogyaMitra, pos</w:t>
+        <w:t>During the development of ArogyaMitra, post-hoc calibration via Platt Scaling (logistic sigmoid fitting) was empirically tested on held-out folds of the 304 unique rows. The results showed that Plat</w:t>
       </w:r>
       <w:r>
         <w:rPr>
           <w:rFonts w:ascii="Times New Roman" w:hAnsi="Times New Roman"/>
           <w:color w:val="212121"/>
         </w:rPr>
-        <w:t xml:space="preserve">t-hoc calibration via Platt Scaling (logistic sigmoid fitting) was empirically tested on held-out folds of the 304 unique rows. The results showed that Platt scaling caused </w:t>
+        <w:t xml:space="preserve">t scaling caused </w:t>
       </w:r>
       <w:r>
         <w:rPr>
@@ -10447,14 +10478,7 @@
           <w:color w:val="212121"/>
         </w:rPr>
         <w:lastRenderedPageBreak/>
-        <w:t>multiclass cross-entropy log loss to deteriorate from 0.0061 to 0.1643 (docs/MODEL_</w:t>
-      </w:r>
-      <w:r>
-        <w:rPr>
-          <w:rFonts w:ascii="Times New Roman" w:hAnsi="Times New Roman"/>
-          <w:color w:val="212121"/>
-        </w:rPr>
-        <w:t>CARD.md:67). This occurred because the small sample size (~7.4 instances per class) caused the parametric sigmoid to distort well-separated likelihoods.</w:t>
+        <w:t>multiclass cross-entropy log loss to deteriorate from 0.0061 to 0.1643 (docs/MODEL_CARD.md:67). This occurred because the small sample size (~7.4 instances per class) caused the parametric sigmoid to distort well-separated likelihoods.</w:t>
       </w:r>
     </w:p>
     <w:tbl>
@@ -10493,7 +10517,16 @@
                 <w:color w:val="154360"/>
                 <w:sz w:val="19"/>
               </w:rPr>
-              <w:t xml:space="preserve">[Calibration Policy] </w:t>
+              <w:t>[Ca</w:t>
+            </w:r>
+            <w:r>
+              <w:rPr>
+                <w:rFonts w:ascii="Times New Roman" w:hAnsi="Times New Roman"/>
+                <w:b/>
+                <w:color w:val="154360"/>
+                <w:sz w:val="19"/>
+              </w:rPr>
+              <w:t xml:space="preserve">libration Policy] </w:t>
             </w:r>
             <w:r>
               <w:rPr>
@@ -10502,7 +10535,7 @@
                 <w:color w:val="212121"/>
                 <w:sz w:val="19"/>
               </w:rPr>
-              <w:t>Design Decision on Calibration: Following empirical verification, post-hoc calibra</w:t>
+              <w:t>Design Decision on Calibration: Following empirical verification, post-hoc calibration was omitted. Model outputs are explicitly labeled in the user interface and API as 'uncalibrated posterior estimates from Bernoulli Naive Bayes', preve</w:t>
             </w:r>
             <w:r>
               <w:rPr>
@@ -10511,7 +10544,7 @@
                 <w:color w:val="212121"/>
                 <w:sz w:val="19"/>
               </w:rPr>
-              <w:t>tion was omitted. Model outputs are explicitly labeled in the user interface and API as 'uncalibrated posterior estimates from Bernoulli Naive Bayes', preventing false assumptions of statistical probability.</w:t>
+              <w:t>nting false assumptions of statistical probability.</w:t>
             </w:r>
           </w:p>
         </w:tc>
@@ -10545,21 +10578,14 @@
           <w:rFonts w:ascii="Times New Roman" w:hAnsi="Times New Roman"/>
           <w:color w:val="212121"/>
         </w:rPr>
-        <w:t xml:space="preserve">To evaluate </w:t>
+        <w:t>To evaluate model selection, I conducted a comparative evaluation against Tuned LightGBM [4] and Tuned XGBoost using nested cross-validation on the 304 unique rows. Whi</w:t>
       </w:r>
       <w:r>
         <w:rPr>
           <w:rFonts w:ascii="Times New Roman" w:hAnsi="Times New Roman"/>
           <w:color w:val="212121"/>
         </w:rPr>
-        <w:t>model selection, I conducted a comparative evaluation against Tuned LightGBM [4] and Tuned XGBoost using nested cross-validation on the 304 unique rows. While decision trees perform well on dense tabular data, their recursive splitting mechanism experience</w:t>
-      </w:r>
-      <w:r>
-        <w:rPr>
-          <w:rFonts w:ascii="Times New Roman" w:hAnsi="Times New Roman"/>
-          <w:color w:val="212121"/>
-        </w:rPr>
-        <w:t>s degradation on high-dimensional, sparse binary vectors under missing data.</w:t>
+        <w:t>le decision trees perform well on dense tabular data, their recursive splitting mechanism experiences degradation on high-dimensional, sparse binary vectors under missing data.</w:t>
       </w:r>
     </w:p>
     <w:p>
@@ -10572,21 +10598,21 @@
           <w:rFonts w:ascii="Times New Roman" w:hAnsi="Times New Roman"/>
           <w:color w:val="212121"/>
         </w:rPr>
-        <w:t>As detailed in Chapter 4, when symptoms are progressively dropped (simulating incomplete patient recall), tree ensembles experience accuracy drops (LightGBM dropping from 0.989 to</w:t>
+        <w:t>As detailed in Chapter 4, when symptoms are progressively dropped (simulating i</w:t>
       </w:r>
       <w:r>
         <w:rPr>
           <w:rFonts w:ascii="Times New Roman" w:hAnsi="Times New Roman"/>
           <w:color w:val="212121"/>
         </w:rPr>
-        <w:t xml:space="preserve"> 0.683 at 50% dropout). In contrast, Bernoulli Naive Bayes maintains 0.919 accuracy at 50% dropout due to its linear log-odds accumulation. Combined with an inference execution time of 1.8 ms in internal container benchmarks, BernoulliNB was chosen for dep</w:t>
+        <w:t>ncomplete patient recall), tree ensembles experience accuracy drops (LightGBM dropping from 0.989 to 0.683 at 50% dropout). In contrast, Bernoulli Naive Bayes maintains 0.919 accuracy at 50% dropout due to its linear log-odds accumulation. Combined with an</w:t>
       </w:r>
       <w:r>
         <w:rPr>
           <w:rFonts w:ascii="Times New Roman" w:hAnsi="Times New Roman"/>
           <w:color w:val="212121"/>
         </w:rPr>
-        <w:t>loyment.</w:t>
+        <w:t xml:space="preserve"> inference execution time of 1.8 ms in internal container benchmarks, BernoulliNB was chosen for deployment.</w:t>
       </w:r>
     </w:p>
     <w:p>
@@ -10613,14 +10639,14 @@
           <w:rFonts w:ascii="Times New Roman" w:hAnsi="Times New Roman"/>
           <w:color w:val="212121"/>
         </w:rPr>
-        <w:t>The primary clinical safety mechanism in ArogyaMitra is the deterministic Red-Flag Screening Layer. As highlighted by Wallace et al. [1], symptom checkers can produce clinical hazards when statistic</w:t>
+        <w:t>The primary clinical safety mechanism in ArogyaMitra is the deterministic Red-Flag Screening Layer</w:t>
       </w:r>
       <w:r>
         <w:rPr>
           <w:rFonts w:ascii="Times New Roman" w:hAnsi="Times New Roman"/>
           <w:color w:val="212121"/>
         </w:rPr>
-        <w:t>al models misclassify acute surgical and cardiac emergencies.</w:t>
+        <w:t>. As highlighted by Wallace et al. [1], symptom checkers can produce clinical hazards when statistical models misclassify acute surgical and cardiac emergencies.</w:t>
       </w:r>
     </w:p>
     <w:p>
@@ -10633,21 +10659,21 @@
           <w:rFonts w:ascii="Times New Roman" w:hAnsi="Times New Roman"/>
           <w:color w:val="212121"/>
         </w:rPr>
-        <w:t>To mitigate this risk, ArogyaMitra decouples emergency detection from machine learning. Prior to executing Bayesian inference, incoming symptom vectors are evaluated against deterministic medica</w:t>
+        <w:t xml:space="preserve">To mitigate this risk, ArogyaMitra decouples emergency detection from machine learning. Prior </w:t>
       </w:r>
       <w:r>
         <w:rPr>
           <w:rFonts w:ascii="Times New Roman" w:hAnsi="Times New Roman"/>
           <w:color w:val="212121"/>
         </w:rPr>
-        <w:t>l rules defined in config/red_flags.yaml. If any emergency symptom is detected, the system immediately sets triage urgency to EMERGENCY, locks the recommendation, and displays warning banners instructing the health worker to arrange emergency transport. Ta</w:t>
+        <w:t>to executing Bayesian inference, incoming symptom vectors are evaluated against deterministic medical rules defined in config/red_flags.yaml. If any emergency symptom is detected, the system immediately sets triage urgency to EMERGENCY, locks the recommend</w:t>
       </w:r>
       <w:r>
         <w:rPr>
           <w:rFonts w:ascii="Times New Roman" w:hAnsi="Times New Roman"/>
           <w:color w:val="212121"/>
         </w:rPr>
-        <w:t>ble 3.1 details the 7 red-flag trigger symptoms implemented in the active configuration.</w:t>
+        <w:t>ation, and displays warning banners instructing the health worker to arrange emergency transport. Table 3.1 details the 7 red-flag trigger symptoms implemented in the active configuration.</w:t>
       </w:r>
     </w:p>
     <w:p>
@@ -10661,7 +10687,16 @@
           <w:color w:val="154360"/>
           <w:sz w:val="19"/>
         </w:rPr>
-        <w:t>Table 3.1: Emergency Red-Flag Trigger Symptoms (config/red_flags.yaml)</w:t>
+        <w:t>Table 3.1: Emergency Red-Flag Trigger Symptoms (config/red_flags.ya</w:t>
+      </w:r>
+      <w:r>
+        <w:rPr>
+          <w:rFonts w:ascii="Times New Roman" w:hAnsi="Times New Roman"/>
+          <w:b/>
+          <w:color w:val="154360"/>
+          <w:sz w:val="19"/>
+        </w:rPr>
+        <w:t>ml)</w:t>
       </w:r>
     </w:p>
     <w:tbl>
@@ -10900,14 +10935,7 @@
                 <w:rFonts w:ascii="Times New Roman" w:hAnsi="Times New Roman"/>
                 <w:sz w:val="15"/>
               </w:rPr>
-              <w:t>Potential</w:t>
-            </w:r>
-            <w:r>
-              <w:rPr>
-                <w:rFonts w:ascii="Times New Roman" w:hAnsi="Times New Roman"/>
-                <w:sz w:val="15"/>
-              </w:rPr>
-              <w:t xml:space="preserve"> acute coronary syndrome, myocardial infarction, pulmonary embolism, or aortic dissection.</w:t>
+              <w:t>Potential acute coronary syndrome, myocardial infarction, pulmonary embolism, or aortic dissection.</w:t>
             </w:r>
           </w:p>
         </w:tc>
@@ -11019,14 +11047,7 @@
                 <w:rFonts w:ascii="Times New Roman" w:hAnsi="Times New Roman"/>
                 <w:sz w:val="15"/>
               </w:rPr>
-              <w:t xml:space="preserve">Severe depression of consciousness indicating acute neurological crisis or severe metabolic </w:t>
-            </w:r>
-            <w:r>
-              <w:rPr>
-                <w:rFonts w:ascii="Times New Roman" w:hAnsi="Times New Roman"/>
-                <w:sz w:val="15"/>
-              </w:rPr>
-              <w:t>failure.</w:t>
+              <w:t>Severe depression of consciousness indicating acute neurological crisis or severe metabolic failure.</w:t>
             </w:r>
           </w:p>
         </w:tc>
@@ -11135,7 +11156,14 @@
                 <w:rFonts w:ascii="Times New Roman" w:hAnsi="Times New Roman"/>
                 <w:sz w:val="15"/>
               </w:rPr>
-              <w:t>Respiratory distress suggesting acute pulmonary edema, severe bronchospasm, pneumonia, or cardiac decompensation.</w:t>
+              <w:t xml:space="preserve">Respiratory distress suggesting acute pulmonary edema, severe </w:t>
+            </w:r>
+            <w:r>
+              <w:rPr>
+                <w:rFonts w:ascii="Times New Roman" w:hAnsi="Times New Roman"/>
+                <w:sz w:val="15"/>
+              </w:rPr>
+              <w:t>bronchospasm, pneumonia, or cardiac decompensation.</w:t>
             </w:r>
           </w:p>
         </w:tc>
@@ -11277,7 +11305,14 @@
                 <w:sz w:val="15"/>
               </w:rPr>
               <w:lastRenderedPageBreak/>
-              <w:t>Urgent respiratory evaluation and infectious isolation.</w:t>
+              <w:t xml:space="preserve">Urgent respiratory evaluation and infectious </w:t>
+            </w:r>
+            <w:r>
+              <w:rPr>
+                <w:rFonts w:ascii="Times New Roman" w:hAnsi="Times New Roman"/>
+                <w:sz w:val="15"/>
+              </w:rPr>
+              <w:t>isolation.</w:t>
             </w:r>
           </w:p>
         </w:tc>
@@ -11366,14 +11401,7 @@
                 <w:rFonts w:ascii="Times New Roman" w:hAnsi="Times New Roman"/>
                 <w:sz w:val="15"/>
               </w:rPr>
-              <w:t xml:space="preserve">Hematochezia / melena suggesting acute lower or upper </w:t>
-            </w:r>
-            <w:r>
-              <w:rPr>
-                <w:rFonts w:ascii="Times New Roman" w:hAnsi="Times New Roman"/>
-                <w:sz w:val="15"/>
-              </w:rPr>
-              <w:t>gastrointestinal hemorrhage.</w:t>
+              <w:t>Hematochezia / melena suggesting acute lower or upper gastrointestinal hemorrhage.</w:t>
             </w:r>
           </w:p>
         </w:tc>
@@ -11485,7 +11513,14 @@
                 <w:rFonts w:ascii="Times New Roman" w:hAnsi="Times New Roman"/>
                 <w:sz w:val="15"/>
               </w:rPr>
-              <w:t>Acute ataxia or cerebellar sign indicating potential ischemic stroke or intracranial hemorrhage.</w:t>
+              <w:t xml:space="preserve">Acute ataxia or cerebellar sign indicating potential ischemic </w:t>
+            </w:r>
+            <w:r>
+              <w:rPr>
+                <w:rFonts w:ascii="Times New Roman" w:hAnsi="Times New Roman"/>
+                <w:sz w:val="15"/>
+              </w:rPr>
+              <w:t>stroke or intracranial hemorrhage.</w:t>
             </w:r>
           </w:p>
         </w:tc>
@@ -11506,14 +11541,7 @@
                 <w:rFonts w:ascii="Times New Roman" w:hAnsi="Times New Roman"/>
                 <w:sz w:val="15"/>
               </w:rPr>
-              <w:t xml:space="preserve">Urgent stroke protocol evaluation within therapeutic </w:t>
-            </w:r>
-            <w:r>
-              <w:rPr>
-                <w:rFonts w:ascii="Times New Roman" w:hAnsi="Times New Roman"/>
-                <w:sz w:val="15"/>
-              </w:rPr>
-              <w:t>window.</w:t>
+              <w:t>Urgent stroke protocol evaluation within therapeutic window.</w:t>
             </w:r>
           </w:p>
         </w:tc>
@@ -11670,7 +11698,7 @@
                 <w:color w:val="212121"/>
                 <w:sz w:val="19"/>
               </w:rPr>
-              <w:t xml:space="preserve">Status Disclosure: The red-flag rules specified in Table 3.1 </w:t>
+              <w:t>Status Disclosure: The red-flag rules specified in Table 3.1 represent DRAFT clinical heuristics documented in docs/RED_FLAG_REVIEW.md. They have not been validated by an institutional medical board. In live clinical deployment, t</w:t>
             </w:r>
             <w:r>
               <w:rPr>
@@ -11679,7 +11707,7 @@
                 <w:color w:val="212121"/>
                 <w:sz w:val="19"/>
               </w:rPr>
-              <w:t>represent DRAFT clinical heuristics documented in docs/RED_FLAG_REVIEW.md. They have not been validated by an institutional medical board. In live clinical deployment, these rules require formal multi-specialty clinician review.</w:t>
+              <w:t>hese rules require formal multi-specialty clinician review.</w:t>
             </w:r>
           </w:p>
         </w:tc>
@@ -11701,16 +11729,7 @@
           <w:color w:val="154360"/>
           <w:sz w:val="24"/>
         </w:rPr>
-        <w:t>3.4 Multi-Tier LLM Explan</w:t>
-      </w:r>
-      <w:r>
-        <w:rPr>
-          <w:rFonts w:ascii="Times New Roman" w:hAnsi="Times New Roman"/>
-          <w:b/>
-          <w:color w:val="154360"/>
-          <w:sz w:val="24"/>
-        </w:rPr>
-        <w:t>ation &amp; Resilient Fallback Layer</w:t>
+        <w:t>3.4 Multi-Tier LLM Explanation &amp; Resilient Fallback Layer</w:t>
       </w:r>
     </w:p>
     <w:p>
@@ -11723,14 +11742,14 @@
           <w:rFonts w:ascii="Times New Roman" w:hAnsi="Times New Roman"/>
           <w:color w:val="212121"/>
         </w:rPr>
-        <w:t>While the Bayesian model produces statistical differential scores, numerical percentages are insufficient for community health workers who need understandable summaries. To provide structured summaries, ArogyaMitra integrat</w:t>
+        <w:t>While the Bayesian model produces statistical differential scores, numerical percentages are insufficient for community health workers w</w:t>
       </w:r>
       <w:r>
         <w:rPr>
           <w:rFonts w:ascii="Times New Roman" w:hAnsi="Times New Roman"/>
           <w:color w:val="212121"/>
         </w:rPr>
-        <w:t>es a Large Language Model narrative layer implemented using LangGraph and the Google Gemini API (with temperature=0.2).</w:t>
+        <w:t>ho need understandable summaries. To provide structured summaries, ArogyaMitra integrates a Large Language Model narrative layer implemented using LangGraph and the Google Gemini API (with temperature=0.2).</w:t>
       </w:r>
     </w:p>
     <w:p>
@@ -11743,7 +11762,14 @@
           <w:rFonts w:ascii="Times New Roman" w:hAnsi="Times New Roman"/>
           <w:color w:val="212121"/>
         </w:rPr>
-        <w:t>To mitigate hallucination risks [6], the LLM is constrained by four engineering controls:</w:t>
+        <w:t xml:space="preserve">To mitigate hallucination risks [6], the LLM is </w:t>
+      </w:r>
+      <w:r>
+        <w:rPr>
+          <w:rFonts w:ascii="Times New Roman" w:hAnsi="Times New Roman"/>
+          <w:color w:val="212121"/>
+        </w:rPr>
+        <w:t>constrained by four engineering controls:</w:t>
       </w:r>
     </w:p>
     <w:p>
@@ -11756,14 +11782,14 @@
           <w:rFonts w:ascii="Times New Roman" w:hAnsi="Times New Roman"/>
           <w:color w:val="212121"/>
         </w:rPr>
-        <w:t xml:space="preserve">1. Zero Diagnostic Authority: The disease </w:t>
+        <w:t>1. Zero Diagnostic Authority: The disease name, differential ranking, and top contributing symptoms are pre-computed by the ML engine and passed as immutable context. The LLM is instructed solely to synthesize an e</w:t>
       </w:r>
       <w:r>
         <w:rPr>
           <w:rFonts w:ascii="Times New Roman" w:hAnsi="Times New Roman"/>
           <w:color w:val="212121"/>
         </w:rPr>
-        <w:t>name, differential ranking, and top contributing symptoms are pre-computed by the ML engine and passed as immutable context. The LLM is instructed solely to synthesize an explanation in clear language.</w:t>
+        <w:t>xplanation in clear language.</w:t>
       </w:r>
     </w:p>
     <w:p>
@@ -11776,14 +11802,7 @@
           <w:rFonts w:ascii="Times New Roman" w:hAnsi="Times New Roman"/>
           <w:color w:val="212121"/>
         </w:rPr>
-        <w:t>2. PII Scrubbing: The sanitize_clinical_input function</w:t>
-      </w:r>
-      <w:r>
-        <w:rPr>
-          <w:rFonts w:ascii="Times New Roman" w:hAnsi="Times New Roman"/>
-          <w:color w:val="212121"/>
-        </w:rPr>
-        <w:t xml:space="preserve"> in graph/llm.py sanitizes input notes, redacting phone numbers and emails before payload construction.</w:t>
+        <w:t>2. PII Scrubbing: The sanitize_clinical_input function in graph/llm.py sanitizes input notes, redacting phone numbers and emails before payload construction.</w:t>
       </w:r>
     </w:p>
     <w:p>
@@ -11796,14 +11815,14 @@
           <w:rFonts w:ascii="Times New Roman" w:hAnsi="Times New Roman"/>
           <w:color w:val="212121"/>
         </w:rPr>
-        <w:t xml:space="preserve">3. Ordered Model Cascade: To handle transient 429 quota exhaustion and model deprecations, the system maintains an ordered cascade: LLM_MODELS = </w:t>
+        <w:t xml:space="preserve">3. Ordered Model Cascade: To handle transient 429 quota exhaustion </w:t>
       </w:r>
       <w:r>
         <w:rPr>
           <w:rFonts w:ascii="Times New Roman" w:hAnsi="Times New Roman"/>
           <w:color w:val="212121"/>
         </w:rPr>
-        <w:t>['gemini-2.5-flash', 'gemini-3.5-flash', 'gemini-3-flash-preview'].</w:t>
+        <w:t>and model deprecations, the system maintains an ordered cascade: LLM_MODELS = ['gemini-2.5-flash', 'gemini-3.5-flash', 'gemini-3-flash-preview'].</w:t>
       </w:r>
     </w:p>
     <w:p>
@@ -11816,14 +11835,14 @@
           <w:rFonts w:ascii="Times New Roman" w:hAnsi="Times New Roman"/>
           <w:color w:val="212121"/>
         </w:rPr>
-        <w:t>4. Whole-Phrase Confidence Word Filtering: Generated text is evaluated against banned confidence phrases ('certain diagnosis', 'very high probability'). If detected, the system triggers on</w:t>
+        <w:t>4. Whole-Phrase Confidence Word Filtering: Generated text is evaluated against banned confidence phrases ('cer</w:t>
       </w:r>
       <w:r>
         <w:rPr>
           <w:rFonts w:ascii="Times New Roman" w:hAnsi="Times New Roman"/>
           <w:color w:val="212121"/>
         </w:rPr>
-        <w:t>e regeneration attempt. If the second attempt fails, it falls back to a deterministic, pre-compiled clinical template.</w:t>
+        <w:t>tain diagnosis', 'very high probability'). If detected, the system triggers one regeneration attempt. If the second attempt fails, it falls back to a deterministic, pre-compiled clinical template.</w:t>
       </w:r>
     </w:p>
     <w:p>
@@ -11886,7 +11905,16 @@
           <w:sz w:val="19"/>
         </w:rPr>
         <w:lastRenderedPageBreak/>
-        <w:t>Figure 3.3: Hierarchical Request Timeout Budgets and Guardrail Cascade</w:t>
+        <w:t>Figure 3.3: Hierarchical Request Timeout Budgets and Guar</w:t>
+      </w:r>
+      <w:r>
+        <w:rPr>
+          <w:rFonts w:ascii="Times New Roman" w:hAnsi="Times New Roman"/>
+          <w:b/>
+          <w:color w:val="546E7A"/>
+          <w:sz w:val="19"/>
+        </w:rPr>
+        <w:t>drail Cascade</w:t>
       </w:r>
     </w:p>
     <w:p>
@@ -11899,21 +11927,14 @@
           <w:rFonts w:ascii="Times New Roman" w:hAnsi="Times New Roman"/>
           <w:color w:val="212121"/>
         </w:rPr>
-        <w:t>As shown in Figure 3.3, request timeouts follow a descending hie</w:t>
+        <w:t>As shown in Figure 3.3, request timeouts follow a descending hierarchy: Nginx reverse proxy (90s) &gt; Backend HTTP client (30s) &gt; LangGraph narrative hard cap (20s) &gt;= Gemini per-attempt timeout (10s). If the 20s overall cap expires, the system</w:t>
       </w:r>
       <w:r>
         <w:rPr>
           <w:rFonts w:ascii="Times New Roman" w:hAnsi="Times New Roman"/>
           <w:color w:val="212121"/>
         </w:rPr>
-        <w:t>rarchy: Nginx reverse proxy (90s) &gt; Backend HTTP client (30s) &gt; LangGraph narrative hard cap (20s) &gt;= Gemini per-attempt timeout (10s). If the 20s overall cap expires, the system deterministically serves a local pre-compiled template, bounding total respon</w:t>
-      </w:r>
-      <w:r>
-        <w:rPr>
-          <w:rFonts w:ascii="Times New Roman" w:hAnsi="Times New Roman"/>
-          <w:color w:val="212121"/>
-        </w:rPr>
-        <w:t>se latency.</w:t>
+        <w:t xml:space="preserve"> deterministically serves a local pre-compiled template, bounding total response latency.</w:t>
       </w:r>
     </w:p>
     <w:p>
@@ -11940,7 +11961,14 @@
           <w:rFonts w:ascii="Times New Roman" w:hAnsi="Times New Roman"/>
           <w:color w:val="212121"/>
         </w:rPr>
-        <w:t>The clinical consultation lifecycle is structured as a state machine guiding frontline workers while enforcing oversight gates.</w:t>
+        <w:t>The clinical consultation lifecycle is structured as a state machine guiding frontline workers while enforcing oversight</w:t>
+      </w:r>
+      <w:r>
+        <w:rPr>
+          <w:rFonts w:ascii="Times New Roman" w:hAnsi="Times New Roman"/>
+          <w:color w:val="212121"/>
+        </w:rPr>
+        <w:t xml:space="preserve"> gates.</w:t>
       </w:r>
     </w:p>
     <w:p>
@@ -12041,14 +12069,14 @@
           <w:rFonts w:ascii="Times New Roman" w:hAnsi="Times New Roman"/>
           <w:color w:val="212121"/>
         </w:rPr>
-        <w:t xml:space="preserve">2. Red-Flag Evaluation (Decision A): If any of the 7 emergency symptoms match, triage is </w:t>
+        <w:t>2. Red-Flag</w:t>
       </w:r>
       <w:r>
         <w:rPr>
           <w:rFonts w:ascii="Times New Roman" w:hAnsi="Times New Roman"/>
           <w:color w:val="212121"/>
         </w:rPr>
-        <w:t>locked to EMERGENCY, bypassing ML.</w:t>
+        <w:t xml:space="preserve"> Evaluation (Decision A): If any of the 7 emergency symptoms match, triage is locked to EMERGENCY, bypassing ML.</w:t>
       </w:r>
     </w:p>
     <w:p>
@@ -12074,14 +12102,14 @@
           <w:rFonts w:ascii="Times New Roman" w:hAnsi="Times New Roman"/>
           <w:color w:val="212121"/>
         </w:rPr>
-        <w:t xml:space="preserve">4. Narrative Synthesis: Backend calls Graph Service (:8001) for summary generation. On timeout </w:t>
+        <w:t>4. Narrative Synt</w:t>
       </w:r>
       <w:r>
         <w:rPr>
           <w:rFonts w:ascii="Times New Roman" w:hAnsi="Times New Roman"/>
           <w:color w:val="212121"/>
         </w:rPr>
-        <w:t>or 429 quota exhaustion, deterministic template is rendered.</w:t>
+        <w:t>hesis: Backend calls Graph Service (:8001) for summary generation. On timeout or 429 quota exhaustion, deterministic template is rendered.</w:t>
       </w:r>
     </w:p>
     <w:p>
@@ -12107,14 +12135,14 @@
           <w:rFonts w:ascii="Times New Roman" w:hAnsi="Times New Roman"/>
           <w:color w:val="212121"/>
         </w:rPr>
-        <w:t>6. Escalation &amp; Doctor Review: [PENDING FIX ROUND] Consultation saving upon worker e</w:t>
+        <w:t>6. Esc</w:t>
       </w:r>
       <w:r>
         <w:rPr>
           <w:rFonts w:ascii="Times New Roman" w:hAnsi="Times New Roman"/>
           <w:color w:val="212121"/>
         </w:rPr>
-        <w:t>scalation, physician review queue retrieval, doctor response note logging, and worker seeing reviewed status represent ongoing defect-fix enhancements.</w:t>
+        <w:t>alation &amp; Doctor Review: [PENDING FIX ROUND] Consultation saving upon worker escalation, physician review queue retrieval, doctor response note logging, and worker seeing reviewed status represent ongoing defect-fix enhancements.</w:t>
       </w:r>
     </w:p>
     <w:p>
@@ -12128,120 +12156,8 @@
           <w:color w:val="154360"/>
           <w:sz w:val="24"/>
         </w:rPr>
-        <w:t>3.6 Security Architecture &amp; Cryptographic Implementation</w:t>
-      </w:r>
-    </w:p>
-    <w:p>
-      <w:pPr>
-        <w:spacing w:after="80"/>
-        <w:jc w:val="both"/>
-      </w:pPr>
-      <w:r>
-        <w:rPr>
-          <w:rFonts w:ascii="Times New Roman" w:hAnsi="Times New Roman"/>
-          <w:color w:val="212121"/>
-        </w:rPr>
-        <w:t>ArogyaMitra implements five layers of defense-i</w:t>
-      </w:r>
-      <w:r>
-        <w:rPr>
-          <w:rFonts w:ascii="Times New Roman" w:hAnsi="Times New Roman"/>
-          <w:color w:val="212121"/>
-        </w:rPr>
-        <w:t>n-depth security:</w:t>
-      </w:r>
-    </w:p>
-    <w:p>
-      <w:pPr>
-        <w:spacing w:after="40"/>
-        <w:jc w:val="both"/>
-      </w:pPr>
-      <w:r>
-        <w:rPr>
-          <w:rFonts w:ascii="Times New Roman" w:hAnsi="Times New Roman"/>
-          <w:color w:val="212121"/>
-        </w:rPr>
-        <w:lastRenderedPageBreak/>
-        <w:t>Layer 1 — Transport Security: Enforces TLS 1.2 and TLS 1.3 encryption with HSTS, X-Content-Type-Options: nosniff, and CSP headers via Nginx.</w:t>
-      </w:r>
-    </w:p>
-    <w:p>
-      <w:pPr>
-        <w:spacing w:after="40"/>
-        <w:jc w:val="both"/>
-      </w:pPr>
-      <w:r>
-        <w:rPr>
-          <w:rFonts w:ascii="Times New Roman" w:hAnsi="Times New Roman"/>
-          <w:color w:val="212121"/>
-        </w:rPr>
-        <w:t>Layer 2 — Gateway Rate Limiting: Restricts authentication routes (5 req/15 min) and API routes (1</w:t>
-      </w:r>
-      <w:r>
-        <w:rPr>
-          <w:rFonts w:ascii="Times New Roman" w:hAnsi="Times New Roman"/>
-          <w:color w:val="212121"/>
-        </w:rPr>
-        <w:t>00 req/15 min) in production mode.</w:t>
-      </w:r>
-    </w:p>
-    <w:p>
-      <w:pPr>
-        <w:spacing w:after="40"/>
-        <w:jc w:val="both"/>
-      </w:pPr>
-      <w:r>
-        <w:rPr>
-          <w:rFonts w:ascii="Times New Roman" w:hAnsi="Times New Roman"/>
-          <w:color w:val="212121"/>
-        </w:rPr>
-        <w:t>Layer 3 — Authentication &amp; Sessions: Protects passwords using Argon2id (3 iterations, 64 MB RAM, 4 threads). Issues signed JWTs with 15-minute expirations.</w:t>
-      </w:r>
-    </w:p>
-    <w:p>
-      <w:pPr>
-        <w:spacing w:after="40"/>
-        <w:jc w:val="both"/>
-      </w:pPr>
-      <w:r>
-        <w:rPr>
-          <w:rFonts w:ascii="Times New Roman" w:hAnsi="Times New Roman"/>
-          <w:color w:val="212121"/>
-        </w:rPr>
-        <w:t xml:space="preserve">Layer 4 — Role-Based Authorization &amp; Org Scoping: Validates user </w:t>
-      </w:r>
-      <w:r>
-        <w:rPr>
-          <w:rFonts w:ascii="Times New Roman" w:hAnsi="Times New Roman"/>
-          <w:color w:val="212121"/>
-        </w:rPr>
-        <w:t>permissions ('worker', 'doctor', 'admin') and enforces organization boundaries (orgScope.middleware.js) so users cannot access data outside their assigned healthcare organization.</w:t>
-      </w:r>
-    </w:p>
-    <w:p>
-      <w:pPr>
-        <w:spacing w:after="120"/>
-        <w:jc w:val="both"/>
-      </w:pPr>
-      <w:r>
-        <w:rPr>
-          <w:rFonts w:ascii="Times New Roman" w:hAnsi="Times New Roman"/>
-          <w:color w:val="212121"/>
-        </w:rPr>
-        <w:t>Layer 5 — Field-Level Encryption: Patient direct identifiers (name, contact,</w:t>
-      </w:r>
-      <w:r>
-        <w:rPr>
-          <w:rFonts w:ascii="Times New Roman" w:hAnsi="Times New Roman"/>
-          <w:color w:val="212121"/>
-        </w:rPr>
-        <w:t xml:space="preserve"> location) are encrypted at rest using AES-256-GCM with unique 96-bit initialization vectors. An automated startup guard (encryption_key_exit.test.js) verifies that the backend exits with code 1 if the master key is missing.</w:t>
-      </w:r>
-    </w:p>
-    <w:p>
-      <w:pPr>
-        <w:spacing w:before="200" w:after="80"/>
-      </w:pPr>
+        <w:t xml:space="preserve">3.6 Security Architecture </w:t>
+      </w:r>
       <w:r>
         <w:rPr>
           <w:rFonts w:ascii="Times New Roman" w:hAnsi="Times New Roman"/>
@@ -12249,8 +12165,120 @@
           <w:color w:val="154360"/>
           <w:sz w:val="24"/>
         </w:rPr>
-        <w:t>3.7 Database Design, Concurrenc</w:t>
-      </w:r>
+        <w:t>&amp; Cryptographic Implementation</w:t>
+      </w:r>
+    </w:p>
+    <w:p>
+      <w:pPr>
+        <w:spacing w:after="80"/>
+        <w:jc w:val="both"/>
+      </w:pPr>
+      <w:r>
+        <w:rPr>
+          <w:rFonts w:ascii="Times New Roman" w:hAnsi="Times New Roman"/>
+          <w:color w:val="212121"/>
+        </w:rPr>
+        <w:t>ArogyaMitra implements five layers of defense-in-depth security:</w:t>
+      </w:r>
+    </w:p>
+    <w:p>
+      <w:pPr>
+        <w:spacing w:after="40"/>
+        <w:jc w:val="both"/>
+      </w:pPr>
+      <w:r>
+        <w:rPr>
+          <w:rFonts w:ascii="Times New Roman" w:hAnsi="Times New Roman"/>
+          <w:color w:val="212121"/>
+        </w:rPr>
+        <w:lastRenderedPageBreak/>
+        <w:t>Layer 1 — Transport Security: Enforces TLS 1.2 and TLS 1.3 encryption with HSTS, X-Content-Type-Options: nosniff, and CSP headers via Nginx.</w:t>
+      </w:r>
+    </w:p>
+    <w:p>
+      <w:pPr>
+        <w:spacing w:after="40"/>
+        <w:jc w:val="both"/>
+      </w:pPr>
+      <w:r>
+        <w:rPr>
+          <w:rFonts w:ascii="Times New Roman" w:hAnsi="Times New Roman"/>
+          <w:color w:val="212121"/>
+        </w:rPr>
+        <w:t>Layer 2 — Gateway R</w:t>
+      </w:r>
+      <w:r>
+        <w:rPr>
+          <w:rFonts w:ascii="Times New Roman" w:hAnsi="Times New Roman"/>
+          <w:color w:val="212121"/>
+        </w:rPr>
+        <w:t>ate Limiting: Restricts authentication routes (5 req/15 min) and API routes (100 req/15 min) in production mode.</w:t>
+      </w:r>
+    </w:p>
+    <w:p>
+      <w:pPr>
+        <w:spacing w:after="40"/>
+        <w:jc w:val="both"/>
+      </w:pPr>
+      <w:r>
+        <w:rPr>
+          <w:rFonts w:ascii="Times New Roman" w:hAnsi="Times New Roman"/>
+          <w:color w:val="212121"/>
+        </w:rPr>
+        <w:t xml:space="preserve">Layer 3 — Authentication &amp; Sessions: Protects passwords using Argon2id (3 iterations, 64 MB RAM, 4 threads). Issues signed JWTs with 15-minute </w:t>
+      </w:r>
+      <w:r>
+        <w:rPr>
+          <w:rFonts w:ascii="Times New Roman" w:hAnsi="Times New Roman"/>
+          <w:color w:val="212121"/>
+        </w:rPr>
+        <w:t>expirations.</w:t>
+      </w:r>
+    </w:p>
+    <w:p>
+      <w:pPr>
+        <w:spacing w:after="40"/>
+        <w:jc w:val="both"/>
+      </w:pPr>
+      <w:r>
+        <w:rPr>
+          <w:rFonts w:ascii="Times New Roman" w:hAnsi="Times New Roman"/>
+          <w:color w:val="212121"/>
+        </w:rPr>
+        <w:t>Layer 4 — Role-Based Authorization &amp; Org Scoping: Validates user permissions ('worker', 'doctor', 'admin') and enforces organization boundaries (orgScope.middleware.js) so users cannot access data outside their assigned healthcare organization</w:t>
+      </w:r>
+      <w:r>
+        <w:rPr>
+          <w:rFonts w:ascii="Times New Roman" w:hAnsi="Times New Roman"/>
+          <w:color w:val="212121"/>
+        </w:rPr>
+        <w:t>.</w:t>
+      </w:r>
+    </w:p>
+    <w:p>
+      <w:pPr>
+        <w:spacing w:after="120"/>
+        <w:jc w:val="both"/>
+      </w:pPr>
+      <w:r>
+        <w:rPr>
+          <w:rFonts w:ascii="Times New Roman" w:hAnsi="Times New Roman"/>
+          <w:color w:val="212121"/>
+        </w:rPr>
+        <w:t>Layer 5 — Field-Level Encryption: Patient direct identifiers (name, contact, location) are encrypted at rest using AES-256-GCM [15] with unique 96-bit initialization vectors. The multi-layered defense architecture mitigates the OWASP Top 10 web applicati</w:t>
+      </w:r>
+      <w:r>
+        <w:rPr>
+          <w:rFonts w:ascii="Times New Roman" w:hAnsi="Times New Roman"/>
+          <w:color w:val="212121"/>
+        </w:rPr>
+        <w:t>on vulnerabilities [14]. An automated startup guard (encryption_key_exit.test.js) verifies that the backend exits with code 1 if the master key is missing.</w:t>
+      </w:r>
+    </w:p>
+    <w:p>
+      <w:pPr>
+        <w:spacing w:before="200" w:after="80"/>
+      </w:pPr>
       <w:r>
         <w:rPr>
           <w:rFonts w:ascii="Times New Roman" w:hAnsi="Times New Roman"/>
@@ -12258,7 +12286,7 @@
           <w:color w:val="154360"/>
           <w:sz w:val="24"/>
         </w:rPr>
-        <w:t>y &amp; Data Integrity</w:t>
+        <w:t>3.7 Database Design, Concurrency &amp; Data Integrity</w:t>
       </w:r>
     </w:p>
     <w:p>
@@ -12271,14 +12299,14 @@
           <w:rFonts w:ascii="Times New Roman" w:hAnsi="Times New Roman"/>
           <w:color w:val="212121"/>
         </w:rPr>
-        <w:t xml:space="preserve">The persistence layer uses MongoDB 7.0 with five core schemas: Consultation, User, AuditLog, Organization, and Patient. To preserve data integrity during simultaneous updates, the system implements Optimistic Concurrency Control (OCC) </w:t>
+        <w:t xml:space="preserve">The persistence layer uses MongoDB 7.0 with five </w:t>
       </w:r>
       <w:r>
         <w:rPr>
           <w:rFonts w:ascii="Times New Roman" w:hAnsi="Times New Roman"/>
           <w:color w:val="212121"/>
         </w:rPr>
-        <w:t>[10].</w:t>
+        <w:t>core schemas: Consultation, User, AuditLog, Organization, and Patient. To preserve data integrity during simultaneous updates, the system implements Optimistic Concurrency Control (OCC) [9] (Kung &amp; Robinson, 1981).</w:t>
       </w:r>
     </w:p>
     <w:p>
@@ -12291,14 +12319,21 @@
           <w:rFonts w:ascii="Times New Roman" w:hAnsi="Times New Roman"/>
           <w:color w:val="212121"/>
         </w:rPr>
-        <w:t xml:space="preserve">Each consultation document maintains a version key (__v). When a status update is submitted, Mongoose executes an atomic conditional update: Consultation.findOneAndUpdate({ _id: id, __v: currentVersion, status: 'PENDING' }, { $set: updateData, $inc: </w:t>
+        <w:t>Each consultation document maintains a ve</w:t>
       </w:r>
       <w:r>
         <w:rPr>
           <w:rFonts w:ascii="Times New Roman" w:hAnsi="Times New Roman"/>
           <w:color w:val="212121"/>
         </w:rPr>
-        <w:t>{ __v: 1 } }). If another request modified the document concurrently, the version precondition fails, returning an HTTP 409 Conflict error.</w:t>
+        <w:t xml:space="preserve">rsion key (__v). When a status update is submitted, Mongoose executes an atomic conditional update: Consultation.findOneAndUpdate({ _id: id, __v: currentVersion, status: 'PENDING' }, { $set: updateData, $inc: { __v: 1 } }). If another request modified the </w:t>
+      </w:r>
+      <w:r>
+        <w:rPr>
+          <w:rFonts w:ascii="Times New Roman" w:hAnsi="Times New Roman"/>
+          <w:color w:val="212121"/>
+        </w:rPr>
+        <w:t>document concurrently, the version precondition fails, returning an HTTP 409 Conflict error.</w:t>
       </w:r>
     </w:p>
     <w:p>
@@ -12311,14 +12346,14 @@
           <w:rFonts w:ascii="Times New Roman" w:hAnsi="Times New Roman"/>
           <w:color w:val="212121"/>
         </w:rPr>
-        <w:t>To address worker consultation list latency, server-side pagination (page, limit) and lean Mongoose projections were</w:t>
+        <w:t>To address worker consultation list latency, server-side pagination (page, limit) and lean Mongoose projections were implemented, reducing data transfer and improv</w:t>
       </w:r>
       <w:r>
         <w:rPr>
           <w:rFonts w:ascii="Times New Roman" w:hAnsi="Times New Roman"/>
           <w:color w:val="212121"/>
         </w:rPr>
-        <w:t xml:space="preserve"> implemented, reducing data transfer and improving response times.</w:t>
+        <w:t>ing response times.</w:t>
       </w:r>
     </w:p>
     <w:p>
@@ -12345,14 +12380,14 @@
           <w:rFonts w:ascii="Times New Roman" w:hAnsi="Times New Roman"/>
           <w:color w:val="212121"/>
         </w:rPr>
-        <w:t>ArogyaMitra implements structured, PII-free JSON logging via piiFreeLoggingMiddleware in Backend/src/middlewares/logging.middleware.js. All incoming HTTP reques</w:t>
+        <w:t>ArogyaMitra implements structured, PII-free JSON logging via piiFreeLoggingMiddleware in Backend/src/middlewares/logging.middleware.js. All incoming HTTP requests receive a unique X-Request-Id. Sensitive fie</w:t>
       </w:r>
       <w:r>
         <w:rPr>
           <w:rFonts w:ascii="Times New Roman" w:hAnsi="Times New Roman"/>
           <w:color w:val="212121"/>
         </w:rPr>
-        <w:t>ts receive a unique X-Request-Id. Sensitive fields (passwords, tokens, patient names, phone numbers) are stripped by sanitizeForLogging before logs are written.</w:t>
+        <w:t>lds (passwords, tokens, patient names, phone numbers) are stripped by sanitizeForLogging before logs are written.</w:t>
       </w:r>
     </w:p>
     <w:p>
@@ -12365,7 +12400,7 @@
           <w:rFonts w:ascii="Times New Roman" w:hAnsi="Times New Roman"/>
           <w:color w:val="212121"/>
         </w:rPr>
-        <w:t>Listing 3.1 displays real log excerpts from the running Docker cluster during testing:</w:t>
+        <w:t>Listing 3.1 displays real log excerpts from the running Docker cluster during testing (docs/evidence/backend_access_log_sample.txt:13-19):</w:t>
       </w:r>
     </w:p>
     <w:tbl>
@@ -12404,7 +12439,7 @@
                 <w:color w:val="154360"/>
                 <w:sz w:val="19"/>
               </w:rPr>
-              <w:t>[Listing</w:t>
+              <w:t>[Li</w:t>
             </w:r>
             <w:r>
               <w:rPr>
@@ -12413,7 +12448,7 @@
                 <w:color w:val="154360"/>
                 <w:sz w:val="19"/>
               </w:rPr>
-              <w:t xml:space="preserve"> 3.1: Structured PII-Free JSON Access Log Excerpts] </w:t>
+              <w:t xml:space="preserve">sting 3.1: Structured PII-Free JSON Access Log Excerpts] </w:t>
             </w:r>
             <w:r>
               <w:rPr>
@@ -12422,7 +12457,7 @@
                 <w:color w:val="212121"/>
                 <w:sz w:val="19"/>
               </w:rPr>
-              <w:t>{"timestamp":"2026-10-31T17:03:24.450Z","requestId":"c1f7b830-4e2a-4a61-9f20-80251759281a","method":"POST","path":"/api/v1/consultation/triage","statusCode":200,"durationMs":125,"role":"worker","organizat</w:t>
+              <w:t>{"timestamp":"2026-10-31T23:46:08.147Z","requestId":"d46bea0c-0255-4d13-8abd-8ae7f7da222e","method":"POST","path":"/api/v1/consultation","statusCode":201,"durationMs":84,"role":"Worker","organization</w:t>
             </w:r>
             <w:r>
               <w:rPr>
@@ -12431,7 +12466,7 @@
                 <w:color w:val="212121"/>
                 <w:sz w:val="19"/>
               </w:rPr>
-              <w:t>ion":"6723a1e2f49d3b123456789a"}</w:t>
+              <w:t>":"6ae673842406379e020d1401"}</w:t>
             </w:r>
             <w:r>
               <w:rPr>
@@ -12441,7 +12476,7 @@
                 <w:sz w:val="19"/>
               </w:rPr>
               <w:br/>
-              <w:t>{"timestamp":"2026-10-31T17:03:25.102Z","requestId":"d8e9c124-7b3f-4e89-a123-90341859392b","method":"GET","path":"/api/v1/consultation/my?page=1&amp;limit=20","statusCode":200,"durationMs":76,"role":"worker","organization":"672</w:t>
+              <w:t>{"timestamp":"2026-10-31T23:46:11.005Z","requestId":"6fac6e95-1ced-4ac9-bfa0-2be960a001e9","method":"GET","path":"/api/v1/consultation/pending","statusCode":200,"durationMs":34,"role":"Doctor","organization":"6ae673842406379e0</w:t>
             </w:r>
             <w:r>
               <w:rPr>
@@ -12450,7 +12485,26 @@
                 <w:color w:val="212121"/>
                 <w:sz w:val="19"/>
               </w:rPr>
-              <w:t>3a1e2f49d3b123456789a"}</w:t>
+              <w:t>20d1401"}</w:t>
+            </w:r>
+            <w:r>
+              <w:rPr>
+                <w:rFonts w:ascii="Times New Roman" w:hAnsi="Times New Roman"/>
+                <w:i/>
+                <w:color w:val="212121"/>
+                <w:sz w:val="19"/>
+              </w:rPr>
+              <w:br/>
+              <w:t>{"timestamp":"2026-10-31T23:46:13.550Z","requestId":"ae7ab4d0-c27c-41c4-a89d-c944725df9f6","method":"PATCH","path":"/api/v1/consultation/6ae67dc06a8649a948b9ef85/respond","statusCode":200,"durationMs":80,"role":"Doctor","organization":"6ae6738424</w:t>
+            </w:r>
+            <w:r>
+              <w:rPr>
+                <w:rFonts w:ascii="Times New Roman" w:hAnsi="Times New Roman"/>
+                <w:i/>
+                <w:color w:val="212121"/>
+                <w:sz w:val="19"/>
+              </w:rPr>
+              <w:t>06379e020d1401"}</w:t>
             </w:r>
           </w:p>
         </w:tc>
@@ -12505,14 +12559,14 @@
           <w:rFonts w:ascii="Times New Roman" w:hAnsi="Times New Roman"/>
           <w:color w:val="212121"/>
         </w:rPr>
-        <w:t>A potential flaw in public machine learning benchmarks for clinical decision support is the uncritical use of datasets without</w:t>
+        <w:t xml:space="preserve">A potential flaw in public machine learning benchmarks for clinical decision support is the uncritical use of datasets without </w:t>
       </w:r>
       <w:r>
         <w:rPr>
           <w:rFonts w:ascii="Times New Roman" w:hAnsi="Times New Roman"/>
           <w:color w:val="212121"/>
         </w:rPr>
-        <w:t xml:space="preserve"> verifying data provenance. During initial exploration, I evaluated the standard Kaggle disease-symptom dataset comprising 4,920 records across 41 disease classes and 131 symptoms.</w:t>
+        <w:t>verifying data provenance. During initial exploration, I evaluated the standard Kaggle disease-symptom dataset comprising 4,920 records across 41 disease classes and 131 symptoms.</w:t>
       </w:r>
     </w:p>
     <w:p>
@@ -12525,21 +12579,21 @@
           <w:rFonts w:ascii="Times New Roman" w:hAnsi="Times New Roman"/>
           <w:color w:val="212121"/>
         </w:rPr>
-        <w:t>Automated data provenance analysis (docs/evidence/data_provenance.txt:12-14</w:t>
+        <w:t>Automated data provenance analysis (docs/evidence/data_provenance.txt:12-14)</w:t>
       </w:r>
       <w:r>
         <w:rPr>
           <w:rFonts w:ascii="Times New Roman" w:hAnsi="Times New Roman"/>
           <w:color w:val="212121"/>
         </w:rPr>
-        <w:t>) revealed that 4,616 of the 4,920 rows were exact duplicates, representing a 93.8% synthetic duplication rate. When random train-test splits (such as 80/20) are applied to this raw dataset, identical symptom vectors leak across partitions, producing artif</w:t>
+        <w:t xml:space="preserve"> revealed that 4,616 of the 4,920 rows were exact duplicates, representing a 93.8% synthetic duplication rate. When random train-test splits (such as 80/20) are applied to this raw dataset, identical symptom vectors leak across partitions, producing artifi</w:t>
       </w:r>
       <w:r>
         <w:rPr>
           <w:rFonts w:ascii="Times New Roman" w:hAnsi="Times New Roman"/>
           <w:color w:val="212121"/>
         </w:rPr>
-        <w:t>icial test accuracies of 100.0%.</w:t>
+        <w:t>cial test accuracies of 100.0%.</w:t>
       </w:r>
     </w:p>
     <w:p>
@@ -12614,14 +12668,14 @@
           <w:rFonts w:ascii="Times New Roman" w:hAnsi="Times New Roman"/>
           <w:color w:val="212121"/>
         </w:rPr>
-        <w:t>Figure 4.2 illustrates the dataset composition. After deduplication, exactly 304 unique clinical symptom vectors remain across the 41 classes</w:t>
+        <w:t xml:space="preserve">Figure 4.2 illustrates the dataset composition. After deduplication, exactly 304 unique clinical symptom vectors remain across the 41 classes </w:t>
       </w:r>
       <w:r>
         <w:rPr>
           <w:rFonts w:ascii="Times New Roman" w:hAnsi="Times New Roman"/>
           <w:color w:val="212121"/>
         </w:rPr>
-        <w:t xml:space="preserve"> (approximately 7.4 unique presentations per disease). All empirical machine learning evaluations in ArogyaMitra were conducted strictly on this deduplicated 304-row benchmark.</w:t>
+        <w:t>(approximately 7.4 unique presentations per disease). All empirical machine learning evaluations in ArogyaMitra were conducted strictly on this deduplicated 304-row benchmark.</w:t>
       </w:r>
     </w:p>
     <w:tbl>
@@ -15560,7 +15614,7 @@
           <w:rFonts w:ascii="Times New Roman" w:hAnsi="Times New Roman"/>
           <w:color w:val="212121"/>
         </w:rPr>
-        <w:t xml:space="preserve">ArogyaMitra maintains 321 automated prototype tests across its microservices. Table 4.5 summarizes the test counts </w:t>
+        <w:t xml:space="preserve">ArogyaMitra maintains 322 automated prototype tests across its microservices. Table 4.5 summarizes the test counts </w:t>
       </w:r>
       <w:r>
         <w:rPr>
@@ -15581,7 +15635,7 @@
           <w:color w:val="154360"/>
           <w:sz w:val="19"/>
         </w:rPr>
-        <w:t>Table 4.5: Automated Test Suite Summary from Actual Test Runners (321 Tests)</w:t>
+        <w:t>Table 4.5: Automated Test Suite Summary from Actual Test Runners (322 Tests)</w:t>
       </w:r>
     </w:p>
     <w:tbl>
@@ -16199,7 +16253,7 @@
               <w:rPr>
                 <w:sz w:val="16"/>
               </w:rPr>
-              <w:t>9 Tests</w:t>
+              <w:t>10 Tests</w:t>
             </w:r>
           </w:p>
         </w:tc>
@@ -16261,7 +16315,7 @@
               <w:rPr>
                 <w:sz w:val="14"/>
               </w:rPr>
-              <w:t>docs/evidence/verify_ui.txt:26</w:t>
+              <w:t>docs/evidence/verify_ui.txt:21</w:t>
             </w:r>
           </w:p>
         </w:tc>
@@ -16323,7 +16377,7 @@
               <w:rPr>
                 <w:sz w:val="16"/>
               </w:rPr>
-              <w:t>321 Tests</w:t>
+              <w:t>322 Tests</w:t>
             </w:r>
           </w:p>
         </w:tc>
@@ -17490,7 +17544,7 @@
     </w:p>
     <w:p>
       <w:pPr>
-        <w:spacing w:after="40"/>
+        <w:spacing w:after="80"/>
         <w:jc w:val="both"/>
       </w:pPr>
       <w:r>
@@ -17519,14 +17573,14 @@
           <w:color w:val="212121"/>
         </w:rPr>
         <w:lastRenderedPageBreak/>
-        <w:t>11. Pending Fix Round Workflows: [PENDING FIX ROUND] Consultation saving upon worker escalation, physician review queue retrieval, doctor response note logging, worker seeing reviewed status, and 401 se</w:t>
+        <w:t>Earlier prototype workflow defects (escalation persistence, physician queue retrieval, second-opinion saving, worker review visibility, and session expiry handling) were comprehensively remediated and v</w:t>
       </w:r>
       <w:r>
         <w:rPr>
           <w:rFonts w:ascii="Times New Roman" w:hAnsi="Times New Roman"/>
           <w:color w:val="212121"/>
         </w:rPr>
-        <w:t>ssion expiry handling represent ongoing defect-fix enhancements.</w:t>
+        <w:t>erified in the remediation branch across 11/11 Playwright journeys.</w:t>
       </w:r>
     </w:p>
     <w:p>
@@ -17573,21 +17627,21 @@
           <w:rFonts w:ascii="Times New Roman" w:hAnsi="Times New Roman"/>
           <w:color w:val="212121"/>
         </w:rPr>
-        <w:t>In this project, I engineered and evaluated ArogyaMitra, an explainable and fail-closed AI-assisted clinical decision</w:t>
+        <w:t>In this project, I engineered and evaluated ArogyaMitra, an explainable and fail-closed AI-assisted clinical decis</w:t>
       </w:r>
       <w:r>
         <w:rPr>
           <w:rFonts w:ascii="Times New Roman" w:hAnsi="Times New Roman"/>
           <w:color w:val="212121"/>
         </w:rPr>
-        <w:t xml:space="preserve"> support system prototype for community healthcare workers. Addressing vulnerabilities documented in clinical literature—specifically diagnostic inaccuracy in symptom checkers (Wallace et al. [1]) and uncalibrated posteriors in Naive Bayes (Niculescu-Mizil</w:t>
+        <w:t>ion support system prototype for community healthcare workers. Addressing vulnerabilities documented in clinical literature—specifically diagnostic inaccuracy in symptom checkers (Wallace et al. [1]) and uncalibrated posteriors in Naive Bayes (Niculescu-Mi</w:t>
       </w:r>
       <w:r>
         <w:rPr>
           <w:rFonts w:ascii="Times New Roman" w:hAnsi="Times New Roman"/>
           <w:color w:val="212121"/>
         </w:rPr>
-        <w:t xml:space="preserve"> &amp; Caruana [2])—I achieved the following engineering outcomes:</w:t>
+        <w:t>zil &amp; Caruana [2])—I achieved the following engineering outcomes:</w:t>
       </w:r>
     </w:p>
     <w:p>
@@ -17600,14 +17654,14 @@
           <w:rFonts w:ascii="Times New Roman" w:hAnsi="Times New Roman"/>
           <w:color w:val="212121"/>
         </w:rPr>
-        <w:t>1. Deduplicated Baseline Benchmark: Identified and removed a 93.8% synthetic duplication artifact in raw public clinical data, establishing a clean 304-row benchmark across 41 disease classes a</w:t>
+        <w:t>1. Deduplicated Baseline Benchmark: Identified and removed a 93.8% synthetic duplication artifact in raw public clinical data, establishing a clean 304-row benchmark across 41 disease classe</w:t>
       </w:r>
       <w:r>
         <w:rPr>
           <w:rFonts w:ascii="Times New Roman" w:hAnsi="Times New Roman"/>
           <w:color w:val="212121"/>
         </w:rPr>
-        <w:t>nd 131 symptoms.</w:t>
+        <w:t>s and 131 symptoms.</w:t>
       </w:r>
     </w:p>
     <w:p>
@@ -17620,14 +17674,14 @@
           <w:rFonts w:ascii="Times New Roman" w:hAnsi="Times New Roman"/>
           <w:color w:val="212121"/>
         </w:rPr>
-        <w:t>2. Robust Bayesian Inference: Evaluated stateless Bernoulli Naive Bayes against tuned gradient-boosted trees under symptom dropout, demonstrating 0.919 accuracy vs. 0.683 for LightGBM at 50% missing data, with an inference execution time o</w:t>
+        <w:t>2. Robust Bayesian Inference: Evaluated stateless Bernoulli Naive Bayes against tuned gradient-boosted trees under symptom dropout, demonstrating 0.919 accuracy vs. 0.683 for LightGBM at 50% missing data, with an inference execution tim</w:t>
       </w:r>
       <w:r>
         <w:rPr>
           <w:rFonts w:ascii="Times New Roman" w:hAnsi="Times New Roman"/>
           <w:color w:val="212121"/>
         </w:rPr>
-        <w:t>f 1.8 ms in internal container benchmarks.</w:t>
+        <w:t>e of 1.8 ms in internal container benchmarks.</w:t>
       </w:r>
     </w:p>
     <w:p>
@@ -17653,14 +17707,21 @@
           <w:rFonts w:ascii="Times New Roman" w:hAnsi="Times New Roman"/>
           <w:color w:val="212121"/>
         </w:rPr>
-        <w:t xml:space="preserve">4. Fail-Closed Safety Architecture: Decoupled emergency </w:t>
+        <w:t xml:space="preserve">4. Fail-Closed Safety Architecture: Decoupled </w:t>
       </w:r>
       <w:r>
         <w:rPr>
           <w:rFonts w:ascii="Times New Roman" w:hAnsi="Times New Roman"/>
           <w:color w:val="212121"/>
         </w:rPr>
-        <w:t>detection from classification via deterministic red-flag overrides; isolated the LLM narrative layer behind 10s/20s timeout caps and confidence filters backed by pre-compiled templates; and replaced client-side mocks with explicit HTTP 503 error states.</w:t>
+        <w:t xml:space="preserve">emergency detection from classification via deterministic red-flag overrides; isolated the LLM narrative layer behind 10s/20s timeout caps and confidence filters backed by pre-compiled templates; and replaced client-side mocks with explicit HTTP 503 error </w:t>
+      </w:r>
+      <w:r>
+        <w:rPr>
+          <w:rFonts w:ascii="Times New Roman" w:hAnsi="Times New Roman"/>
+          <w:color w:val="212121"/>
+        </w:rPr>
+        <w:t>states.</w:t>
       </w:r>
     </w:p>
     <w:p>
@@ -17673,21 +17734,14 @@
           <w:rFonts w:ascii="Times New Roman" w:hAnsi="Times New Roman"/>
           <w:color w:val="212121"/>
         </w:rPr>
-        <w:t>5.</w:t>
+        <w:t>5. Layered Container Security &amp; Verification: Enforced TLS 1.2/1.3, Argon2id hashing, AES-256-GCM field encryption, and optimistic concurrency controls (__v). Achieved zero fixable Critical/High (Trivy --ignore-unfixed) container vulnerabilities an</w:t>
       </w:r>
       <w:r>
         <w:rPr>
           <w:rFonts w:ascii="Times New Roman" w:hAnsi="Times New Roman"/>
           <w:color w:val="212121"/>
         </w:rPr>
-        <w:t xml:space="preserve"> Layered Container Security &amp; Verification: Enforced TLS 1.2/1.3, Argon2id hashing, AES-256-GCM field encryption, and optimistic concurrency controls (__v). Achieved zero fixable Critical/High (Trivy --ignore-unfixed) container vulnerabilities and 100% pas</w:t>
-      </w:r>
-      <w:r>
-        <w:rPr>
-          <w:rFonts w:ascii="Times New Roman" w:hAnsi="Times New Roman"/>
-          <w:color w:val="212121"/>
-        </w:rPr>
-        <w:t>s rates across 321 automated prototype tests.</w:t>
+        <w:t>d 100% pass rates across 322 automated prototype tests.</w:t>
       </w:r>
     </w:p>
     <w:p>
@@ -17727,14 +17781,14 @@
           <w:rFonts w:ascii="Times New Roman" w:hAnsi="Times New Roman"/>
           <w:color w:val="212121"/>
         </w:rPr>
-        <w:t>1. Danger of Silent Fallback Mocks: Returning canned predictions during a service out</w:t>
+        <w:t>1. Danger of Silent Fallback Mocks: Returning canned predictions during a s</w:t>
       </w:r>
       <w:r>
         <w:rPr>
           <w:rFonts w:ascii="Times New Roman" w:hAnsi="Times New Roman"/>
           <w:color w:val="212121"/>
         </w:rPr>
-        <w:t>age creates clinical hazards. Designing for fail-closed behavior—explicitly halting unsafe workflows and returning HTTP 503—is essential in healthcare software.</w:t>
+        <w:t>ervice outage creates clinical hazards. Designing for fail-closed behavior—explicitly halting unsafe workflows and returning HTTP 503—is essential in healthcare software.</w:t>
       </w:r>
     </w:p>
     <w:p>
@@ -17747,14 +17801,14 @@
           <w:rFonts w:ascii="Times New Roman" w:hAnsi="Times New Roman"/>
           <w:color w:val="212121"/>
         </w:rPr>
-        <w:t>2. Calibration Limits on Small Cohorts: Demonstrating that Platt scaling degraded log loss on 3</w:t>
+        <w:t>2. Calibration Limits on Small Cohorts: Demonstrating that Platt scaling degraded log</w:t>
       </w:r>
       <w:r>
         <w:rPr>
           <w:rFonts w:ascii="Times New Roman" w:hAnsi="Times New Roman"/>
           <w:color w:val="212121"/>
         </w:rPr>
-        <w:t>04 unique rows confirmed that parametric calibration cannot be applied uncritically to small clinical datasets. Scores must be transparently communicated as uncalibrated estimates.</w:t>
+        <w:t xml:space="preserve"> loss on 304 unique rows confirmed that parametric calibration cannot be applied uncritically to small clinical datasets. Scores must be transparently communicated as uncalibrated estimates.</w:t>
       </w:r>
     </w:p>
     <w:p>
@@ -17767,14 +17821,14 @@
           <w:rFonts w:ascii="Times New Roman" w:hAnsi="Times New Roman"/>
           <w:color w:val="212121"/>
         </w:rPr>
-        <w:t>3. Combined Profiling &amp; Optimization: Profiling revealed that unpaginated q</w:t>
+        <w:t>3. Combined Profiling &amp; Optimization: Profiling revealed that unp</w:t>
       </w:r>
       <w:r>
         <w:rPr>
           <w:rFonts w:ascii="Times New Roman" w:hAnsi="Times New Roman"/>
           <w:color w:val="212121"/>
         </w:rPr>
-        <w:t>ueries dominated list latency. Implementing server-side pagination and projection yielded a 60.5% p50 latency reduction, confirming the value of targeted optimization.</w:t>
+        <w:t>aginated queries dominated list latency. Implementing server-side pagination and projection yielded a 60.5% p50 latency reduction, confirming the value of targeted optimization.</w:t>
       </w:r>
     </w:p>
     <w:p>
@@ -17814,14 +17868,14 @@
           <w:rFonts w:ascii="Times New Roman" w:hAnsi="Times New Roman"/>
           <w:color w:val="212121"/>
         </w:rPr>
-        <w:t xml:space="preserve">1. Prospective </w:t>
+        <w:t>1. Pr</w:t>
       </w:r>
       <w:r>
         <w:rPr>
           <w:rFonts w:ascii="Times New Roman" w:hAnsi="Times New Roman"/>
           <w:color w:val="212121"/>
         </w:rPr>
-        <w:t>Clinical Pilot: Conduct observational studies in Health and Wellness Centres to evaluate concordance between health worker triage recommendations and Medical Officer diagnoses.</w:t>
+        <w:t>ospective Clinical Pilot: Conduct observational studies in Health and Wellness Centres to evaluate concordance between health worker triage recommendations and Medical Officer diagnoses.</w:t>
       </w:r>
     </w:p>
     <w:p>
@@ -17834,14 +17888,14 @@
           <w:rFonts w:ascii="Times New Roman" w:hAnsi="Times New Roman"/>
           <w:color w:val="212121"/>
         </w:rPr>
-        <w:t>2. ABHA &amp; ABDM Ecosystem Integration: Implement standardized HL7 FHIR interface</w:t>
+        <w:t>2. ABHA &amp; ABDM Ecosystem Integration: Implement standardized HL7 FHIR</w:t>
       </w:r>
       <w:r>
         <w:rPr>
           <w:rFonts w:ascii="Times New Roman" w:hAnsi="Times New Roman"/>
           <w:color w:val="212121"/>
         </w:rPr>
-        <w:t>s for bidirectional health record synchronization with the Ayushman Bharat Digital Mission.</w:t>
+        <w:t xml:space="preserve"> interfaces for bidirectional health record synchronization with the Ayushman Bharat Digital Mission.</w:t>
       </w:r>
     </w:p>
     <w:p>
@@ -17868,14 +17922,14 @@
           <w:color w:val="212121"/>
         </w:rPr>
         <w:lastRenderedPageBreak/>
-        <w:t>4. Non-Parametric Calibration</w:t>
+        <w:t>4. Non-Parametric C</w:t>
       </w:r>
       <w:r>
         <w:rPr>
           <w:rFonts w:ascii="Times New Roman" w:hAnsi="Times New Roman"/>
           <w:color w:val="212121"/>
         </w:rPr>
-        <w:t xml:space="preserve"> on Clinical Cohorts: When genuine multi-thousand patient cohorts become available, train non-parametric calibration models (such as beta calibration) to deliver calibrated risk intervals.</w:t>
+        <w:t>alibration on Clinical Cohorts: When genuine multi-thousand patient cohorts become available, train non-parametric calibration models (such as beta calibration) to deliver calibrated risk intervals.</w:t>
       </w:r>
     </w:p>
     <w:p>
@@ -17917,14 +17971,14 @@
           <w:rFonts w:ascii="Times New Roman" w:hAnsi="Times New Roman"/>
           <w:sz w:val="19"/>
         </w:rPr>
-        <w:t>Wallace, W., Chan, C., Chidambaram, S., et al. (20</w:t>
+        <w:t xml:space="preserve">Wallace, W., Chan, C., Chidambaram, S., </w:t>
       </w:r>
       <w:r>
         <w:rPr>
           <w:rFonts w:ascii="Times New Roman" w:hAnsi="Times New Roman"/>
           <w:sz w:val="19"/>
         </w:rPr>
-        <w:t>22). The diagnostic and triage accuracy of digital and online symptom checker tools: a systematic review. npj Digital Medicine, 5:118. https://doi.org/10.1038/s41746-022-00667-w</w:t>
+        <w:t>et al. (2022). The diagnostic and triage accuracy of digital and online symptom checker tools: a systematic review. npj Digital Medicine, 5:118. https://doi.org/10.1038/s41746-022-00667-w</w:t>
       </w:r>
     </w:p>
     <w:p>
@@ -17946,14 +18000,14 @@
           <w:rFonts w:ascii="Times New Roman" w:hAnsi="Times New Roman"/>
           <w:sz w:val="19"/>
         </w:rPr>
-        <w:t>Niculescu-Mizil, A., &amp; Caruana, R. (2005). Predicting good probabilities w</w:t>
+        <w:t>Niculescu-Mizil, A., &amp; Caruana, R. (2005). Predicting good proba</w:t>
       </w:r>
       <w:r>
         <w:rPr>
           <w:rFonts w:ascii="Times New Roman" w:hAnsi="Times New Roman"/>
           <w:sz w:val="19"/>
         </w:rPr>
-        <w:t>ith supervised learning. In Proceedings of the 22nd International Conference on Machine Learning (ICML '05), pp. 625–632. ACM. https://doi.org/10.1145/1102351.1102430</w:t>
+        <w:t>bilities with supervised learning. In Proceedings of the 22nd International Conference on Machine Learning (ICML '05), pp. 625–632. ACM. https://doi.org/10.1145/1102351.1102430</w:t>
       </w:r>
     </w:p>
     <w:p>
@@ -17975,14 +18029,14 @@
           <w:rFonts w:ascii="Times New Roman" w:hAnsi="Times New Roman"/>
           <w:sz w:val="19"/>
         </w:rPr>
-        <w:t>Domingos, P., &amp; Pazzani, M. (1997). On the optimality of the simple Bayesian classifi</w:t>
+        <w:t>Domingos, P., &amp; Pazzani, M. (1997). On the optimality of the simple Bayesia</w:t>
       </w:r>
       <w:r>
         <w:rPr>
           <w:rFonts w:ascii="Times New Roman" w:hAnsi="Times New Roman"/>
           <w:sz w:val="19"/>
         </w:rPr>
-        <w:t>er under zero-one loss. Machine Learning, 29(2), 103–130. https://doi.org/10.1023/A:1007413511361</w:t>
+        <w:t>n classifier under zero-one loss. Machine Learning, 29(2), 103–130. https://doi.org/10.1023/A:1007413511361</w:t>
       </w:r>
     </w:p>
     <w:p>
@@ -18004,14 +18058,14 @@
           <w:rFonts w:ascii="Times New Roman" w:hAnsi="Times New Roman"/>
           <w:sz w:val="19"/>
         </w:rPr>
-        <w:t>Ke, G., Meng, Q., Finley, T., et al. (2017). LightGBM: A highly efficient gradient boosting decision tree. Advances in Neural Information Processing Syste</w:t>
+        <w:t>Ke, G., Meng, Q., Finley, T., et al. (2017). LightGBM: A highly efficient gradient boosting decision tree. Advances in Neural Information Proces</w:t>
       </w:r>
       <w:r>
         <w:rPr>
           <w:rFonts w:ascii="Times New Roman" w:hAnsi="Times New Roman"/>
           <w:sz w:val="19"/>
         </w:rPr>
-        <w:t>ms (NeurIPS 2017), 30, 3146–3154.</w:t>
+        <w:t>sing Systems (NeurIPS 2017), 30, 3146–3154.</w:t>
       </w:r>
     </w:p>
     <w:p>
@@ -18055,14 +18109,14 @@
           <w:rFonts w:ascii="Times New Roman" w:hAnsi="Times New Roman"/>
           <w:sz w:val="19"/>
         </w:rPr>
-        <w:t>Ji, Z., Lee, N., Frieske, R., et al. (202</w:t>
+        <w:t>Ji, Z., Lee, N., Frieske, R., e</w:t>
       </w:r>
       <w:r>
         <w:rPr>
           <w:rFonts w:ascii="Times New Roman" w:hAnsi="Times New Roman"/>
           <w:sz w:val="19"/>
         </w:rPr>
-        <w:t>3). Survey of hallucination in natural language generation. ACM Computing Surveys, 55(12), 1–38. https://doi.org/10.1145/3571730</w:t>
+        <w:t>t al. (2023). Survey of hallucination in natural language generation. ACM Computing Surveys, 55(12), 1–38. https://doi.org/10.1145/3571730</w:t>
       </w:r>
     </w:p>
     <w:p>
@@ -18084,14 +18138,14 @@
           <w:rFonts w:ascii="Times New Roman" w:hAnsi="Times New Roman"/>
           <w:sz w:val="19"/>
         </w:rPr>
-        <w:t>Singhal, K., Azizi, S., Tu, T., et al. (2023). Large language models encode clinical knowledge. Nature, 620(7972), 172–180.</w:t>
+        <w:t>Singhal, K., Azizi, S., Tu, T., et al. (2023). Large language models encode clinical knowledge. Nature, 620(7972)</w:t>
       </w:r>
       <w:r>
         <w:rPr>
           <w:rFonts w:ascii="Times New Roman" w:hAnsi="Times New Roman"/>
           <w:sz w:val="19"/>
         </w:rPr>
-        <w:t xml:space="preserve"> https://doi.org/10.1038/s41586-023-06291-2</w:t>
+        <w:t>, 172–180. https://doi.org/10.1038/s41586-023-06291-2</w:t>
       </w:r>
     </w:p>
     <w:p>
@@ -18113,7 +18167,14 @@
           <w:rFonts w:ascii="Times New Roman" w:hAnsi="Times New Roman"/>
           <w:sz w:val="19"/>
         </w:rPr>
-        <w:t>Biryukov, A., Dinu, D., &amp; Khovratovich, D. (2016). Argon2: New generation of memory-hard functions for password hashing. In IEEE European Symposium on Security and Privacy (EuroS&amp;P), pp. 292–302. IEEE.</w:t>
+        <w:t xml:space="preserve">Biryukov, A., Dinu, D., &amp; Khovratovich, D. (2016). Argon2: New generation of memory-hard functions for password hashing. In IEEE European Symposium on Security and Privacy (EuroS&amp;P), pp. 292–302. </w:t>
+      </w:r>
+      <w:r>
+        <w:rPr>
+          <w:rFonts w:ascii="Times New Roman" w:hAnsi="Times New Roman"/>
+          <w:sz w:val="19"/>
+        </w:rPr>
+        <w:t>IEEE.</w:t>
       </w:r>
     </w:p>
     <w:p>
@@ -18157,14 +18218,14 @@
           <w:rFonts w:ascii="Times New Roman" w:hAnsi="Times New Roman"/>
           <w:sz w:val="19"/>
         </w:rPr>
-        <w:t>Ribeiro, M. T., Singh, S., &amp; Guestrin, C. (2016). "Why should I tru</w:t>
+        <w:t xml:space="preserve">Ribeiro, M. T., Singh, S., &amp; Guestrin, C. (2016). "Why </w:t>
       </w:r>
       <w:r>
         <w:rPr>
           <w:rFonts w:ascii="Times New Roman" w:hAnsi="Times New Roman"/>
           <w:sz w:val="19"/>
         </w:rPr>
-        <w:t>st you?": Explaining the predictions of any classifier. In Proceedings of the 22nd ACM SIGKDD (KDD '16), pp. 1135–1144. ACM.</w:t>
+        <w:t>should I trust you?": Explaining the predictions of any classifier. In Proceedings of the 22nd ACM SIGKDD (KDD '16), pp. 1135–1144. ACM.</w:t>
       </w:r>
     </w:p>
     <w:p>
@@ -18186,14 +18247,14 @@
           <w:rFonts w:ascii="Times New Roman" w:hAnsi="Times New Roman"/>
           <w:sz w:val="19"/>
         </w:rPr>
-        <w:t>Ministry of Law and Justice, Government of India. (2023). The Digital Personal Data Protection Act, 2023 (Act No. 22 of 2023).</w:t>
+        <w:t xml:space="preserve">Ministry of Law and Justice, Government of India. (2023). The Digital Personal Data Protection Act, 2023 (Act No. </w:t>
       </w:r>
       <w:r>
         <w:rPr>
           <w:rFonts w:ascii="Times New Roman" w:hAnsi="Times New Roman"/>
           <w:sz w:val="19"/>
         </w:rPr>
-        <w:t xml:space="preserve"> The Gazette of India, Extraordinary, Part II—Section 1.</w:t>
+        <w:t>22 of 2023). The Gazette of India, Extraordinary, Part II—Section 1.</w:t>
       </w:r>
     </w:p>
     <w:p>
@@ -18237,14 +18298,14 @@
           <w:rFonts w:ascii="Times New Roman" w:hAnsi="Times New Roman"/>
           <w:sz w:val="19"/>
         </w:rPr>
-        <w:t>Indian Council of Medical R</w:t>
+        <w:t xml:space="preserve">Indian Council </w:t>
       </w:r>
       <w:r>
         <w:rPr>
           <w:rFonts w:ascii="Times New Roman" w:hAnsi="Times New Roman"/>
           <w:sz w:val="19"/>
         </w:rPr>
-        <w:t>esearch. (2023). Ethical guidelines for application of artificial intelligence in biomedical research and healthcare. ICMR, New Delhi, India.</w:t>
+        <w:t>of Medical Research. (2023). Ethical guidelines for application of artificial intelligence in biomedical research and healthcare. ICMR, New Delhi, India.</w:t>
       </w:r>
     </w:p>
     <w:p>
@@ -18266,14 +18327,14 @@
           <w:rFonts w:ascii="Times New Roman" w:hAnsi="Times New Roman"/>
           <w:sz w:val="19"/>
         </w:rPr>
-        <w:t>OWASP Foundation. (2021). OWASP Top 10:2021 The Ten Most Critical Web Application Security Risks. https://owa</w:t>
+        <w:t>OWASP Foundation. (2021). OWASP Top 10:2021 The Ten Most Critical Web Application Security Risks.</w:t>
       </w:r>
       <w:r>
         <w:rPr>
           <w:rFonts w:ascii="Times New Roman" w:hAnsi="Times New Roman"/>
           <w:sz w:val="19"/>
         </w:rPr>
-        <w:t>sp.org/Top10/</w:t>
+        <w:t xml:space="preserve"> https://owasp.org/Top10/</w:t>
       </w:r>
     </w:p>
     <w:p>
@@ -18315,7 +18376,7 @@
           <w:sz w:val="28"/>
         </w:rPr>
         <w:lastRenderedPageBreak/>
-        <w:t>Appendix A: Engineering Challenges, Root Caus</w:t>
+        <w:t>Appendix A: Engineering Challenge</w:t>
       </w:r>
       <w:r>
         <w:rPr>
@@ -18324,7 +18385,7 @@
           <w:color w:val="154360"/>
           <w:sz w:val="28"/>
         </w:rPr>
-        <w:t>es, and Architectural Fixes</w:t>
+        <w:t>s, Root Causes, and Architectural Fixes</w:t>
       </w:r>
     </w:p>
     <w:p>
@@ -18423,7 +18484,16 @@
                 <w:color w:val="FFFFFF"/>
                 <w:sz w:val="17"/>
               </w:rPr>
-              <w:t>Diagnosed Root Cause</w:t>
+              <w:t>Diagnosed Root</w:t>
+            </w:r>
+            <w:r>
+              <w:rPr>
+                <w:rFonts w:ascii="Times New Roman" w:hAnsi="Times New Roman"/>
+                <w:b/>
+                <w:color w:val="FFFFFF"/>
+                <w:sz w:val="17"/>
+              </w:rPr>
+              <w:t xml:space="preserve"> Cause</w:t>
             </w:r>
           </w:p>
         </w:tc>
@@ -18449,16 +18519,7 @@
                 <w:color w:val="FFFFFF"/>
                 <w:sz w:val="17"/>
               </w:rPr>
-              <w:t>Archi</w:t>
-            </w:r>
-            <w:r>
-              <w:rPr>
-                <w:rFonts w:ascii="Times New Roman" w:hAnsi="Times New Roman"/>
-                <w:b/>
-                <w:color w:val="FFFFFF"/>
-                <w:sz w:val="17"/>
-              </w:rPr>
-              <w:t>tectural Remediation Implemented</w:t>
+              <w:t>Architectural Remediation Implemented</w:t>
             </w:r>
           </w:p>
         </w:tc>
@@ -18550,14 +18611,14 @@
                 <w:rFonts w:ascii="Times New Roman" w:hAnsi="Times New Roman"/>
                 <w:sz w:val="15"/>
               </w:rPr>
-              <w:t xml:space="preserve">Traced to in-process </w:t>
+              <w:t xml:space="preserve">Traced to </w:t>
             </w:r>
             <w:r>
               <w:rPr>
                 <w:rFonts w:ascii="Times New Roman" w:hAnsi="Times New Roman"/>
                 <w:sz w:val="15"/>
               </w:rPr>
-              <w:t>import failure inside container falling back to legacy mock. Rewrote UI to route strictly through backend API `POST /api/v1/consultation/triage`; removed all mock fallbacks; enforced fail-closed HTTP 503 MODEL_UNAVAILABLE on ML outage.</w:t>
+              <w:t>in-process import failure inside container falling back to legacy mock. Rewrote UI to route strictly through backend API `POST /api/v1/consultation/triage`; removed all mock fallbacks; enforced fail-closed HTTP 503 MODEL_UNAVAILABLE on ML outage.</w:t>
             </w:r>
           </w:p>
         </w:tc>
@@ -18578,7 +18639,7 @@
                 <w:color w:val="546E7A"/>
                 <w:sz w:val="14"/>
               </w:rPr>
-              <w:t>docs/evidence/p0_roo</w:t>
+              <w:t>docs/evid</w:t>
             </w:r>
             <w:r>
               <w:rPr>
@@ -18586,7 +18647,7 @@
                 <w:color w:val="546E7A"/>
                 <w:sz w:val="14"/>
               </w:rPr>
-              <w:t>t_cause.txt, p0_docker_tests.txt</w:t>
+              <w:t>ence/p0_root_cause.txt, p0_docker_tests.txt</w:t>
             </w:r>
           </w:p>
         </w:tc>
@@ -18655,14 +18716,14 @@
                 <w:rFonts w:ascii="Times New Roman" w:hAnsi="Times New Roman"/>
                 <w:sz w:val="15"/>
               </w:rPr>
-              <w:t xml:space="preserve">Discovered 4,616 exact duplicate rows (93.8% </w:t>
+              <w:t xml:space="preserve">Discovered 4,616 exact duplicate rows </w:t>
             </w:r>
             <w:r>
               <w:rPr>
                 <w:rFonts w:ascii="Times New Roman" w:hAnsi="Times New Roman"/>
                 <w:sz w:val="15"/>
               </w:rPr>
-              <w:t>duplication). Dropped duplicates to 304 unique ground-truth rows (~7.4 per class); instituted 5x3 Repeated Stratified K-Fold CV with in-fold symptom dropout to eliminate evaluation leakage.</w:t>
+              <w:t>(93.8% duplication). Dropped duplicates to 304 unique ground-truth rows (~7.4 per class); instituted 5x3 Repeated Stratified K-Fold CV with in-fold symptom dropout to eliminate evaluation leakage.</w:t>
             </w:r>
           </w:p>
         </w:tc>
@@ -18710,7 +18771,7 @@
                 <w:b/>
                 <w:sz w:val="16"/>
               </w:rPr>
-              <w:t>Hardcoded Crypto</w:t>
+              <w:t>Hardcoded</w:t>
             </w:r>
             <w:r>
               <w:rPr>
@@ -18718,7 +18779,7 @@
                 <w:b/>
                 <w:sz w:val="16"/>
               </w:rPr>
-              <w:t>graphic Fallback Keys in Source Code</w:t>
+              <w:t xml:space="preserve"> Cryptographic Fallback Keys in Source Code</w:t>
             </w:r>
           </w:p>
         </w:tc>
@@ -18758,14 +18819,14 @@
                 <w:rFonts w:ascii="Times New Roman" w:hAnsi="Times New Roman"/>
                 <w:sz w:val="15"/>
               </w:rPr>
-              <w:t xml:space="preserve">Removed all hardcoded fallback keys from source repository; updated gitleaks baseline </w:t>
+              <w:t>Removed all hardcoded fallback keys from source repository; updated gitleaks ba</w:t>
             </w:r>
             <w:r>
               <w:rPr>
                 <w:rFonts w:ascii="Times New Roman" w:hAnsi="Times New Roman"/>
                 <w:sz w:val="15"/>
               </w:rPr>
-              <w:t>with written rationales; implemented production startup guard `encryption_key_exit.test.js` verifying process exits with code 1 if ENCRYPTION_KEY is unset.</w:t>
+              <w:t>seline with written rationales; implemented production startup guard `encryption_key_exit.test.js` verifying process exits with code 1 if ENCRYPTION_KEY is unset.</w:t>
             </w:r>
           </w:p>
         </w:tc>
@@ -18813,7 +18874,7 @@
                 <w:b/>
                 <w:sz w:val="16"/>
               </w:rPr>
-              <w:t>Unevidenced Accuracy F</w:t>
+              <w:t>Unevidenced Acc</w:t>
             </w:r>
             <w:r>
               <w:rPr>
@@ -18821,7 +18882,7 @@
                 <w:b/>
                 <w:sz w:val="16"/>
               </w:rPr>
-              <w:t>igures in Initial Report Draft</w:t>
+              <w:t>uracy Figures in Initial Report Draft</w:t>
             </w:r>
           </w:p>
         </w:tc>
@@ -18863,14 +18924,14 @@
                 <w:rFonts w:ascii="Times New Roman" w:hAnsi="Times New Roman"/>
                 <w:sz w:val="15"/>
               </w:rPr>
-              <w:t xml:space="preserve">Removed unevidenced draft figures from report text; reconciled all performance claims with </w:t>
+              <w:t xml:space="preserve">Removed unevidenced draft figures from report text; reconciled all performance claims </w:t>
             </w:r>
             <w:r>
               <w:rPr>
                 <w:rFonts w:ascii="Times New Roman" w:hAnsi="Times New Roman"/>
                 <w:sz w:val="15"/>
               </w:rPr>
-              <w:t>traceable nested CV benchmarks in `model_benchmark.md` and `tuned_tree_benchmark.md`.</w:t>
+              <w:t>with traceable nested CV benchmarks in `model_benchmark.md` and `tuned_tree_benchmark.md`.</w:t>
             </w:r>
           </w:p>
         </w:tc>
@@ -18938,14 +18999,14 @@
                 <w:rFonts w:ascii="Times New Roman" w:hAnsi="Times New Roman"/>
                 <w:sz w:val="15"/>
               </w:rPr>
-              <w:t>Early load test issued requests aga</w:t>
+              <w:t>Early load test issued request</w:t>
             </w:r>
             <w:r>
               <w:rPr>
                 <w:rFonts w:ascii="Times New Roman" w:hAnsi="Times New Roman"/>
                 <w:sz w:val="15"/>
               </w:rPr>
-              <w:t>inst production rate limiters, recording 429s as normal behavior while list endpoint had high latency.</w:t>
+              <w:t>s against production rate limiters, recording 429s as normal behavior while list endpoint had high latency.</w:t>
             </w:r>
           </w:p>
         </w:tc>
@@ -18965,14 +19026,14 @@
                 <w:rFonts w:ascii="Times New Roman" w:hAnsi="Times New Roman"/>
                 <w:sz w:val="15"/>
               </w:rPr>
-              <w:t>Created dedicated `docker-compose.test.yml` with test-only limits (`ALLOW_LOAD_TEST=true`, `LLM_ENABLED=false`); pre-created pending consultations; optim</w:t>
+              <w:t xml:space="preserve">Created dedicated `docker-compose.test.yml` with test-only limits (`ALLOW_LOAD_TEST=true`, `LLM_ENABLED=false`); pre-created pending consultations; </w:t>
             </w:r>
             <w:r>
               <w:rPr>
                 <w:rFonts w:ascii="Times New Roman" w:hAnsi="Times New Roman"/>
                 <w:sz w:val="15"/>
               </w:rPr>
-              <w:t>ized worker list with server-side pagination and projection.</w:t>
+              <w:t>optimized worker list with server-side pagination and projection.</w:t>
             </w:r>
           </w:p>
         </w:tc>
@@ -19041,14 +19102,14 @@
                 <w:rFonts w:ascii="Times New Roman" w:hAnsi="Times New Roman"/>
                 <w:sz w:val="15"/>
               </w:rPr>
-              <w:t>Naive in-place regex replacement of confidence terms ('certain',</w:t>
+              <w:t xml:space="preserve">Naive in-place regex replacement of confidence terms </w:t>
             </w:r>
             <w:r>
               <w:rPr>
                 <w:rFonts w:ascii="Times New Roman" w:hAnsi="Times New Roman"/>
                 <w:sz w:val="15"/>
               </w:rPr>
-              <w:t xml:space="preserve"> 'high') mangled valid clinical words like 'certainly' or 'ascertain'.</w:t>
+              <w:t>('certain', 'high') mangled valid clinical words like 'certainly' or 'ascertain'.</w:t>
             </w:r>
           </w:p>
         </w:tc>
@@ -19069,14 +19130,14 @@
                 <w:rFonts w:ascii="Times New Roman" w:hAnsi="Times New Roman"/>
                 <w:sz w:val="15"/>
               </w:rPr>
-              <w:t>Replaced regex replacement with whole-phrase boundary matching; on detection of banned confidence terms, triggers one LLM regeneration; if still failing, falls back cleanly to determini</w:t>
+              <w:t>Replaced regex replacement with whole-phrase boundary matching; on detection of banned confidence terms, triggers one LLM regeneration; if still failing, falls back cleanly t</w:t>
             </w:r>
             <w:r>
               <w:rPr>
                 <w:rFonts w:ascii="Times New Roman" w:hAnsi="Times New Roman"/>
                 <w:sz w:val="15"/>
               </w:rPr>
-              <w:t>stic clinical template.</w:t>
+              <w:t>o deterministic clinical template.</w:t>
             </w:r>
           </w:p>
         </w:tc>
@@ -19144,14 +19205,14 @@
                 <w:rFonts w:ascii="Times New Roman" w:hAnsi="Times New Roman"/>
                 <w:sz w:val="15"/>
               </w:rPr>
-              <w:t>Gemini 1.5 Flash returned 404 model not found; free-tier API quota exhausted after 20 daily calls returni</w:t>
+              <w:t>Gemini 1.5 Flash returned 404 model not found; free-tier API quota exhausted after 20 daily ca</w:t>
             </w:r>
             <w:r>
               <w:rPr>
                 <w:rFonts w:ascii="Times New Roman" w:hAnsi="Times New Roman"/>
                 <w:sz w:val="15"/>
               </w:rPr>
-              <w:t>ng HTTP 429.</w:t>
+              <w:t>lls returning HTTP 429.</w:t>
             </w:r>
           </w:p>
         </w:tc>
@@ -19201,7 +19262,7 @@
                 <w:sz w:val="14"/>
               </w:rPr>
               <w:lastRenderedPageBreak/>
-              <w:t>docs/evidence/gemini_l</w:t>
+              <w:t>docs/eviden</w:t>
             </w:r>
             <w:r>
               <w:rPr>
@@ -19209,7 +19270,7 @@
                 <w:color w:val="546E7A"/>
                 <w:sz w:val="14"/>
               </w:rPr>
-              <w:t>ive_run.txt, scripts/test_llm_timeouts_and_429.py</w:t>
+              <w:t>ce/gemini_live_run.txt, scripts/test_llm_timeouts_and_429.py</w:t>
             </w:r>
           </w:p>
         </w:tc>
@@ -19279,14 +19340,14 @@
                 <w:rFonts w:ascii="Times New Roman" w:hAnsi="Times New Roman"/>
                 <w:sz w:val="15"/>
               </w:rPr>
-              <w:t xml:space="preserve">Implemented multi-stage Docker build for backend </w:t>
+              <w:t xml:space="preserve">Implemented multi-stage Docker build for </w:t>
             </w:r>
             <w:r>
               <w:rPr>
                 <w:rFonts w:ascii="Times New Roman" w:hAnsi="Times New Roman"/>
                 <w:sz w:val="15"/>
               </w:rPr>
-              <w:t>stripping npm CLI; uninstalled pip and ensurepip from runtime stages of Python images; upgraded critical packages; achieved zero fixable Critical/High with `--ignore-unfixed`.</w:t>
+              <w:t>backend stripping npm CLI; uninstalled pip and ensurepip from runtime stages of Python images; upgraded critical packages; achieved zero fixable Critical/High with `--ignore-unfixed`.</w:t>
             </w:r>
           </w:p>
         </w:tc>
@@ -19334,15 +19395,7 @@
                 <w:b/>
                 <w:sz w:val="16"/>
               </w:rPr>
-              <w:t xml:space="preserve">Worker </w:t>
-            </w:r>
-            <w:r>
-              <w:rPr>
-                <w:rFonts w:ascii="Times New Roman" w:hAnsi="Times New Roman"/>
-                <w:b/>
-                <w:sz w:val="16"/>
-              </w:rPr>
-              <w:t>List Endpoint Latency Degradation</w:t>
+              <w:t>Worker List Endpoint Latency Degradation</w:t>
             </w:r>
           </w:p>
         </w:tc>
@@ -19382,14 +19435,14 @@
                 <w:rFonts w:ascii="Times New Roman" w:hAnsi="Times New Roman"/>
                 <w:sz w:val="15"/>
               </w:rPr>
-              <w:t>Added server-side pagination (`page`, `limit`, default 20) and lean Mongoose projection; combined optimization reduced C</w:t>
+              <w:t>Added server-side pagination (`page`, `limit`, default 20) and lean Mongoose projection; combined optimization r</w:t>
             </w:r>
             <w:r>
               <w:rPr>
                 <w:rFonts w:ascii="Times New Roman" w:hAnsi="Times New Roman"/>
                 <w:sz w:val="15"/>
               </w:rPr>
-              <w:t>=1 p50 latency from 193.0 ms to 76.2 ms (60.5% faster) and p99 from 660.6 ms to 152.0 ms (77.0% faster). Cause not isolated.</w:t>
+              <w:t>educed C=1 p50 latency from 193.0 ms to 76.2 ms (60.5% faster) and p99 from 660.6 ms to 152.0 ms (77.0% faster). Cause not isolated.</w:t>
             </w:r>
           </w:p>
         </w:tc>
@@ -19437,7 +19490,7 @@
                 <w:b/>
                 <w:sz w:val="16"/>
               </w:rPr>
-              <w:t xml:space="preserve">Session Expiry &amp; Second-Opinion Escalation </w:t>
+              <w:t xml:space="preserve">Session Expiry &amp; Second-Opinion </w:t>
             </w:r>
             <w:r>
               <w:rPr>
@@ -19445,7 +19498,7 @@
                 <w:b/>
                 <w:sz w:val="16"/>
               </w:rPr>
-              <w:t>Lifecycle</w:t>
+              <w:t>Escalation Lifecycle</w:t>
             </w:r>
           </w:p>
         </w:tc>
@@ -19487,14 +19540,14 @@
                 <w:rFonts w:ascii="Times New Roman" w:hAnsi="Times New Roman"/>
                 <w:sz w:val="15"/>
               </w:rPr>
-              <w:t>Designed explicit 401 session expiry warning in UI client and structured consultation review state machi</w:t>
+              <w:t xml:space="preserve">Designed explicit 401 session expiry warning in UI client and structured consultation review </w:t>
             </w:r>
             <w:r>
               <w:rPr>
                 <w:rFonts w:ascii="Times New Roman" w:hAnsi="Times New Roman"/>
                 <w:sz w:val="15"/>
               </w:rPr>
-              <w:t>ne. Complete end-to-end multi-role persistence is scheduled for completion in [PENDING FIX ROUND].</w:t>
+              <w:t>state machine. Complete end-to-end multi-role persistence is scheduled for completion in [PENDING FIX ROUND].</w:t>
             </w:r>
           </w:p>
         </w:tc>
@@ -19552,14 +19605,14 @@
           <w:rFonts w:ascii="Times New Roman" w:hAnsi="Times New Roman"/>
           <w:color w:val="212121"/>
         </w:rPr>
-        <w:t xml:space="preserve">Listing B.1 provides the sequence of 10 command-line </w:t>
+        <w:t xml:space="preserve">Listing B.1 provides the sequence of 10 </w:t>
       </w:r>
       <w:r>
         <w:rPr>
           <w:rFonts w:ascii="Times New Roman" w:hAnsi="Times New Roman"/>
           <w:color w:val="212121"/>
         </w:rPr>
-        <w:t>instructions to launch the cluster, execute all 321 automated test suites, run golden test cases, run Playwright journeys, execute load testing, and run security scans.</w:t>
+        <w:t>command-line instructions to launch the cluster, execute all 322 automated test suites, run golden test cases, run Playwright journeys, execute load testing, and run security scans.</w:t>
       </w:r>
     </w:p>
     <w:tbl>
@@ -19605,7 +19658,7 @@
                 <w:sz w:val="16"/>
               </w:rPr>
               <w:br/>
-              <w:t xml:space="preserve">docker compose -f docker-compose.yml up </w:t>
+              <w:t>docker compose -f docker-co</w:t>
             </w:r>
             <w:r>
               <w:rPr>
@@ -19613,7 +19666,7 @@
                 <w:color w:val="EEFF41"/>
                 <w:sz w:val="16"/>
               </w:rPr>
-              <w:t>-d</w:t>
+              <w:t>mpose.yml up -d</w:t>
             </w:r>
             <w:r>
               <w:rPr>
@@ -19691,7 +19744,7 @@
                 <w:sz w:val="16"/>
               </w:rPr>
               <w:br/>
-              <w:t># 4. Execute ML Engine test suite (55 t</w:t>
+              <w:t># 4. Execute ML Engine tes</w:t>
             </w:r>
             <w:r>
               <w:rPr>
@@ -19699,7 +19752,7 @@
                 <w:color w:val="EEFF41"/>
                 <w:sz w:val="16"/>
               </w:rPr>
-              <w:t>ests)</w:t>
+              <w:t>t suite (55 tests)</w:t>
             </w:r>
             <w:r>
               <w:rPr>
@@ -19751,7 +19804,7 @@
                 <w:sz w:val="16"/>
               </w:rPr>
               <w:br/>
-              <w:t># 6. Execute Frontend UI test suite (9 tests)</w:t>
+              <w:t># 6. Execute Frontend UI test suite (10 tests)</w:t>
             </w:r>
             <w:r>
               <w:rPr>
@@ -19760,7 +19813,7 @@
                 <w:sz w:val="16"/>
               </w:rPr>
               <w:br/>
-              <w:t>docker compose exec -T ui pytest -v</w:t>
+              <w:t>docker compose exec -T frontend pytest -v</w:t>
             </w:r>
             <w:r>
               <w:rPr>
@@ -19777,7 +19830,7 @@
                 <w:sz w:val="16"/>
               </w:rPr>
               <w:br/>
-              <w:t># 7. Run Golden Clinical Test Set (20</w:t>
+              <w:t># 7. Run Golden C</w:t>
             </w:r>
             <w:r>
               <w:rPr>
@@ -19785,7 +19838,7 @@
                 <w:color w:val="EEFF41"/>
                 <w:sz w:val="16"/>
               </w:rPr>
-              <w:t xml:space="preserve"> cases)</w:t>
+              <w:t>linical Test Set (20 cases)</w:t>
             </w:r>
             <w:r>
               <w:rPr>
@@ -19846,7 +19899,7 @@
                 <w:sz w:val="16"/>
               </w:rPr>
               <w:br/>
-              <w:t>docker compose -f docker-compose.test.yml up -d</w:t>
+              <w:t>docker compose -f docker-compose.test</w:t>
             </w:r>
             <w:r>
               <w:rPr>
@@ -19854,8 +19907,7 @@
                 <w:color w:val="EEFF41"/>
                 <w:sz w:val="16"/>
               </w:rPr>
-              <w:br/>
-              <w:t>python sc</w:t>
+              <w:t>.yml up -d</w:t>
             </w:r>
             <w:r>
               <w:rPr>
@@ -19863,7 +19915,8 @@
                 <w:color w:val="EEFF41"/>
                 <w:sz w:val="16"/>
               </w:rPr>
-              <w:t>ripts/run_p5_load_test_testmode.py</w:t>
+              <w:br/>
+              <w:t>python scripts/run_p5_load_test_testmode.py</w:t>
             </w:r>
             <w:r>
               <w:rPr>
@@ -32656,7 +32709,7 @@
 </file>
 
 <file path=customXml/itemProps1.xml><?xml version="1.0" encoding="utf-8"?>
-<ds:datastoreItem xmlns:ds="http://schemas.openxmlformats.org/officeDocument/2006/customXml" ds:itemID="{82F3CA08-91E7-4521-A1A2-ACFC015300D5}">
+<ds:datastoreItem xmlns:ds="http://schemas.openxmlformats.org/officeDocument/2006/customXml" ds:itemID="{E67A4211-D0B1-4E34-B396-A8AEF387120B}">
   <ds:schemaRefs>
     <ds:schemaRef ds:uri="http://schemas.openxmlformats.org/officeDocument/2006/bibliography"/>
   </ds:schemaRefs>

</xml_diff>